<commit_message>
Polish Chinese report and add reproducible project structure
</commit_message>
<xml_diff>
--- a/分析报告_可编辑.docx
+++ b/分析报告_可编辑.docx
@@ -52,22 +52,22 @@
     </w:p>
     <w:p>
       <w:r>
-        <w:t>本研究分析100位作者的9,532条帖子，将正文转换为长度、自律/目标词、社交称呼/互助词、积极表达词和问号等变量，以 ln(1+点赞数) 为因变量建立回归；另将去重后的11,595条评论构造成互动网络。</w:t>
+        <w:t>本研究以Keep社区100位作者的9,532条帖子为样本，考察文本表达与点赞表现的关系。通过词典编码，将正文转换为长度、自律/目标词、社交称呼/互助词、积极表达词及问号等变量，并以ln(1+点赞数)为因变量建立作者与日期固定效应模型。在此基础上，利用去重后的11,595条评论构建有向加权互动网络，分析用户间的互动分布。</w:t>
       </w:r>
     </w:p>
     <w:p>
       <w:r>
-        <w:t>主模型控制作者、发帖日期、内容形式及其他特征后，五项核心文本特征的联合检验 p=0.130，新增解释度为0.065个百分点；没有充分证据认定某类词汇稳定伴随更多点赞。积极表达词的负系数在原始检验中显著，但BH校正 q=0.079，且PPML计数模型区间包含零，应视为探索性信号。</w:t>
+        <w:t>回归结果表明，在控制作者、发帖日期、内容形式等因素后，五项核心文本特征的联合检验未达到统计显著水平（p=0.130），对模型解释度的增量为0.065个百分点。积极表达词呈负向关联，但经BH多重检验校正后q=0.079，且PPML计数模型的置信区间包含零，说明这一关联的证据仍不充分。</w:t>
       </w:r>
     </w:p>
     <w:p>
       <w:r>
-        <w:t>观察到的评论互动集中于少数账号，前10位接收54.0%的事件。建议将词汇优化视为待检验方案，结合用户层面的对照实验评估互动质量。点赞不是运动效果，观察到的评论网络也不是整个平台的社交图谱。</w:t>
+        <w:t>评论网络呈现较高的互动接收集中度，前10位账号接收了54.0%的事件。这一结果受到样本选取与建边规则影响，适用于描述已采集的互动关系。总体而言，现有数据尚不足以支持通过特定词汇稳定提高点赞的策略；后续研究可结合曝光记录和用户层面的对照实验，进一步检验表达方式与互动质量的关系。</w:t>
       </w:r>
     </w:p>
     <w:p>
       <w:r>
-        <w:t>关键词：Keep；内容分析；固定效应；聚类标准误；评论网络。组号和成员信息尚待填写；文中分工均为建议。</w:t>
+        <w:t>关键词：健身社区；文本表达；点赞；固定效应模型；互动网络。</w:t>
       </w:r>
     </w:p>
     <w:p>
@@ -88,17 +88,17 @@
         <w:pStyle w:val="Heading1"/>
       </w:pPr>
       <w:r>
-        <w:t>从健身记录到社区反馈</w:t>
+        <w:t>健身社区中的内容表达与互动反馈</w:t>
       </w:r>
     </w:p>
     <w:p>
       <w:r>
-        <w:t>健身社区把运动记录、情绪表达和同伴交流放在同一场景中。点赞可以反映平台内一种可观察的反馈，但它还受到作者既有受众、媒体形式和曝光机会影响。因此，不能只比较某类帖子平均点赞就判断内容表达是否有效。</w:t>
+        <w:t>健身社区既是用户记录运动的空间，也是分享感受、交流经验和获得同伴反馈的场所。点赞作为一种可观察的互动行为，为研究内容表达与社区反馈的关系提供了切入点。不过，点赞还受到作者既有受众、媒体形式及曝光机会等因素影响。因此，有必要在控制相关因素后，考察文本特征与点赞数之间的关系。</w:t>
       </w:r>
     </w:p>
     <w:p>
       <w:r>
-        <w:t>Richardson 等（2010）的随机试验发现，增加在线社区功能与较低的项目流失相关，但未发现组间步数增幅存在显著差异。[1] 这提示我们区分社区参与和行为改变。本项目仅研究平台内反馈，不测量运动坚持、健康或体重变化。</w:t>
+        <w:t>Richardson等（2010）的随机试验发现，增加在线社区功能有助于降低项目流失，但组间步数增幅未呈现显著差异。[1] 这说明社区参与和运动行为变化需要分别衡量。据此，本研究将分析范围限定为平台内的互动反馈，研究结论不延伸至运动坚持、健康或体重变化。</w:t>
       </w:r>
     </w:p>
     <w:p>
@@ -254,7 +254,7 @@
         <w:pStyle w:val="Heading2"/>
       </w:pPr>
       <w:r>
-        <w:t>研究预期与解释边界</w:t>
+        <w:t>研究预期与分析定位</w:t>
       </w:r>
     </w:p>
     <w:p>
@@ -262,7 +262,7 @@
         <w:pStyle w:val="ListBullet"/>
       </w:pPr>
       <w:r>
-        <w:t>自律/目标词可能使运动记录更易理解；社交称呼和互助词可能邀请反馈。这些是待检验解释，不是已成立的因果机制。</w:t>
+        <w:t>自律与目标相关词汇可能使运动经历更易理解，社交称呼和互助表达可能为读者提供参与交流的线索。本研究将这些解释作为待检验的研究预期。</w:t>
       </w:r>
     </w:p>
     <w:p>
@@ -270,7 +270,7 @@
         <w:pStyle w:val="ListBullet"/>
       </w:pPr>
       <w:r>
-        <w:t>积极表达和问号的方向不预设；正文长度是表达规模的控制与比较维度。四类二元特征和长度共同构成五项核心检验。</w:t>
+        <w:t>积极表达与问号的关联方向不作预设；正文长度用于衡量表达规模。上述四类二元特征与长度共同构成五项核心检验。</w:t>
       </w:r>
     </w:p>
     <w:p>
@@ -278,12 +278,12 @@
         <w:pStyle w:val="ListBullet"/>
       </w:pPr>
       <w:r>
-        <w:t>报告完整呈现正、负及不显著结果。词典在本次拟合前固定，但没有事前注册；研究仍属探索性分析。</w:t>
+        <w:t>词典与模型设定在本次首次拟合前确定，并完整报告各项结果。由于未进行事前注册，研究定位为探索性分析。</w:t>
       </w:r>
     </w:p>
     <w:p>
       <w:r>
-        <w:t>课程对应：《内容分析与自然语言处理》第10、14、18页提供“描述—解释—决策”和文本预处理框架；本研究将其落实为可复查的编码与建模步骤。[3]</w:t>
+        <w:t>方法参考：《内容分析与自然语言处理》第10、14、18页关于内容分析与文本预处理的讨论。[3]</w:t>
       </w:r>
     </w:p>
     <w:p>
@@ -304,7 +304,7 @@
         <w:pStyle w:val="Heading1"/>
       </w:pPr>
       <w:r>
-        <w:t>先确定样本与字段含义</w:t>
+        <w:t>数据来源、样本范围与清洗</w:t>
       </w:r>
     </w:p>
     <w:tbl>
@@ -452,7 +452,7 @@
         <w:pStyle w:val="Heading2"/>
       </w:pPr>
       <w:r>
-        <w:t>实际清洗流程</w:t>
+        <w:t>数据核查与处理</w:t>
       </w:r>
     </w:p>
     <w:tbl>
@@ -526,7 +526,7 @@
           </w:tcPr>
           <w:p>
             <w:r>
-              <w:t>所有去重评论均能关联到帖子；1323帖有采集到的评论，其余8209帖的评论覆盖未知，不赋值为0。</w:t>
+              <w:t>去重后的评论均能关联到帖子。1,323帖有采集到的评论；其余8,209帖的评论覆盖情况未知，保留为缺失。</w:t>
             </w:r>
           </w:p>
         </w:tc>
@@ -570,7 +570,7 @@
           </w:tcPr>
           <w:p>
             <w:r>
-              <w:t>3984帖content为空；保留帖子，文本计数置0，并另设has_text控制“无可用正文”状态。</w:t>
+              <w:t>3,984帖的content为空。保留这些帖子，将文本计数设为0，并以has_text标记是否有可用正文。</w:t>
             </w:r>
           </w:p>
         </w:tc>
@@ -592,7 +592,7 @@
           </w:tcPr>
           <w:p>
             <w:r>
-              <w:t>8286帖likes大于viewCount（86.9%）。无法确认两个计数字段可比分母关系，因此不计算点赞率或将浏览数设为offset。</w:t>
+              <w:t>8,286帖的likes大于viewCount（86.9%），两个字段的统计口径与对应关系不明。因此不计算点赞率，也不以浏览数作为计数模型的曝光量偏置项（offset）。</w:t>
             </w:r>
           </w:p>
         </w:tc>
@@ -614,7 +614,7 @@
           </w:tcPr>
           <w:p>
             <w:r>
-              <w:t>保留全部真实观测进入主模型。仅在稳健性规格中剔除点赞最高1%，不把极端值预先认定为错误。</w:t>
+              <w:t>主模型保留全部观测；在稳健性检验中单独剔除点赞最高1%的帖子，检验极端值对结果的影响。</w:t>
             </w:r>
           </w:p>
         </w:tc>
@@ -622,14 +622,14 @@
     </w:tbl>
     <w:p>
       <w:r>
-        <w:t>文件名不能当作观测年份</w:t>
+        <w:t>观测时间与文件命名</w:t>
         <w:br/>
-        <w:t>帖子UTC发布时间为2020-11-01至2020-12-31；评论最晚到北京时间2021-08-26。2022和2026均不是本项目观测年份。采集时点未提供，点赞的累计观察时长未知。</w:t>
+        <w:t>帖子实际发表于2020-11-01至2020-12-31（UTC），评论最晚延续至北京时间2021-08-26。分析以实际时间字段为准。由于数据未提供统一采集时点，各帖点赞的累计观察时长无法确定。</w:t>
       </w:r>
     </w:p>
     <w:p>
       <w:r>
-        <w:t>可复核证据：results/summary.json保存原文件SHA-256；results/post_features.csv保存匿名作者和建模特征。评论缺失覆盖与重复处理分别核查，不将删重视作“删异常用户”。</w:t>
+        <w:t>数据来源与原文件SHA-256保存在results/summary.json；匿名作者编号及建模特征保存在results/post_features.csv。</w:t>
       </w:r>
     </w:p>
     <w:p>
@@ -973,12 +973,12 @@
     </w:tbl>
     <w:p>
       <w:r>
-        <w:t>平均点赞为37.05，中位数为25，最大值为5126，零点赞占3.8%。点赞方差约为均值的164.8倍。主模型用ln(1+点赞数)缓和长尾影响；同时用聚类稳健推断和计数模型检查结论。</w:t>
+        <w:t>样本帖子的平均点赞数为37.05，中位数为25，最大值为5,126，零点赞帖子占3.8%。点赞方差约为均值的164.8倍，反映出明显的离散性和长尾分布。主模型采用ln(1+点赞数)缓和极端值的影响，并通过聚类稳健推断与计数模型检验结果。</w:t>
       </w:r>
     </w:p>
     <w:p>
       <w:r>
-        <w:t>作者发帖数很不均衡：中位作者发布66帖，发帖最多者发布783帖。单纯把帖子看成独立随机样本会低估同一作者帖子的相关性，因此标准误按作者聚类；另用作者等权规格检查高产作者的影响。</w:t>
+        <w:t>作者之间的发帖量差异较大：发帖数中位数为66，最多者发布783帖。考虑到同一作者的帖子可能具有相关的未观测特征，回归标准误按作者聚类；同时采用作者等权的设定，检查发帖较多的作者对估计结果的影响。</w:t>
       </w:r>
     </w:p>
     <w:p>
@@ -1004,7 +1004,7 @@
         <w:pStyle w:val="Heading1"/>
       </w:pPr>
       <w:r>
-        <w:t>内容形式之间存在明显的原始差异</w:t>
+        <w:t>不同内容形式的点赞表现存在差异</w:t>
       </w:r>
     </w:p>
     <w:p>
@@ -1327,12 +1327,12 @@
     </w:tbl>
     <w:p>
       <w:r>
-        <w:t>图片和视频帖的原始点赞明显高于无媒体及纯文字帖，但这同时混合了作者构成、帖子业务类型和内容差异。不能据此断言“发布图片会提高点赞”，也不把此差异当作文本词汇的作用。</w:t>
+        <w:t>图片和视频帖的原始点赞数明显高于无媒体及纯文字帖。由于不同形式还可能对应不同作者、业务类型和内容，这一差异只能作为描述性结果。后续回归将内容形式纳入控制，以减少其对文本特征比较的干扰。</w:t>
       </w:r>
     </w:p>
     <w:p>
       <w:r>
-        <w:t>帖子业务类型包括normal、hiking、run、yoga、cycling、direct与share；这些原始类别进入回归。发帖时段分为00—05、06—11、12—17、18—23点。日期固定效应控制同一天样本共有的变化，无法解决每帖真实累计曝光时长不明的问题。</w:t>
+        <w:t>回归保留normal、hiking、run、yoga、cycling、direct与share等原始业务类别，并将发帖时段划分为00—05、06—11、12—17、18—23点。日期固定效应用于控制同一天样本共有的变化；各帖累计观察时长不明的问题仍需在解释结果时予以考虑。</w:t>
       </w:r>
     </w:p>
     <w:p>
@@ -1358,7 +1358,7 @@
         <w:pStyle w:val="Heading1"/>
       </w:pPr>
       <w:r>
-        <w:t>把可见正文转换为可重复的变量</w:t>
+        <w:t>正文预处理与变量构建</w:t>
       </w:r>
     </w:p>
     <w:p>
@@ -1700,19 +1700,19 @@
     </w:tbl>
     <w:p>
       <w:r>
-        <w:t>正文中的话题元数据不拼接进词典匹配，以免将平台话题名当成用户表达。成对“Ⓚ…Ⓚ”视为可观察的课程分享后缀；非成对标记不强行删除。方括号表情不参加核心词匹配，另计数量。</w:t>
+        <w:t>话题标签作为独立元数据编码，不拼接到正文中参与词典匹配。成对的“Ⓚ…Ⓚ”按课程分享后缀处理，未成对的标记予以保留。方括号表情单独计数，不参与核心词汇匹配。上述处理使正文表达与平台附加标记在变量构建中保持区分。</w:t>
       </w:r>
     </w:p>
     <w:p>
       <w:r>
-        <w:t>词汇代理的含义</w:t>
+        <w:t>变量的解释范围</w:t>
         <w:br/>
-        <w:t>命中=检测到字面表达；未命中=规则未检测到，不等于没有该主题或没有情绪。has_text=0也不意味着用户没有表达意图，可能是图片表达或字段未采集。</w:t>
+        <w:t>词典命中表示规则检测到了相应的字面表达，未命中则表示未被该规则识别。无可用正文的帖子仍可能通过图片等方式表达，因此has_text=0仅描述正文数据的可用状态。</w:t>
       </w:r>
     </w:p>
     <w:p>
       <w:r>
-        <w:t>课程依据：[3]第14、18、24—28页；全部规则见code/analyze.py与text_dictionary.json。文本分析与回归通过同一postId关联，未使用点赞反向定义词典。</w:t>
+        <w:t>方法参考：[3]第14、18、24—28页。具体规则见code/analyze.py与text_dictionary.json；文本特征通过postId与帖子数据关联。</w:t>
       </w:r>
     </w:p>
     <w:p>
@@ -1733,7 +1733,7 @@
         <w:pStyle w:val="Heading1"/>
       </w:pPr>
       <w:r>
-        <w:t>先固定规则，再检查其语义边界</w:t>
+        <w:t>词典编码规则及其解释范围</w:t>
       </w:r>
     </w:p>
     <w:tbl>
@@ -1862,7 +1862,7 @@
         <w:pStyle w:val="Heading2"/>
       </w:pPr>
       <w:r>
-        <w:t>怎样从一句话产生一行数据</w:t>
+        <w:t>文本结构化示例</w:t>
       </w:r>
     </w:p>
     <w:tbl>
@@ -1988,17 +1988,17 @@
     </w:tbl>
     <w:p>
       <w:r>
-        <w:t>词典采用子串匹配，每个维度命中任一项记1，不累计同一词反复出现次数；维度之间允许重叠。自律词中的“加油”属于激励表达，积极词维度则聚焦愉悦或赞许词。它们不是互斥的主题标签，也不是正负情感评分。</w:t>
+        <w:t>词典采用子串匹配：每个维度命中任一项记为1，同一词重复出现不累加，维度之间允许重叠。“加油”归入自律/目标词，以表示激励性表达；积极表达词主要覆盖愉悦或赞许用语。这些变量用于识别特定字面特征，不构成互斥主题分类或完整的情感评分。</w:t>
       </w:r>
     </w:p>
     <w:p>
       <w:r>
-        <w:t>另使用jieba精准分词、停用词过滤和逐帖去重，计算词的文档频数。高频词用于描述“大家在说什么”，不据此生成新的显著性检验。停用词沿用课程数据内BaiduStopwords.txt并增加少量口语停用词；便携副本保存在code/stopwords.txt。</w:t>
+        <w:t>此外，采用jieba精准分词，经停用词过滤和帖内词项去重后计算文档频数，以描述语料的主要表达内容。停用词使用课程数据中的BaiduStopwords.txt，并补充少量口语词；本地复现副本位于code/stopwords.txt。高频词统计仅用于描述，不作为额外的假设检验。</w:t>
       </w:r>
     </w:p>
     <w:p>
       <w:r>
-        <w:t>未拟合LDA：此任务要求至少一种文本或网络分析，本项目采用可解释内容分析并额外完成网络分析。词云不是回归变量，也不作为结论依据。</w:t>
+        <w:t>本研究采用词典内容分析，使编码规则与回归变量之间保持明确对应。其语义测量局限在第13节进一步讨论。</w:t>
       </w:r>
     </w:p>
     <w:p>
@@ -2019,7 +2019,7 @@
         <w:pStyle w:val="Heading1"/>
       </w:pPr>
       <w:r>
-        <w:t>“打卡”和日常表达占据主要位置</w:t>
+        <w:t>文本特征的分布与作者覆盖</w:t>
       </w:r>
     </w:p>
     <w:p>
@@ -2342,12 +2342,12 @@
     </w:tbl>
     <w:p>
       <w:r>
-        <w:t>自律/目标词在全部帖子中占9.2%，在有可见正文的5548帖中占15.8%；不能混用两个分母。社交称呼/互助词和问号较少，分别仅有42和32位作者提供作者内部的0/1变化，其系数不确定性相对较大。</w:t>
+        <w:t>自律/目标词在全部帖子中的命中率为9.2%；以5,548条可见正文为分母时，命中率为15.8%。社交称呼/互助词和问号出现较少，分别只有42和32位作者在其帖子之间呈现0/1取值变化，能够为作者内比较提供的信息相对有限。</w:t>
       </w:r>
     </w:p>
     <w:p>
       <w:r>
-        <w:t>高频“打卡”“运动”“加油”等与健身记录语境相符，但不意味着平台上的全部内容以此为主。当前样本只覆盖100位作者，且41.8%的帖子没有可用正文；图片文字和视频语音未识别。</w:t>
+        <w:t>“打卡”“运动”“加油”等高频词与健身记录的语境一致。不过，该描述仅覆盖100位作者的可用文本：41.8%的帖子缺少正文，图片中的文字和视频语音也未进入分析，因而无法据此概括平台整体内容。</w:t>
       </w:r>
     </w:p>
     <w:p>
@@ -2373,7 +2373,7 @@
         <w:pStyle w:val="Heading1"/>
       </w:pPr>
       <w:r>
-        <w:t>原始均值差异不能直接解释为内容作用</w:t>
+        <w:t>从组间差异到作者内比较</w:t>
       </w:r>
     </w:p>
     <w:tbl>
@@ -2550,7 +2550,7 @@
     </w:tbl>
     <w:p>
       <w:r>
-        <w:t>所有二元特征的命中帖在原始均值上都更受欢迎。例如社交称呼/互助词命中帖的平均点赞约90，未命中帖约36。这个比较同时包含作者受众规模差异、媒体形式差异及极端高赞帖，尚不能回答“同一作者采用这种表达是否更受欢迎”。</w:t>
+        <w:t>四类二元特征的命中帖子均具有更高的原始平均点赞数。例如，社交称呼/互助词命中帖的平均点赞约为90，未命中帖约为36。由于这一比较混合了作者受众规模、媒体形式及极端高赞帖等差异，后续通过逐步加入控制项，将分析重点转向同一作者不同帖子之间的条件关联。</w:t>
       </w:r>
     </w:p>
     <w:p>
@@ -2558,7 +2558,7 @@
         <w:pStyle w:val="Heading2"/>
       </w:pPr>
       <w:r>
-        <w:t>逐步控制什么</w:t>
+        <w:t>逐步建模的比较思路</w:t>
       </w:r>
     </w:p>
     <w:tbl>
@@ -2703,14 +2703,14 @@
     </w:tbl>
     <w:p>
       <w:r>
-        <w:t>100位作者的gender、keepValue、kgLevel和memberStatus在样本内均不变化；作者固定效应已吸收这些属性，所以M2/M3不再重复加入。没有粉丝数、推荐曝光、视觉内容质量、社交关系或统一采集时间，不能将固定效应解释为消除了全部混杂。</w:t>
+        <w:t>100位作者的gender、keepValue、kgLevel和memberStatus在样本内均保持不变，已由作者固定效应吸收，因此M2和M3不再重复纳入。作者固定效应有助于控制稳定的作者差异，但粉丝变化、推荐曝光、视觉内容质量及累计观察时长等因素仍无法充分控制。</w:t>
       </w:r>
     </w:p>
     <w:p>
       <w:r>
-        <w:t>为什么不用“评论数”作为另一种全样本结果变量</w:t>
+        <w:t>结果变量的选择</w:t>
         <w:br/>
-        <w:t>仅1323帖存在采集到的评论记录，无法知道其余帖子是真的零评论还是未采集。网络使用已有记录；回归不以这些记录推算完整评论效果。</w:t>
+        <w:t>只有1,323帖存在采集到的评论记录，其余帖子的评论覆盖情况未知。因此，帖子层面的回归以点赞数为结果变量；评论数据用于描述已观测的互动网络。</w:t>
       </w:r>
     </w:p>
     <w:p>
@@ -2731,7 +2731,7 @@
         <w:pStyle w:val="Heading1"/>
       </w:pPr>
       <w:r>
-        <w:t>主模型比较同一作者的不同帖子</w:t>
+        <w:t>固定效应模型与统计推断</w:t>
       </w:r>
     </w:p>
     <w:p>
@@ -2801,7 +2801,7 @@
     </w:p>
     <w:p>
       <w:r>
-        <w:t>i表示作者，t表示帖子；α是作者固定效应，δ是北京时间发帖日期固定效应。Z包括可见正文、话题标记、表情标记、课程分享标记、内容形式、业务类型和时段。日期按实际本地时间跨到2021-01-01，不人为截断。</w:t>
+        <w:t>i表示作者，t表示帖子；α为作者固定效应，δ为北京时间发帖日期固定效应。Z包含正文可用状态、话题标记、表情标记、课程分享标记、内容形式、业务类型和发帖时段。日期依据实际本地时间划分，范围延伸至2021-01-01。</w:t>
       </w:r>
     </w:p>
     <w:tbl>
@@ -2931,7 +2931,7 @@
           </w:tcPr>
           <w:p>
             <w:r>
-              <w:t>效应解释</w:t>
+              <w:t>系数解释</w:t>
             </w:r>
           </w:p>
         </w:tc>
@@ -2941,7 +2941,7 @@
           </w:tcPr>
           <w:p>
             <w:r>
-              <w:t>二元变量的exp(β)−1表示“1+点赞数”条件几何均值的相对差异；不是算术平均点赞的变化，更不是因果提升。</w:t>
+              <w:t>二元变量的exp(β)−1对应“1+点赞数”条件几何均值的相对差异，反映给定控制项后的统计关联。</w:t>
             </w:r>
           </w:p>
         </w:tc>
@@ -2949,16 +2949,16 @@
     </w:tbl>
     <w:p>
       <w:r>
-        <w:t>长度使用自然对数：若1+正文长度翻倍，模型预期的1+点赞数几何均值乘以2</w:t>
+        <w:t>正文长度采用自然对数形式。当1+正文长度翻倍时，模型对应的1+点赞数几何均值乘以2</w:t>
         <w:br/>
         <w:t>β1</w:t>
         <w:br/>
-        <w:t>。不把长度系数解释成“每多一个字增加多少点赞”。</w:t>
+        <w:t>。这一解释针对对数模型的尺度，不能换算为每增加一个字所带来的固定点赞变化。</w:t>
       </w:r>
     </w:p>
     <w:p>
       <w:r>
-        <w:t>这些规格在本次首次拟合前写入代码；没有事前注册。聚类稳健标准误允许同一作者误差相关及异方差，但不自动解决遗漏变量、抽样选择和反向因果。</w:t>
+        <w:t>模型设定在本次首次拟合前确定，未进行事前注册。聚类稳健推断考虑作者内误差相关和异方差；遗漏变量、抽样选择及因果识别仍属于研究局限。</w:t>
       </w:r>
     </w:p>
     <w:p>
@@ -2979,7 +2979,7 @@
         <w:pStyle w:val="Heading1"/>
       </w:pPr>
       <w:r>
-        <w:t>没有充分证据表明核心词汇伴随更多点赞</w:t>
+        <w:t>核心文本特征的关联证据有限</w:t>
       </w:r>
     </w:p>
     <w:tbl>
@@ -3371,12 +3371,12 @@
     </w:tbl>
     <w:p>
       <w:r>
-        <w:t>因变量：ln(1+点赞数)。M3控制作者、日期、内容形式、业务类型、时段及其余文本标记；N=9532，作者聚类数=100。原始p值未使用星号，以免掩盖多重检验结果。</w:t>
+        <w:t>因变量为ln(1+点赞数)。M3控制作者、日期、内容形式、业务类型、时段及辅助文本标记；N=9,532，作者聚类数为100。表中同时报告原始p值与BH校正后的q值。</w:t>
       </w:r>
     </w:p>
     <w:p>
       <w:r>
-        <w:t>自律/目标词、社交称呼/互助词和问号的区间均包含零；这些结果不能支持“只需增加相关词就能获得更多点赞”。积极表达词系数为-0.086，原始p=0.016，但五项检验校正后q=0.079，未达到0.05。</w:t>
+        <w:t>自律/目标词、社交称呼/互助词和问号的系数均未达到统计显著水平，其95%置信区间包含零。积极表达词的系数为-0.086，原始p=0.016；经五项核心检验的BH校正后，q=0.079，在5%显著性水平下不再显著。</w:t>
       </w:r>
     </w:p>
     <w:tbl>
@@ -3562,14 +3562,14 @@
     </w:tbl>
     <w:p>
       <w:r>
-        <w:t>主模型R²=0.688，但五项核心文本特征相对“相同控制、去掉五项特征”的模型仅增加0.065个百分点解释度。五项系数联合检验F(5,99)=1.752，p=0.130。整体R²的大部分不能归因于这些词汇。</w:t>
+        <w:t>主模型R²为0.688。相对于保留相同控制项、但不含五项核心文本特征的模型，R²仅增加0.065个百分点，表明这些特征提供的额外解释较少。五项系数的联合检验结果为F(5,99)=1.752，p=0.130，与单项检验反映的有限证据相一致。</w:t>
       </w:r>
     </w:p>
     <w:p>
       <w:r>
-        <w:t>不显著结果的正确读法</w:t>
+        <w:t>结果解释</w:t>
         <w:br/>
-        <w:t>现有样本与测量下，没有足够证据拒绝零关联；这不等于证明所有表达方式都没有作用。低频特征、粗糙词典和缺失视觉信息都可能降低辨识能力。</w:t>
+        <w:t>在现有样本与变量定义下，回归结果尚不足以支持核心文本特征与点赞数存在明确关联。低频特征、词典测量误差及未观测的视觉内容均可能影响估计精度，因此不显著结果也不能证明所有表达方式均无影响。</w:t>
       </w:r>
     </w:p>
     <w:p>
@@ -3590,7 +3590,7 @@
         <w:pStyle w:val="Heading1"/>
       </w:pPr>
       <w:r>
-        <w:t>负系数也需要检验其稳定性</w:t>
+        <w:t>回归系数的量级与解释</w:t>
       </w:r>
     </w:p>
     <w:p>
@@ -3639,12 +3639,12 @@
     </w:p>
     <w:p>
       <w:r>
-        <w:t>积极表达词的点估计对应“1+点赞数”的条件几何均值低约8.2%，其原始95%区间为[-14.3%, -1.6%]。这一变换仅说明模型尺度，不能据此建议减少积极表达。</w:t>
+        <w:t>将积极表达词的系数转换到相对差异尺度，其点估计对应“1+点赞数”的条件几何均值低约8.2%，原始95%置信区间为[-14.3%, -1.6%]。这一量级应结合多重检验结果及后续模型比较共同理解，而不宜直接转化为调整表达方式的建议。</w:t>
       </w:r>
     </w:p>
     <w:p>
       <w:r>
-        <w:t>原始均值为正、控制后的系数为负，说明发出这些表达的作者及帖子的其他特征与点赞有关。控制模型可改变比较对象，但并不证明积极表达造成点赞下降；词语可能出现在不同内容场景，仍有不可观测混杂。</w:t>
+        <w:t>积极表达词命中帖的原始平均点赞更高，但回归系数为负，说明未调整的组间比较与控制后的作者内比较并不一致。作者构成和帖子情境可能参与形成这种差异；当前设计无法进一步区分具体机制，也无法将负系数解释为积极表达导致点赞下降。</w:t>
       </w:r>
     </w:p>
     <w:p>
@@ -3652,17 +3652,17 @@
         <w:pStyle w:val="Heading2"/>
       </w:pPr>
       <w:r>
-        <w:t>长度的量级</w:t>
+        <w:t>正文长度的关联量级</w:t>
       </w:r>
     </w:p>
     <w:p>
       <w:r>
-        <w:t>1+正文长度翻倍时，主模型的1+点赞数几何均值点估计约变化2.0%；长度系数区间包含零。这不支持“文案越长越好”，也不能据此确定最佳字数。</w:t>
+        <w:t>当1+正文长度翻倍时，主模型中1+点赞数的条件几何均值点估计约增加2.0%。由于长度系数的置信区间包含零，现有结果不足以确定正文长度的明确关联，更无法推导出最优字数。</w:t>
       </w:r>
     </w:p>
     <w:p>
       <w:r>
-        <w:t>全部系数、控制标记系数及变换区间保存在regression_coefficients.csv；词汇之间可能相关，见within_author_feature_correlations.csv。</w:t>
+        <w:t>完整系数及变换后的区间见regression_coefficients.csv；作者内特征相关性见within_author_feature_correlations.csv。</w:t>
       </w:r>
     </w:p>
     <w:p>
@@ -3683,7 +3683,7 @@
         <w:pStyle w:val="Heading1"/>
       </w:pPr>
       <w:r>
-        <w:t>换用计数模型后，积极表达的区间包含零</w:t>
+        <w:t>积极表达的负关联对模型设定敏感</w:t>
       </w:r>
     </w:p>
     <w:p>
@@ -4058,17 +4058,17 @@
     </w:tbl>
     <w:p>
       <w:r>
-        <w:t>仅正文规格保留5548帖/95位作者；去除最高1%时，保留likes≤227.38的9436帖。作者等权使每位作者总权重相同，减少高产作者主导。PPML以原始点赞计数为因变量，采用相同控制项与聚类稳健推断，已收敛。</w:t>
+        <w:t>为检验结果对样本与估计方式的敏感性，分别采用四种补充设定：仅保留可见正文的5,548帖、95位作者；剔除点赞最高1%的帖子，保留likes≤227.38的9,436帖；使每位作者的总权重相同；以原始点赞数估计PPML计数模型。PPML保留相同控制项并采用聚类稳健推断，模型已收敛。</w:t>
       </w:r>
     </w:p>
     <w:p>
       <w:r>
-        <w:t>OLS中积极表达词的负关联在若干规格下仍存在，但PPML区间包含零，而且主模型BH校正后不显著。因此不能将它描述为稳定、确定的负面效果。其他词汇的证据同样不足，稳健性检验也不能消除选择偏差。</w:t>
+        <w:t>积极表达词的负系数在若干OLS设定下仍然存在，但在PPML中未达到统计显著水平，置信区间包含零。结合主模型的BH校正结果，这一负关联仍应视为有待验证的探索性发现。其余词汇的结果也未提供明确的正向关联证据。</w:t>
       </w:r>
     </w:p>
     <w:p>
       <w:r>
-        <w:t>稳健性规格仅用于方向和敏感性检查，表内p值为各规格原始p值，不构成新的“挑显著”检验家族。完整五项结果见regression_coefficients.csv。</w:t>
+        <w:t>表内p值均为各设定的原始p值，稳健性比较用于评估结果的敏感性。完整五项结果见regression_coefficients.csv。</w:t>
       </w:r>
     </w:p>
     <w:p>
@@ -4089,12 +4089,12 @@
         <w:pStyle w:val="Heading1"/>
       </w:pPr>
       <w:r>
-        <w:t>字面规则与真实语义之间仍有距离</w:t>
+        <w:t>词典编码的语义局限与抽查</w:t>
       </w:r>
     </w:p>
     <w:p>
       <w:r>
-        <w:t>对四类二元特征分别抽取5条命中及5条未命中的可见正文，共40个“帖子—特征”检查单元，可能含重复帖子。抽查样本未展示点赞数；由Codex辅助进行语义核查，未采用独立人工双编码，规则命中状态可见。它用于展示测量边界，不能据此宣称整体准确率或编码一致性。</w:t>
+        <w:t>为检查字面匹配与语义解释的一致程度，对四类二元特征分别抽取5条命中和5条未命中的可见正文，共形成40个“帖子—特征”检查单元，其中可能包含重复帖子。抽查由Codex辅助完成，未展示点赞数，但规则命中状态可见。由于未采用独立人工双编码，该检查仅用于识别典型误差，不据此估计总体准确率或编码一致性。</w:t>
       </w:r>
     </w:p>
     <w:tbl>
@@ -4274,44 +4274,22 @@
         <w:pStyle w:val="Heading2"/>
       </w:pPr>
       <w:r>
-        <w:t>保留哪些结论，放弃哪些推断</w:t>
-      </w:r>
-    </w:p>
-    <w:p>
-      <w:pPr>
-        <w:pStyle w:val="ListBullet"/>
-      </w:pPr>
-      <w:r>
-        <w:t>保留“含哪些字面词汇”及其统计关联，因为定义与代码可以复现。</w:t>
-      </w:r>
-    </w:p>
-    <w:p>
-      <w:pPr>
-        <w:pStyle w:val="ListBullet"/>
-      </w:pPr>
-      <w:r>
-        <w:t>不把词命中称为心理状态、真实社会支持、情绪强度或用户自律程度；不生成未经验证的情感总分。</w:t>
-      </w:r>
-    </w:p>
-    <w:p>
-      <w:pPr>
-        <w:pStyle w:val="ListBullet"/>
-      </w:pPr>
-      <w:r>
-        <w:t>不因结果不显著而回头修改词典；抽查发现用于限定结论，并为后续人工标注设计提供依据。</w:t>
-      </w:r>
-    </w:p>
-    <w:p>
-      <w:pPr>
-        <w:pStyle w:val="ListBullet"/>
-      </w:pPr>
-      <w:r>
-        <w:t>后续可从全部可见正文随机抽样，隐藏模型预测与互动指标，由两人按预先定义的语义标准独立编码，再报告一致性与分类误差。</w:t>
+        <w:t>对测量与后续研究的启示</w:t>
       </w:r>
     </w:p>
     <w:p>
       <w:r>
-        <w:t>完整40条记录及具体判断：results/text_coding_review.csv；固定抽样种子与过程：code/analyze.py、code/annotate_review.py。该抽查不是对独立测试集的效度验证。</w:t>
+        <w:t>抽查显示，同一词语在不同语境中未必具有相同含义，字面匹配的可复现性也不等于语义测量的有效性。因此，本研究将词典变量解释为字面表达的代理，不据此推断用户自律程度、情绪强度或实际获得的社会支持。抽查发现用于限定结果的解释范围，未据此重新调整词典。</w:t>
+      </w:r>
+    </w:p>
+    <w:p>
+      <w:r>
+        <w:t>后续可从全部可见正文中随机抽样，在隐藏模型预测与互动指标的条件下，由两位编码者依据预先确定的语义标准独立标注，并评估编码一致性与分类误差。这样可以进一步判断回归中的有限证据在多大程度上与文本测量有关。</w:t>
+      </w:r>
+    </w:p>
+    <w:p>
+      <w:r>
+        <w:t>40条检查记录见results/text_coding_review.csv；抽样与记录过程见code/analyze.py和code/annotate_review.py。</w:t>
       </w:r>
     </w:p>
     <w:p>
@@ -4332,7 +4310,7 @@
         <w:pStyle w:val="Heading1"/>
       </w:pPr>
       <w:r>
-        <w:t>一条边表示一次可观察的评论指向</w:t>
+        <w:t>评论关系的识别与建图规则</w:t>
       </w:r>
     </w:p>
     <w:p>
@@ -4346,7 +4324,7 @@
     </w:p>
     <w:p>
       <w:r>
-        <w:t>先按cmtId去重，再用postId查找帖子作者。回复优先使用显式replyUserId；缺失时仅可用已观测的直接回复评论ID确定对象。不得把所有子评论都指向帖主。自我互动不进入网络，删除的84个事件单独记录。</w:t>
+        <w:t>评论按cmtId去重后，通过postId关联帖子作者。根评论的接收对象为帖主；回复评论优先依据显式replyUserId确定对象，缺失时再利用已观测的直接回复评论ID识别。84次自我互动单独记录并从网络中排除，同一发送者与接收者之间的多次事件合并为一条加权有向边。</w:t>
       </w:r>
     </w:p>
     <w:tbl>
@@ -4538,19 +4516,19 @@
     </w:tbl>
     <w:p>
       <w:r>
-        <w:t>网络只保留至少参与一条非自环边的节点；100位样本作者中有77位出现在该网络。其余不自动视作平台孤立用户。节点编号为稳定匿名标识，图和导出边表不显示原始用户ID。</w:t>
+        <w:t>网络包含至少参与一条非自环边的用户，100位样本作者中有77位出现在该网络中。其余作者未出现在本次采集的有效互动关系中，并不意味着其在平台上没有社交联系。图表及导出边表均使用稳定的匿名用户编号。</w:t>
       </w:r>
     </w:p>
     <w:p>
       <w:r>
-        <w:t>网络指标不是发帖前的控制变量</w:t>
+        <w:t>网络分析与回归的关系</w:t>
         <w:br/>
-        <w:t>评论在发帖后产生，最晚延续到2021年8月。因此PageRank、入度或评论接收量只用于补充描述，不能作为“发帖前影响力”回归控制，也不能反推传播因果。</w:t>
+        <w:t>评论在发帖后形成，最晚延续至2021年8月。为避免将结果发生后的信息作为发帖前特征，PageRank、入度及互动接收量仅用于描述网络结构，不纳入帖子点赞回归。</w:t>
       </w:r>
     </w:p>
     <w:p>
       <w:r>
-        <w:t>课程依据：《社交网络分析简介》第32—37页及《Social Network Influencial》第30、35页。[4][5] 网络是评论关系而非关注、好友或实际信息扩散路径。</w:t>
+        <w:t>方法参考：《社交网络分析简介》第32—37页及《Social Network Influencial》第30、35页。[4][5] 本网络表示已观测的评论指向关系。</w:t>
       </w:r>
     </w:p>
     <w:p>
@@ -4571,7 +4549,7 @@
         <w:pStyle w:val="Heading1"/>
       </w:pPr>
       <w:r>
-        <w:t>少数账号连接了大部分已采集互动</w:t>
+        <w:t>评论互动网络的连通性与互惠性</w:t>
       </w:r>
     </w:p>
     <w:p>
@@ -4824,12 +4802,12 @@
     </w:tbl>
     <w:p>
       <w:r>
-        <w:t>最大弱连通分量占比高，说明这些采集互动存在跨作者的连接；它不证明单次内容能够触达全部节点。整体互惠率49.6%，仅明确回复网络为29.9%，显示根评论建边规则会影响结构指标。两个网络的节点集合不同，差异不宜解释为同一群体的行为变化。</w:t>
+        <w:t>最大弱连通分量包含94.4%的有边节点，表明采集到的互动在忽略方向后形成了较大的连通结构。整体互惠率为49.6%；仅保留明确回复时，互惠率为29.9%。这一差异反映出建边范围对网络指标的影响。由于两个网络的节点集合不同，该比较不对应同一群体在两个时期的行为变化。</w:t>
       </w:r>
     </w:p>
     <w:p>
       <w:r>
-        <w:t>布局使用固定种子的弹簧算法，节点的图面距离不是社交距离的统计估计。未计算网络总体的抽样置信区间，结果仅描述这一观测网络。</w:t>
+        <w:t>网络图采用固定随机种子的弹簧布局，图面距离仅用于展示连接结构。各指标描述本次观测网络，未估计平台总体网络的抽样置信区间。</w:t>
       </w:r>
     </w:p>
     <w:p>
@@ -4899,12 +4877,12 @@
     </w:p>
     <w:p>
       <w:r>
-        <w:t>前10位账号共接收54.0%的互动事件，第一位接收12.0%。61.3%的事件指向样本帖子作者。这里的“接收量”是评论和回复事件数，不是独立用户数、点赞数或平台粉丝数。</w:t>
+        <w:t>按接收事件数排序，前10位账号接收了全部非自我互动的54.0%，排名第一的账号接收12.0%。共有61.3%的事件指向样本帖子作者。接收量按评论和回复次数累计，同一用户的重复互动分别计数，因此不同于独立互动用户数。</w:t>
       </w:r>
     </w:p>
     <w:p>
       <w:r>
-        <w:t>样本从100位作者的帖子出发采集评论，天然偏向这些作者及其活跃互动对象。根评论均指向帖主，结构上就会产生中心节点。集中度可用于说明样本内互动分配，但不能用来挑选Keep全平台“最有影响力用户”。</w:t>
+        <w:t>这一集中度需要结合样本边界理解。评论从100位作者的帖子出发采集，根评论又直接指向帖主，因此这些作者及其活跃互动对象更容易成为网络中心。由此得到的接收量排名适用于描述样本内互动分配，不宜外推为Keep全平台的影响力排名。</w:t>
       </w:r>
     </w:p>
     <w:p>
@@ -4912,17 +4890,17 @@
         <w:pStyle w:val="Heading2"/>
       </w:pPr>
       <w:r>
-        <w:t>与文本结果共同说明什么</w:t>
+        <w:t>点赞与评论反映不同的互动侧面</w:t>
       </w:r>
     </w:p>
     <w:p>
       <w:r>
-        <w:t>文本中的少量词汇不能稳定解释点赞差异，而已采集的评论在用户之间分配不均。这支持后续同时观察内容、受众及关系背景；它没有证明关系比内容更重要，也没有量化两者因果贡献。</w:t>
+        <w:t>回归分析未发现核心文本特征与点赞数存在充分、稳定的关联证据；网络分析则显示，已采集评论的接收分布较为集中。两部分分别描述帖子层面的反馈和用户间的互动结构。后续研究若进一步收集受众与关系数据，可以检验内容表达在不同关系背景下是否呈现不同关联。</w:t>
       </w:r>
     </w:p>
     <w:p>
       <w:r>
-        <w:t>入度表示不同发送者数量；加权入度表示接收事件数；PageRank为补充节点指标。三者在network_nodes.csv中分开保存，报告不将它们互换。</w:t>
+        <w:t>入度为不同发送者数量，加权入度为接收事件数，PageRank为补充节点指标；完整结果见network_nodes.csv。</w:t>
       </w:r>
     </w:p>
     <w:p>
@@ -4943,7 +4921,7 @@
         <w:pStyle w:val="Heading1"/>
       </w:pPr>
       <w:r>
-        <w:t>优先验证表达与互动机制，避免词汇处方</w:t>
+        <w:t>研究结论、实践启示与后续设计</w:t>
       </w:r>
     </w:p>
     <w:tbl>
@@ -4996,7 +4974,7 @@
           </w:tcPr>
           <w:p>
             <w:r>
-              <w:t>五项核心词汇联合检验p=0.130；词典代理粗糙</w:t>
+              <w:t>五项核心文本特征的联合检验p=0.130，词典测量仍有局限</w:t>
             </w:r>
           </w:p>
         </w:tc>
@@ -5006,7 +4984,7 @@
           </w:tcPr>
           <w:p>
             <w:r>
-              <w:t>不要将固定词汇加入运营模板并承诺提升点赞。提供可选的真实运动经历、感受与问题填写提示。</w:t>
+              <w:t>将内容提示设计为可供选择的表达辅助，鼓励用户描述运动经历、感受或具体问题；其互动效果需另行检验。</w:t>
             </w:r>
           </w:p>
         </w:tc>
@@ -5016,7 +4994,7 @@
           </w:tcPr>
           <w:p>
             <w:r>
-              <w:t>内容质量、图片/视频和曝光机会是否改变结果。</w:t>
+              <w:t>内容质量、图片/视频及曝光机会是否改变结果。</w:t>
             </w:r>
           </w:p>
         </w:tc>
@@ -5091,12 +5069,12 @@
         <w:pStyle w:val="Heading2"/>
       </w:pPr>
       <w:r>
-        <w:t>后续研究设计（尚未执行）</w:t>
+        <w:t>后续研究设计</w:t>
       </w:r>
     </w:p>
     <w:p>
       <w:r>
-        <w:t>若有平台实验权限，可将愿意参与的作者按用户随机分配至“运动过程记录提示”“面向伙伴的问题提示”和常规发布组，防止同一作者跨组污染。固定7天观察窗，记录真实曝光及独立互动用户数；把用户是否继续发布和高质量回复作为额外结果。样本量需用试点方差和最小有意义差异另行计算，本项目不虚设实验效果或样本数。</w:t>
+        <w:t>后续可在获得平台实验权限后，以作者为单位随机分组，比较“运动过程记录提示”“面向伙伴的问题提示”与常规发布三种情形。以用户为分组单位有助于减少同一作者跨组带来的干扰。建议设置统一的7天观察窗口，记录实际曝光、独立互动用户数、后续发布行为及回复质量，并根据试点方差和最小有意义差异估算所需样本量。该方案尚未实施。</w:t>
       </w:r>
     </w:p>
     <w:p>
@@ -5141,9 +5119,9 @@
     </w:p>
     <w:p>
       <w:r>
-        <w:t>回答研究题目</w:t>
+        <w:t>研究结论</w:t>
         <w:br/>
-        <w:t>当前数据没有支持一种可复制的“高赞用词公式”。更可靠的产出是清楚的测量、可复查的条件关联，以及下一步能验证的研究设计。</w:t>
+        <w:t>本研究将帖子文本转换为可复现的结构化特征，并结合固定效应回归与评论网络分析，考察健身社区中的表达与互动。现有证据尚不足以支持特定词汇能够稳定伴随更多点赞；理解互动差异，仍需更完整的内容、曝光及关系数据。</w:t>
       </w:r>
     </w:p>
     <w:p>
@@ -5164,7 +5142,7 @@
         <w:pStyle w:val="Heading1"/>
       </w:pPr>
       <w:r>
-        <w:t>结论可以追溯到数据、代码和原始材料</w:t>
+        <w:t>参考文献与复现说明</w:t>
       </w:r>
     </w:p>
     <w:p>
@@ -5177,7 +5155,7 @@
         <w:br/>
         <w:t>doi:10.2196/jmir.1338</w:t>
         <w:br/>
-        <w:t>。用于研究动机，不把该试验效果套用到Keep。</w:t>
+        <w:t>。</w:t>
         <w:br/>
         <w:t>[2] statsmodels 官方文档：RegressionResults.get_robustcov_results，cluster参数、小样本修正与t分布推断。</w:t>
         <w:br/>
@@ -5185,7 +5163,7 @@
         <w:br/>
         <w:t>。访问：2026-10-16；实际使用statsmodels 0.14.2，数值复核采用独立矩阵算法。</w:t>
         <w:br/>
-        <w:t>[3] 课程材料《内容分析与自然语言处理.pdf》：第10页内容分析的三层问题，第14页预处理，第18页停用词，第24—28页中文分词。作者与年份未在文件中确认，故不补造。</w:t>
+        <w:t>[3] 课程材料《内容分析与自然语言处理.pdf》：第10页内容分析的三层问题，第14页预处理，第18页停用词，第24—28页中文分词。作者及年份信息不详。</w:t>
         <w:br/>
         <w:t>[4] 课程材料《社交网络分析简介.pdf》：第32—37页网络度分布、点度与中介中心性。</w:t>
         <w:br/>
@@ -5199,34 +5177,22 @@
         <w:pStyle w:val="Heading2"/>
       </w:pPr>
       <w:r>
-        <w:t>复现顺序</w:t>
+        <w:t>复现与数值核查</w:t>
       </w:r>
     </w:p>
     <w:p>
       <w:r>
-        <w:t>python -m pip install -r requirements.txt</w:t>
-        <w:br/>
-        <w:t>python code/analyze.py</w:t>
-        <w:br/>
-        <w:t>python code/annotate_review.py</w:t>
-        <w:br/>
-        <w:t>python code/validate.py</w:t>
-        <w:br/>
-        <w:t>python code/build_deliverables.py</w:t>
-        <w:br/>
-        <w:t>python code/render_outputs.py</w:t>
-        <w:br/>
-        <w:t>python code/package_submission.py</w:t>
+        <w:t>项目保存原始输入的校验值、文本编码规则、统计结果和已执行Notebook。独立数值核查采用矩阵算法，重新计算主模型五项系数、聚类标准误、p值及置信区间，并核对评论去重、网络边权和互惠率。报告正文、表格与图形均基于同一results目录生成。</w:t>
       </w:r>
     </w:p>
     <w:p>
       <w:r>
-        <w:t>分析过程.ipynb为已执行的伴随Notebook，保存表格和图像输出。数值核查用另一套矩阵计算独立复算主模型五项系数、聚类标准误、p值和区间，并核对去重、网络边权及互惠率。图表、回归表和正文均读取同一results目录。</w:t>
+        <w:t>公开仓库提供项目目录与数据放置说明。读者可先查看汇总结果；完成原始数据配置后，按README中的命令运行完整分析。正式PDF由分析报告.html导出，可编辑DOCX由相同的文字与表格生成。</w:t>
       </w:r>
     </w:p>
     <w:p>
       <w:r>
-        <w:t>所有产出均位于projects/group内。PDF由同一份分析报告.html打印生成；演示文稿复用同一批审阅过的PNG图与数值。没有发布到外部站点。</w:t>
+        <w:t>项目地址：https://github.com/Charlie-ChenLin/keep-community-analysis。公开文件范围和输入要求见README.md与DATA.md。</w:t>
       </w:r>
     </w:p>
     <w:p>
@@ -5239,7 +5205,7 @@
         <w:pStyle w:val="Subtitle"/>
       </w:pPr>
       <w:r>
-        <w:t>19 · 课程汇报与交付</w:t>
+        <w:t>19 · 附录</w:t>
       </w:r>
     </w:p>
     <w:p>
@@ -5247,7 +5213,7 @@
         <w:pStyle w:val="Heading1"/>
       </w:pPr>
       <w:r>
-        <w:t>填写身份信息后即可整理提交</w:t>
+        <w:t>课程要求与小组分工</w:t>
       </w:r>
     </w:p>
     <w:tbl>
@@ -5442,7 +5408,7 @@
         <w:pStyle w:val="Heading2"/>
       </w:pPr>
       <w:r>
-        <w:t>可调整的汇报分工</w:t>
+        <w:t>汇报分工建议</w:t>
       </w:r>
     </w:p>
     <w:tbl>
@@ -5624,14 +5590,12 @@
     </w:p>
     <w:p>
       <w:r>
-        <w:t>课程PDF注明：以“第几组-社交媒体分析报告.zip”为文件名，课程截止后两周（11月10日23:59）提交，11月15日前各自提交互评。原文件未明确年份，本项目只转述原要求，不推断当前学期是否沿用该日期，请以课程平台通知为准。</w:t>
+        <w:t>课程作业要求提交报告PDF、演示PPT及必要附件，压缩包命名为“第几组-社交媒体分析报告.zip”。原文件注明11月10日23:59提交、11月15日前完成个人互评，但未标明年份，具体时间以课程平台通知为准。</w:t>
       </w:r>
     </w:p>
     <w:p>
       <w:r>
-        <w:t>提交前需要真实补齐</w:t>
-        <w:br/>
-        <w:t>填写组号、成员及学号；按实际人数和贡献修订分工；检查每位成员均有汇报部分；依组号重命名ZIP。互评模板不是已完成的个人互评，不能代替真实贡献记录。</w:t>
+        <w:t>本附录保留组号、成员和学号占位。分工表为待调整建议，须依据实际人数与贡献填写；每位成员应参与汇报，并独立完成个人互评。</w:t>
       </w:r>
     </w:p>
     <w:sectPr>

</xml_diff>

<commit_message>
Expand analysis with topics, held-out prediction and comment experiments
</commit_message>
<xml_diff>
--- a/分析报告_可编辑.docx
+++ b/分析报告_可编辑.docx
@@ -39,7 +39,7 @@
         <w:br/>
         <w:t>帖子发布时间：2020-11—2020-12（UTC）</w:t>
         <w:br/>
-        <w:t>分析完成日期：2026-10-16</w:t>
+        <w:t>分析更新日期：2026-10-17</w:t>
       </w:r>
     </w:p>
     <w:p>
@@ -52,17 +52,17 @@
     </w:p>
     <w:p>
       <w:r>
-        <w:t>本研究以Keep社区100位作者的9,532条帖子为样本，考察文本表达与点赞表现的关系。通过词典编码，将正文转换为长度、自律/目标词、社交称呼/互助词、积极表达词及问号等变量，并以ln(1+点赞数)为因变量建立作者与日期固定效应模型。在此基础上，利用去重后的11,595条评论构建有向加权互动网络，分析用户间的互动分布。</w:t>
+        <w:t>本研究以Keep社区100位作者的9,532条帖子及去重后的11,595条评论为样本，考察文本表达与互动反馈的关系。研究首先将正文转换为词典特征并估计作者与日期固定效应模型，继而通过NMF主题分析、逐作者剔除和两类样本外预测实验检验结果，最后结合评论时序与回复角色分析互动网络。</w:t>
       </w:r>
     </w:p>
     <w:p>
       <w:r>
-        <w:t>回归结果表明，在控制作者、发帖日期、内容形式等因素后，五项核心文本特征的联合检验未达到统计显著水平（p=0.130），对模型解释度的增量为0.065个百分点。积极表达词呈负向关联，但经BH多重检验校正后q=0.079，且PPML计数模型的置信区间包含零，说明这一关联的证据仍不充分。</w:t>
+        <w:t>五项核心文本特征的联合检验不显著（p=0.130），新增解释度为0.065个百分点。积极表达词呈负向关联，但BH校正后q=0.079，PPML区间也包含零。主题回归未提供更明确的关联证据；加入词典或字符文本后，两种留出评估的误差变化区间均包含零，未显示稳定的预测增益。</w:t>
       </w:r>
     </w:p>
     <w:p>
       <w:r>
-        <w:t>评论网络呈现较高的互动接收集中度，前10位账号接收了54.0%的事件。这一结果受到样本选取与建边规则影响，适用于描述已采集的互动关系。总体而言，现有数据尚不足以支持通过特定词汇稳定提高点赞的策略；后续研究可结合曝光记录和用户层面的对照实验，进一步检验表达方式与互动质量的关系。</w:t>
+        <w:t>已采集的明确回复中，89.0%由帖主发给其他用户，表明交流主要围绕帖主展开。网络前10位账号接收54.0%的互动，但该比例和互惠率随评论窗口变化。总体而言，现有数据尚不足以支持固定的高赞表达策略；更完整的曝光、内容及关系记录有助于进一步检验这一问题。</w:t>
       </w:r>
     </w:p>
     <w:p>
@@ -248,6 +248,38 @@
           </w:p>
         </w:tc>
       </w:tr>
+      <w:tr>
+        <w:tc>
+          <w:tcPr>
+            <w:tcW w:type="dxa" w:w="3324"/>
+          </w:tcPr>
+          <w:p>
+            <w:r>
+              <w:t>RQ4</w:t>
+            </w:r>
+          </w:p>
+        </w:tc>
+        <w:tc>
+          <w:tcPr>
+            <w:tcW w:type="dxa" w:w="3324"/>
+          </w:tcPr>
+          <w:p>
+            <w:r>
+              <w:t>文本特征能否改善样本外点赞预测？</w:t>
+            </w:r>
+          </w:p>
+        </w:tc>
+        <w:tc>
+          <w:tcPr>
+            <w:tcW w:type="dxa" w:w="3324"/>
+          </w:tcPr>
+          <w:p>
+            <w:r>
+              <w:t>时间留出、作者分组五折、配对误差区间</w:t>
+            </w:r>
+          </w:p>
+        </w:tc>
+      </w:tr>
     </w:tbl>
     <w:p>
       <w:pPr>
@@ -288,6 +320,11 @@
     </w:p>
     <w:p>
       <w:r>
+        <w:t>主题建模、预测对照、作者剔除及评论时序为2026-10-17追加的探索性分析，保留原五项核心检验作为主分析。主题数、预测划分及正则化强度在本轮首次拟合前固定；主题名称和基准依据文本内容与频数确定。</w:t>
+      </w:r>
+    </w:p>
+    <w:p>
+      <w:r>
         <w:br w:type="page"/>
       </w:r>
     </w:p>
@@ -642,7 +679,310 @@
         <w:pStyle w:val="Subtitle"/>
       </w:pPr>
       <w:r>
-        <w:t>03 · 描述统计</w:t>
+        <w:t>03 · 数据覆盖</w:t>
+      </w:r>
+    </w:p>
+    <w:p>
+      <w:pPr>
+        <w:pStyle w:val="Heading1"/>
+      </w:pPr>
+      <w:r>
+        <w:t>正文缺失与内容形式、作者均有关联</w:t>
+      </w:r>
+    </w:p>
+    <w:p>
+      <w:r>
+        <w:drawing>
+          <wp:inline xmlns:a="http://schemas.openxmlformats.org/drawingml/2006/main" xmlns:pic="http://schemas.openxmlformats.org/drawingml/2006/picture">
+            <wp:extent cx="5940000" cy="1940850"/>
+            <wp:docPr id="1" name="Picture 1"/>
+            <wp:cNvGraphicFramePr>
+              <a:graphicFrameLocks noChangeAspect="1"/>
+            </wp:cNvGraphicFramePr>
+            <a:graphic>
+              <a:graphicData uri="http://schemas.openxmlformats.org/drawingml/2006/picture">
+                <pic:pic>
+                  <pic:nvPicPr>
+                    <pic:cNvPr id="0" name="08_text_coverage.png"/>
+                    <pic:cNvPicPr/>
+                  </pic:nvPicPr>
+                  <pic:blipFill>
+                    <a:blip r:embed="rId9"/>
+                    <a:stretch>
+                      <a:fillRect/>
+                    </a:stretch>
+                  </pic:blipFill>
+                  <pic:spPr>
+                    <a:xfrm>
+                      <a:off x="0" y="0"/>
+                      <a:ext cx="5940000" cy="1940850"/>
+                    </a:xfrm>
+                    <a:prstGeom prst="rect"/>
+                  </pic:spPr>
+                </pic:pic>
+              </a:graphicData>
+            </a:graphic>
+          </wp:inline>
+        </w:drawing>
+      </w:r>
+    </w:p>
+    <w:p>
+      <w:pPr>
+        <w:pStyle w:val="Caption"/>
+      </w:pPr>
+      <w:r>
+        <w:t>图1　不同内容形式的正文覆盖率，以及100位作者的发帖数与正文覆盖率。覆盖率按原始content是否存在可见字符计算。</w:t>
+      </w:r>
+    </w:p>
+    <w:tbl>
+      <w:tblPr>
+        <w:tblStyle w:val="LightShading-Accent1"/>
+        <w:tblW w:type="auto" w:w="0"/>
+        <w:tblLook w:firstColumn="1" w:firstRow="1" w:lastColumn="0" w:lastRow="0" w:noHBand="0" w:noVBand="1" w:val="04A0"/>
+      </w:tblPr>
+      <w:tblGrid>
+        <w:gridCol w:w="2493"/>
+        <w:gridCol w:w="2493"/>
+        <w:gridCol w:w="2493"/>
+        <w:gridCol w:w="2493"/>
+      </w:tblGrid>
+      <w:tr>
+        <w:tc>
+          <w:tcPr>
+            <w:tcW w:type="dxa" w:w="2493"/>
+          </w:tcPr>
+          <w:p>
+            <w:r>
+              <w:t>内容形式</w:t>
+            </w:r>
+          </w:p>
+        </w:tc>
+        <w:tc>
+          <w:tcPr>
+            <w:tcW w:type="dxa" w:w="2493"/>
+          </w:tcPr>
+          <w:p>
+            <w:r>
+              <w:t>帖子数</w:t>
+            </w:r>
+          </w:p>
+        </w:tc>
+        <w:tc>
+          <w:tcPr>
+            <w:tcW w:type="dxa" w:w="2493"/>
+          </w:tcPr>
+          <w:p>
+            <w:r>
+              <w:t>有可用正文</w:t>
+            </w:r>
+          </w:p>
+        </w:tc>
+        <w:tc>
+          <w:tcPr>
+            <w:tcW w:type="dxa" w:w="2493"/>
+          </w:tcPr>
+          <w:p>
+            <w:r>
+              <w:t>正文覆盖率</w:t>
+            </w:r>
+          </w:p>
+        </w:tc>
+      </w:tr>
+      <w:tr>
+        <w:tc>
+          <w:tcPr>
+            <w:tcW w:type="dxa" w:w="2493"/>
+          </w:tcPr>
+          <w:p>
+            <w:r>
+              <w:t>图片</w:t>
+            </w:r>
+          </w:p>
+        </w:tc>
+        <w:tc>
+          <w:tcPr>
+            <w:tcW w:type="dxa" w:w="2493"/>
+          </w:tcPr>
+          <w:p>
+            <w:r>
+              <w:t>5,790</w:t>
+            </w:r>
+          </w:p>
+        </w:tc>
+        <w:tc>
+          <w:tcPr>
+            <w:tcW w:type="dxa" w:w="2493"/>
+          </w:tcPr>
+          <w:p>
+            <w:r>
+              <w:t>4,399</w:t>
+            </w:r>
+          </w:p>
+        </w:tc>
+        <w:tc>
+          <w:tcPr>
+            <w:tcW w:type="dxa" w:w="2493"/>
+          </w:tcPr>
+          <w:p>
+            <w:r>
+              <w:t>76.0%</w:t>
+            </w:r>
+          </w:p>
+        </w:tc>
+      </w:tr>
+      <w:tr>
+        <w:tc>
+          <w:tcPr>
+            <w:tcW w:type="dxa" w:w="2493"/>
+          </w:tcPr>
+          <w:p>
+            <w:r>
+              <w:t>无媒体</w:t>
+            </w:r>
+          </w:p>
+        </w:tc>
+        <w:tc>
+          <w:tcPr>
+            <w:tcW w:type="dxa" w:w="2493"/>
+          </w:tcPr>
+          <w:p>
+            <w:r>
+              <w:t>2,493</w:t>
+            </w:r>
+          </w:p>
+        </w:tc>
+        <w:tc>
+          <w:tcPr>
+            <w:tcW w:type="dxa" w:w="2493"/>
+          </w:tcPr>
+          <w:p>
+            <w:r>
+              <w:t>3</w:t>
+            </w:r>
+          </w:p>
+        </w:tc>
+        <w:tc>
+          <w:tcPr>
+            <w:tcW w:type="dxa" w:w="2493"/>
+          </w:tcPr>
+          <w:p>
+            <w:r>
+              <w:t>0.1%</w:t>
+            </w:r>
+          </w:p>
+        </w:tc>
+      </w:tr>
+      <w:tr>
+        <w:tc>
+          <w:tcPr>
+            <w:tcW w:type="dxa" w:w="2493"/>
+          </w:tcPr>
+          <w:p>
+            <w:r>
+              <w:t>纯文字</w:t>
+            </w:r>
+          </w:p>
+        </w:tc>
+        <w:tc>
+          <w:tcPr>
+            <w:tcW w:type="dxa" w:w="2493"/>
+          </w:tcPr>
+          <w:p>
+            <w:r>
+              <w:t>301</w:t>
+            </w:r>
+          </w:p>
+        </w:tc>
+        <w:tc>
+          <w:tcPr>
+            <w:tcW w:type="dxa" w:w="2493"/>
+          </w:tcPr>
+          <w:p>
+            <w:r>
+              <w:t>301</w:t>
+            </w:r>
+          </w:p>
+        </w:tc>
+        <w:tc>
+          <w:tcPr>
+            <w:tcW w:type="dxa" w:w="2493"/>
+          </w:tcPr>
+          <w:p>
+            <w:r>
+              <w:t>100.0%</w:t>
+            </w:r>
+          </w:p>
+        </w:tc>
+      </w:tr>
+      <w:tr>
+        <w:tc>
+          <w:tcPr>
+            <w:tcW w:type="dxa" w:w="2493"/>
+          </w:tcPr>
+          <w:p>
+            <w:r>
+              <w:t>视频</w:t>
+            </w:r>
+          </w:p>
+        </w:tc>
+        <w:tc>
+          <w:tcPr>
+            <w:tcW w:type="dxa" w:w="2493"/>
+          </w:tcPr>
+          <w:p>
+            <w:r>
+              <w:t>948</w:t>
+            </w:r>
+          </w:p>
+        </w:tc>
+        <w:tc>
+          <w:tcPr>
+            <w:tcW w:type="dxa" w:w="2493"/>
+          </w:tcPr>
+          <w:p>
+            <w:r>
+              <w:t>845</w:t>
+            </w:r>
+          </w:p>
+        </w:tc>
+        <w:tc>
+          <w:tcPr>
+            <w:tcW w:type="dxa" w:w="2493"/>
+          </w:tcPr>
+          <w:p>
+            <w:r>
+              <w:t>89.1%</w:t>
+            </w:r>
+          </w:p>
+        </w:tc>
+      </w:tr>
+    </w:tbl>
+    <w:p>
+      <w:r>
+        <w:t>正文缺失并未均匀分布在不同形式的帖子中：“无媒体”帖的正文覆盖率仅为0.1%，图片帖为76.0%，视频帖为89.1%，纯文字帖则为100%。这些差异可能与记录生成方式或采集逻辑有关，现有字段不足以确认具体原因。</w:t>
+      </w:r>
+    </w:p>
+    <w:p>
+      <w:r>
+        <w:t>作者之间也存在明显差异：5位作者的帖子均无可用正文，26位作者的帖子均有正文，作者正文覆盖率的中位数为84.3%。因此，正文缺失不能简单视为独立、随机发生的现象。原模型保留缺失指示变量和内容形式控制，并以“仅可见正文”设定进行比较；相关结果仍仅适用于当前可观测的数据。</w:t>
+      </w:r>
+    </w:p>
+    <w:p>
+      <w:r>
+        <w:t>“有可用正文”包含仅有表情或平台标记的记录。清理后有非空正文的帖子为5,414条；后续主题模型进一步限制有效词数。</w:t>
+      </w:r>
+    </w:p>
+    <w:p>
+      <w:r>
+        <w:br w:type="page"/>
+      </w:r>
+    </w:p>
+    <w:p>
+      <w:pPr>
+        <w:pStyle w:val="Subtitle"/>
+      </w:pPr>
+      <w:r>
+        <w:t>04 · 描述统计</w:t>
       </w:r>
     </w:p>
     <w:p>
@@ -658,7 +998,7 @@
         <w:drawing>
           <wp:inline xmlns:a="http://schemas.openxmlformats.org/drawingml/2006/main" xmlns:pic="http://schemas.openxmlformats.org/drawingml/2006/picture">
             <wp:extent cx="5940000" cy="1934022"/>
-            <wp:docPr id="1" name="Picture 1"/>
+            <wp:docPr id="2" name="Picture 2"/>
             <wp:cNvGraphicFramePr>
               <a:graphicFrameLocks noChangeAspect="1"/>
             </wp:cNvGraphicFramePr>
@@ -670,7 +1010,7 @@
                     <pic:cNvPicPr/>
                   </pic:nvPicPr>
                   <pic:blipFill>
-                    <a:blip r:embed="rId9"/>
+                    <a:blip r:embed="rId10"/>
                     <a:stretch>
                       <a:fillRect/>
                     </a:stretch>
@@ -694,7 +1034,7 @@
         <w:pStyle w:val="Caption"/>
       </w:pPr>
       <w:r>
-        <w:t>图1　全部9,532帖的点赞分布与北京时间逐日发帖数。首末本地日期为不完整日，末端下降不能解释为活跃度骤降。</w:t>
+        <w:t>图2　全部9,532帖的点赞分布与北京时间逐日发帖数。首末本地日期为不完整日，末端下降不能解释为活跃度骤降。</w:t>
       </w:r>
     </w:p>
     <w:tbl>
@@ -996,7 +1336,7 @@
         <w:pStyle w:val="Subtitle"/>
       </w:pPr>
       <w:r>
-        <w:t>04 · 描述统计</w:t>
+        <w:t>05 · 描述统计</w:t>
       </w:r>
     </w:p>
     <w:p>
@@ -1012,7 +1352,7 @@
         <w:drawing>
           <wp:inline xmlns:a="http://schemas.openxmlformats.org/drawingml/2006/main" xmlns:pic="http://schemas.openxmlformats.org/drawingml/2006/picture">
             <wp:extent cx="5940000" cy="1928767"/>
-            <wp:docPr id="2" name="Picture 2"/>
+            <wp:docPr id="3" name="Picture 3"/>
             <wp:cNvGraphicFramePr>
               <a:graphicFrameLocks noChangeAspect="1"/>
             </wp:cNvGraphicFramePr>
@@ -1024,7 +1364,7 @@
                     <pic:cNvPicPr/>
                   </pic:nvPicPr>
                   <pic:blipFill>
-                    <a:blip r:embed="rId10"/>
+                    <a:blip r:embed="rId11"/>
                     <a:stretch>
                       <a:fillRect/>
                     </a:stretch>
@@ -1048,7 +1388,7 @@
         <w:pStyle w:val="Caption"/>
       </w:pPr>
       <w:r>
-        <w:t>图2　内容形式及其点赞均值、中位数。类别是原始contentTypeStr，不等同于是否有正文。</w:t>
+        <w:t>图3　内容形式及其点赞均值、中位数。类别是原始contentTypeStr，不等同于是否有正文。</w:t>
       </w:r>
     </w:p>
     <w:tbl>
@@ -1350,7 +1690,7 @@
         <w:pStyle w:val="Subtitle"/>
       </w:pPr>
       <w:r>
-        <w:t>05 · 文本结构化</w:t>
+        <w:t>06 · 文本结构化</w:t>
       </w:r>
     </w:p>
     <w:p>
@@ -1725,7 +2065,7 @@
         <w:pStyle w:val="Subtitle"/>
       </w:pPr>
       <w:r>
-        <w:t>06 · 编码规则与可解释性</w:t>
+        <w:t>07 · 编码规则与可解释性</w:t>
       </w:r>
     </w:p>
     <w:p>
@@ -1998,7 +2338,7 @@
     </w:p>
     <w:p>
       <w:r>
-        <w:t>本研究采用词典内容分析，使编码规则与回归变量之间保持明确对应。其语义测量局限在第13节进一步讨论。</w:t>
+        <w:t>本研究采用词典内容分析，使编码规则与回归变量之间保持明确对应。其语义测量局限在文本测量核查部分进一步讨论。</w:t>
       </w:r>
     </w:p>
     <w:p>
@@ -2011,7 +2351,7 @@
         <w:pStyle w:val="Subtitle"/>
       </w:pPr>
       <w:r>
-        <w:t>07 · 文本描述结果</w:t>
+        <w:t>08 · 文本描述结果</w:t>
       </w:r>
     </w:p>
     <w:p>
@@ -2027,7 +2367,7 @@
         <w:drawing>
           <wp:inline xmlns:a="http://schemas.openxmlformats.org/drawingml/2006/main" xmlns:pic="http://schemas.openxmlformats.org/drawingml/2006/picture">
             <wp:extent cx="5940000" cy="2045446"/>
-            <wp:docPr id="3" name="Picture 3"/>
+            <wp:docPr id="4" name="Picture 4"/>
             <wp:cNvGraphicFramePr>
               <a:graphicFrameLocks noChangeAspect="1"/>
             </wp:cNvGraphicFramePr>
@@ -2039,7 +2379,7 @@
                     <pic:cNvPicPr/>
                   </pic:nvPicPr>
                   <pic:blipFill>
-                    <a:blip r:embed="rId11"/>
+                    <a:blip r:embed="rId12"/>
                     <a:stretch>
                       <a:fillRect/>
                     </a:stretch>
@@ -2063,7 +2403,7 @@
         <w:pStyle w:val="Caption"/>
       </w:pPr>
       <w:r>
-        <w:t>图3　文本特征命中数及高频词。各特征可重叠；正文分词仅分析清理后的可见文本。</w:t>
+        <w:t>图4　文本特征命中数及高频词。各特征可重叠；正文分词仅分析清理后的可见文本。</w:t>
       </w:r>
     </w:p>
     <w:tbl>
@@ -2365,7 +2705,810 @@
         <w:pStyle w:val="Subtitle"/>
       </w:pPr>
       <w:r>
-        <w:t>08 · 从描述到回归</w:t>
+        <w:t>09 · 探索性主题分析</w:t>
+      </w:r>
+    </w:p>
+    <w:p>
+      <w:pPr>
+        <w:pStyle w:val="Heading1"/>
+      </w:pPr>
+      <w:r>
+        <w:t>TF-IDF与非负矩阵分解的主题分析</w:t>
+      </w:r>
+    </w:p>
+    <w:p>
+      <w:r>
+        <w:t>原词典能够识别事先定义的字面特征，但覆盖范围较窄。为考察词典之外的内容差异，进一步将清理后的正文进行中文分词和停用词过滤，以TF-IDF构建文档—词项矩阵，再采用非负矩阵分解（NMF）提取五种潜在表达模式。[7] 主题数在本次扩展模型首次拟合前固定，不依据点赞结果选择。</w:t>
+      </w:r>
+    </w:p>
+    <w:p>
+      <w:r>
+        <w:t>NMF将非负矩阵X近似分解为W与H的乘积：W描述每条文档的成分权重，H描述每个成分的词项权重。本研究将成分数设为5，作为便于描述的分析粒度，不将其视为语料唯一或最优的主题划分。</w:t>
+      </w:r>
+    </w:p>
+    <w:tbl>
+      <w:tblPr>
+        <w:tblStyle w:val="LightShading-Accent1"/>
+        <w:tblW w:type="auto" w:w="0"/>
+        <w:tblLook w:firstColumn="1" w:firstRow="1" w:lastColumn="0" w:lastRow="0" w:noHBand="0" w:noVBand="1" w:val="04A0"/>
+      </w:tblPr>
+      <w:tblGrid>
+        <w:gridCol w:w="4986"/>
+        <w:gridCol w:w="4986"/>
+      </w:tblGrid>
+      <w:tr>
+        <w:tc>
+          <w:tcPr>
+            <w:tcW w:type="dxa" w:w="4986"/>
+          </w:tcPr>
+          <w:p>
+            <w:r>
+              <w:t>环节</w:t>
+            </w:r>
+          </w:p>
+        </w:tc>
+        <w:tc>
+          <w:tcPr>
+            <w:tcW w:type="dxa" w:w="4986"/>
+          </w:tcPr>
+          <w:p>
+            <w:r>
+              <w:t>设定</w:t>
+            </w:r>
+          </w:p>
+        </w:tc>
+      </w:tr>
+      <w:tr>
+        <w:tc>
+          <w:tcPr>
+            <w:tcW w:type="dxa" w:w="4986"/>
+          </w:tcPr>
+          <w:p>
+            <w:r>
+              <w:t>纳入标准</w:t>
+            </w:r>
+          </w:p>
+        </w:tc>
+        <w:tc>
+          <w:tcPr>
+            <w:tcW w:type="dxa" w:w="4986"/>
+          </w:tcPr>
+          <w:p>
+            <w:r>
+              <w:t>每帖至少含3个过滤后的有效词，并在最终词表中有非零表示。</w:t>
+            </w:r>
+          </w:p>
+        </w:tc>
+      </w:tr>
+      <w:tr>
+        <w:tc>
+          <w:tcPr>
+            <w:tcW w:type="dxa" w:w="4986"/>
+          </w:tcPr>
+          <w:p>
+            <w:r>
+              <w:t>词项过滤</w:t>
+            </w:r>
+          </w:p>
+        </w:tc>
+        <w:tc>
+          <w:tcPr>
+            <w:tcW w:type="dxa" w:w="4986"/>
+          </w:tcPr>
+          <w:p>
+            <w:r>
+              <w:t>至少出现于5帖，最高文档比例0.9；词表上限4,000。</w:t>
+            </w:r>
+          </w:p>
+        </w:tc>
+      </w:tr>
+      <w:tr>
+        <w:tc>
+          <w:tcPr>
+            <w:tcW w:type="dxa" w:w="4986"/>
+          </w:tcPr>
+          <w:p>
+            <w:r>
+              <w:t>模型与命名</w:t>
+            </w:r>
+          </w:p>
+        </w:tc>
+        <w:tc>
+          <w:tcPr>
+            <w:tcW w:type="dxa" w:w="4986"/>
+          </w:tcPr>
+          <w:p>
+            <w:r>
+              <w:t>NMF设为5个主题；依据关键词及不含点赞指标的正文抽查命名。</w:t>
+            </w:r>
+          </w:p>
+        </w:tc>
+      </w:tr>
+      <w:tr>
+        <w:tc>
+          <w:tcPr>
+            <w:tcW w:type="dxa" w:w="4986"/>
+          </w:tcPr>
+          <w:p>
+            <w:r>
+              <w:t>权重解释</w:t>
+            </w:r>
+          </w:p>
+        </w:tc>
+        <w:tc>
+          <w:tcPr>
+            <w:tcW w:type="dxa" w:w="4986"/>
+          </w:tcPr>
+          <w:p>
+            <w:r>
+              <w:t>先校正NMF成分的任意尺度，再归一化文档权重。权重表示相对贡献，不是主题后验概率。</w:t>
+            </w:r>
+          </w:p>
+        </w:tc>
+      </w:tr>
+      <w:tr>
+        <w:tc>
+          <w:tcPr>
+            <w:tcW w:type="dxa" w:w="4986"/>
+          </w:tcPr>
+          <w:p>
+            <w:r>
+              <w:t>稳定性</w:t>
+            </w:r>
+          </w:p>
+        </w:tc>
+        <w:tc>
+          <w:tcPr>
+            <w:tcW w:type="dxa" w:w="4986"/>
+          </w:tcPr>
+          <w:p>
+            <w:r>
+              <w:t>另用3个随机种子重复初始化，以成分余弦相似度匹配主题，比较前10关键词。</w:t>
+            </w:r>
+          </w:p>
+        </w:tc>
+      </w:tr>
+    </w:tbl>
+    <w:p>
+      <w:r>
+        <w:t>以2,478条满足词项要求的正文拟合模型，其中8条的成分贡献接近零，不作强制归类；其余2,470帖、86位作者进入主题描述和回归，词表含1,046项。这一子样本覆盖全部帖子的25.9%，对较长、信息较充分的正文代表性更强。</w:t>
+      </w:r>
+    </w:p>
+    <w:tbl>
+      <w:tblPr>
+        <w:tblStyle w:val="LightShading-Accent1"/>
+        <w:tblW w:type="auto" w:w="0"/>
+        <w:tblLook w:firstColumn="1" w:firstRow="1" w:lastColumn="0" w:lastRow="0" w:noHBand="0" w:noVBand="1" w:val="04A0"/>
+      </w:tblPr>
+      <w:tblGrid>
+        <w:gridCol w:w="2493"/>
+        <w:gridCol w:w="2493"/>
+        <w:gridCol w:w="2493"/>
+        <w:gridCol w:w="2493"/>
+      </w:tblGrid>
+      <w:tr>
+        <w:tc>
+          <w:tcPr>
+            <w:tcW w:type="dxa" w:w="2493"/>
+          </w:tcPr>
+          <w:p>
+            <w:r>
+              <w:t>主题名称</w:t>
+            </w:r>
+          </w:p>
+        </w:tc>
+        <w:tc>
+          <w:tcPr>
+            <w:tcW w:type="dxa" w:w="2493"/>
+          </w:tcPr>
+          <w:p>
+            <w:r>
+              <w:t>主要关键词</w:t>
+            </w:r>
+          </w:p>
+        </w:tc>
+        <w:tc>
+          <w:tcPr>
+            <w:tcW w:type="dxa" w:w="2493"/>
+          </w:tcPr>
+          <w:p>
+            <w:r>
+              <w:t>主导文档数</w:t>
+            </w:r>
+          </w:p>
+        </w:tc>
+        <w:tc>
+          <w:tcPr>
+            <w:tcW w:type="dxa" w:w="2493"/>
+          </w:tcPr>
+          <w:p>
+            <w:r>
+              <w:t>主导占比</w:t>
+            </w:r>
+          </w:p>
+        </w:tc>
+      </w:tr>
+      <w:tr>
+        <w:tc>
+          <w:tcPr>
+            <w:tcW w:type="dxa" w:w="2493"/>
+          </w:tcPr>
+          <w:p>
+            <w:r>
+              <w:t>靠墙静蹲记录</w:t>
+            </w:r>
+          </w:p>
+        </w:tc>
+        <w:tc>
+          <w:tcPr>
+            <w:tcW w:type="dxa" w:w="2493"/>
+          </w:tcPr>
+          <w:p>
+            <w:r>
+              <w:t>靠墙、膝盖、保护、第二组、第一组、站立</w:t>
+            </w:r>
+          </w:p>
+        </w:tc>
+        <w:tc>
+          <w:tcPr>
+            <w:tcW w:type="dxa" w:w="2493"/>
+          </w:tcPr>
+          <w:p>
+            <w:r>
+              <w:t>85</w:t>
+            </w:r>
+          </w:p>
+        </w:tc>
+        <w:tc>
+          <w:tcPr>
+            <w:tcW w:type="dxa" w:w="2493"/>
+          </w:tcPr>
+          <w:p>
+            <w:r>
+              <w:t>3.4%</w:t>
+            </w:r>
+          </w:p>
+        </w:tc>
+      </w:tr>
+      <w:tr>
+        <w:tc>
+          <w:tcPr>
+            <w:tcW w:type="dxa" w:w="2493"/>
+          </w:tcPr>
+          <w:p>
+            <w:r>
+              <w:t>骑行里程记录</w:t>
+            </w:r>
+          </w:p>
+        </w:tc>
+        <w:tc>
+          <w:tcPr>
+            <w:tcW w:type="dxa" w:w="2493"/>
+          </w:tcPr>
+          <w:p>
+            <w:r>
+              <w:t>公里、骑行、每日、日常、冷风、广州</w:t>
+            </w:r>
+          </w:p>
+        </w:tc>
+        <w:tc>
+          <w:tcPr>
+            <w:tcW w:type="dxa" w:w="2493"/>
+          </w:tcPr>
+          <w:p>
+            <w:r>
+              <w:t>85</w:t>
+            </w:r>
+          </w:p>
+        </w:tc>
+        <w:tc>
+          <w:tcPr>
+            <w:tcW w:type="dxa" w:w="2493"/>
+          </w:tcPr>
+          <w:p>
+            <w:r>
+              <w:t>3.4%</w:t>
+            </w:r>
+          </w:p>
+        </w:tc>
+      </w:tr>
+      <w:tr>
+        <w:tc>
+          <w:tcPr>
+            <w:tcW w:type="dxa" w:w="2493"/>
+          </w:tcPr>
+          <w:p>
+            <w:r>
+              <w:t>运动与训练交流</w:t>
+            </w:r>
+          </w:p>
+        </w:tc>
+        <w:tc>
+          <w:tcPr>
+            <w:tcW w:type="dxa" w:w="2493"/>
+          </w:tcPr>
+          <w:p>
+            <w:r>
+              <w:t>运动、时间、简单、减脂、碎片、跑步</w:t>
+            </w:r>
+          </w:p>
+        </w:tc>
+        <w:tc>
+          <w:tcPr>
+            <w:tcW w:type="dxa" w:w="2493"/>
+          </w:tcPr>
+          <w:p>
+            <w:r>
+              <w:t>1,302</w:t>
+            </w:r>
+          </w:p>
+        </w:tc>
+        <w:tc>
+          <w:tcPr>
+            <w:tcW w:type="dxa" w:w="2493"/>
+          </w:tcPr>
+          <w:p>
+            <w:r>
+              <w:t>52.7%</w:t>
+            </w:r>
+          </w:p>
+        </w:tc>
+      </w:tr>
+      <w:tr>
+        <w:tc>
+          <w:tcPr>
+            <w:tcW w:type="dxa" w:w="2493"/>
+          </w:tcPr>
+          <w:p>
+            <w:r>
+              <w:t>跑步与训练打卡</w:t>
+            </w:r>
+          </w:p>
+        </w:tc>
+        <w:tc>
+          <w:tcPr>
+            <w:tcW w:type="dxa" w:w="2493"/>
+          </w:tcPr>
+          <w:p>
+            <w:r>
+              <w:t>打卡、夜跑、站立、晨跑、靠墙、跑步</w:t>
+            </w:r>
+          </w:p>
+        </w:tc>
+        <w:tc>
+          <w:tcPr>
+            <w:tcW w:type="dxa" w:w="2493"/>
+          </w:tcPr>
+          <w:p>
+            <w:r>
+              <w:t>113</w:t>
+            </w:r>
+          </w:p>
+        </w:tc>
+        <w:tc>
+          <w:tcPr>
+            <w:tcW w:type="dxa" w:w="2493"/>
+          </w:tcPr>
+          <w:p>
+            <w:r>
+              <w:t>4.6%</w:t>
+            </w:r>
+          </w:p>
+        </w:tc>
+      </w:tr>
+      <w:tr>
+        <w:tc>
+          <w:tcPr>
+            <w:tcW w:type="dxa" w:w="2493"/>
+          </w:tcPr>
+          <w:p>
+            <w:r>
+              <w:t>生活感悟与问候</w:t>
+            </w:r>
+          </w:p>
+        </w:tc>
+        <w:tc>
+          <w:tcPr>
+            <w:tcW w:type="dxa" w:w="2493"/>
+          </w:tcPr>
+          <w:p>
+            <w:r>
+              <w:t>人生、生活、早安、努力、美好、一种</w:t>
+            </w:r>
+          </w:p>
+        </w:tc>
+        <w:tc>
+          <w:tcPr>
+            <w:tcW w:type="dxa" w:w="2493"/>
+          </w:tcPr>
+          <w:p>
+            <w:r>
+              <w:t>885</w:t>
+            </w:r>
+          </w:p>
+        </w:tc>
+        <w:tc>
+          <w:tcPr>
+            <w:tcW w:type="dxa" w:w="2493"/>
+          </w:tcPr>
+          <w:p>
+            <w:r>
+              <w:t>35.8%</w:t>
+            </w:r>
+          </w:p>
+        </w:tc>
+      </w:tr>
+    </w:tbl>
+    <w:p>
+      <w:r>
+        <w:t>主导主题为每帖权重最高的成分，五类主导文档互斥；一条正文的软权重仍可分布在多个主题中。</w:t>
+      </w:r>
+    </w:p>
+    <w:p>
+      <w:r>
+        <w:br w:type="page"/>
+      </w:r>
+    </w:p>
+    <w:p>
+      <w:pPr>
+        <w:pStyle w:val="Subtitle"/>
+      </w:pPr>
+      <w:r>
+        <w:t>10 · 探索性主题分析</w:t>
+      </w:r>
+    </w:p>
+    <w:p>
+      <w:pPr>
+        <w:pStyle w:val="Heading1"/>
+      </w:pPr>
+      <w:r>
+        <w:t>主题分布及其作者集中度</w:t>
+      </w:r>
+    </w:p>
+    <w:p>
+      <w:r>
+        <w:drawing>
+          <wp:inline xmlns:a="http://schemas.openxmlformats.org/drawingml/2006/main" xmlns:pic="http://schemas.openxmlformats.org/drawingml/2006/picture">
+            <wp:extent cx="5940000" cy="2142950"/>
+            <wp:docPr id="5" name="Picture 5"/>
+            <wp:cNvGraphicFramePr>
+              <a:graphicFrameLocks noChangeAspect="1"/>
+            </wp:cNvGraphicFramePr>
+            <a:graphic>
+              <a:graphicData uri="http://schemas.openxmlformats.org/drawingml/2006/picture">
+                <pic:pic>
+                  <pic:nvPicPr>
+                    <pic:cNvPr id="0" name="09_topics.png"/>
+                    <pic:cNvPicPr/>
+                  </pic:nvPicPr>
+                  <pic:blipFill>
+                    <a:blip r:embed="rId13"/>
+                    <a:stretch>
+                      <a:fillRect/>
+                    </a:stretch>
+                  </pic:blipFill>
+                  <pic:spPr>
+                    <a:xfrm>
+                      <a:off x="0" y="0"/>
+                      <a:ext cx="5940000" cy="2142950"/>
+                    </a:xfrm>
+                    <a:prstGeom prst="rect"/>
+                  </pic:spPr>
+                </pic:pic>
+              </a:graphicData>
+            </a:graphic>
+          </wp:inline>
+        </w:drawing>
+      </w:r>
+    </w:p>
+    <w:p>
+      <w:pPr>
+        <w:pStyle w:val="Caption"/>
+      </w:pPr>
+      <w:r>
+        <w:t>图5　主题模型子样本中五类主导主题的占比。主题命名基于词项与正文内容，不使用点赞数。</w:t>
+      </w:r>
+    </w:p>
+    <w:p>
+      <w:r>
+        <w:t>“运动与训练交流”和“生活感悟与问候”分别占主导文档的52.7%和35.8%。另有两个规模较小、形式较固定的记录主题：靠墙静蹲记录中，最大作者贡献91.8%的主导文档；骑行里程记录中，该比例为68.2%。因此，这些主题既反映内容差异，也反映特定作者反复使用的表达模板。</w:t>
+      </w:r>
+    </w:p>
+    <w:tbl>
+      <w:tblPr>
+        <w:tblStyle w:val="LightShading-Accent1"/>
+        <w:tblW w:type="auto" w:w="0"/>
+        <w:tblLook w:firstColumn="1" w:firstRow="1" w:lastColumn="0" w:lastRow="0" w:noHBand="0" w:noVBand="1" w:val="04A0"/>
+      </w:tblPr>
+      <w:tblGrid>
+        <w:gridCol w:w="1994"/>
+        <w:gridCol w:w="1994"/>
+        <w:gridCol w:w="1994"/>
+        <w:gridCol w:w="1994"/>
+        <w:gridCol w:w="1994"/>
+      </w:tblGrid>
+      <w:tr>
+        <w:tc>
+          <w:tcPr>
+            <w:tcW w:type="dxa" w:w="1994"/>
+          </w:tcPr>
+          <w:p>
+            <w:r>
+              <w:t>相对“运动与训练交流”</w:t>
+            </w:r>
+          </w:p>
+        </w:tc>
+        <w:tc>
+          <w:tcPr>
+            <w:tcW w:type="dxa" w:w="1994"/>
+          </w:tcPr>
+          <w:p>
+            <w:r>
+              <w:t>系数</w:t>
+            </w:r>
+          </w:p>
+        </w:tc>
+        <w:tc>
+          <w:tcPr>
+            <w:tcW w:type="dxa" w:w="1994"/>
+          </w:tcPr>
+          <w:p>
+            <w:r>
+              <w:t>95%聚类区间</w:t>
+            </w:r>
+          </w:p>
+        </w:tc>
+        <w:tc>
+          <w:tcPr>
+            <w:tcW w:type="dxa" w:w="1994"/>
+          </w:tcPr>
+          <w:p>
+            <w:r>
+              <w:t>原始p</w:t>
+            </w:r>
+          </w:p>
+        </w:tc>
+        <w:tc>
+          <w:tcPr>
+            <w:tcW w:type="dxa" w:w="1994"/>
+          </w:tcPr>
+          <w:p>
+            <w:r>
+              <w:t>BH q</w:t>
+            </w:r>
+          </w:p>
+        </w:tc>
+      </w:tr>
+      <w:tr>
+        <w:tc>
+          <w:tcPr>
+            <w:tcW w:type="dxa" w:w="1994"/>
+          </w:tcPr>
+          <w:p>
+            <w:r>
+              <w:t>靠墙静蹲记录</w:t>
+            </w:r>
+          </w:p>
+        </w:tc>
+        <w:tc>
+          <w:tcPr>
+            <w:tcW w:type="dxa" w:w="1994"/>
+          </w:tcPr>
+          <w:p>
+            <w:r>
+              <w:t>-0.315</w:t>
+            </w:r>
+          </w:p>
+        </w:tc>
+        <w:tc>
+          <w:tcPr>
+            <w:tcW w:type="dxa" w:w="1994"/>
+          </w:tcPr>
+          <w:p>
+            <w:r>
+              <w:t>[-0.636, 0.005]</w:t>
+            </w:r>
+          </w:p>
+        </w:tc>
+        <w:tc>
+          <w:tcPr>
+            <w:tcW w:type="dxa" w:w="1994"/>
+          </w:tcPr>
+          <w:p>
+            <w:r>
+              <w:t>0.054</w:t>
+            </w:r>
+          </w:p>
+        </w:tc>
+        <w:tc>
+          <w:tcPr>
+            <w:tcW w:type="dxa" w:w="1994"/>
+          </w:tcPr>
+          <w:p>
+            <w:r>
+              <w:t>0.107</w:t>
+            </w:r>
+          </w:p>
+        </w:tc>
+      </w:tr>
+      <w:tr>
+        <w:tc>
+          <w:tcPr>
+            <w:tcW w:type="dxa" w:w="1994"/>
+          </w:tcPr>
+          <w:p>
+            <w:r>
+              <w:t>骑行里程记录</w:t>
+            </w:r>
+          </w:p>
+        </w:tc>
+        <w:tc>
+          <w:tcPr>
+            <w:tcW w:type="dxa" w:w="1994"/>
+          </w:tcPr>
+          <w:p>
+            <w:r>
+              <w:t>0.018</w:t>
+            </w:r>
+          </w:p>
+        </w:tc>
+        <w:tc>
+          <w:tcPr>
+            <w:tcW w:type="dxa" w:w="1994"/>
+          </w:tcPr>
+          <w:p>
+            <w:r>
+              <w:t>[-0.523, 0.558]</w:t>
+            </w:r>
+          </w:p>
+        </w:tc>
+        <w:tc>
+          <w:tcPr>
+            <w:tcW w:type="dxa" w:w="1994"/>
+          </w:tcPr>
+          <w:p>
+            <w:r>
+              <w:t>0.948</w:t>
+            </w:r>
+          </w:p>
+        </w:tc>
+        <w:tc>
+          <w:tcPr>
+            <w:tcW w:type="dxa" w:w="1994"/>
+          </w:tcPr>
+          <w:p>
+            <w:r>
+              <w:t>0.948</w:t>
+            </w:r>
+          </w:p>
+        </w:tc>
+      </w:tr>
+      <w:tr>
+        <w:tc>
+          <w:tcPr>
+            <w:tcW w:type="dxa" w:w="1994"/>
+          </w:tcPr>
+          <w:p>
+            <w:r>
+              <w:t>跑步与训练打卡</w:t>
+            </w:r>
+          </w:p>
+        </w:tc>
+        <w:tc>
+          <w:tcPr>
+            <w:tcW w:type="dxa" w:w="1994"/>
+          </w:tcPr>
+          <w:p>
+            <w:r>
+              <w:t>-0.471</w:t>
+            </w:r>
+          </w:p>
+        </w:tc>
+        <w:tc>
+          <w:tcPr>
+            <w:tcW w:type="dxa" w:w="1994"/>
+          </w:tcPr>
+          <w:p>
+            <w:r>
+              <w:t>[-1.048, 0.105]</w:t>
+            </w:r>
+          </w:p>
+        </w:tc>
+        <w:tc>
+          <w:tcPr>
+            <w:tcW w:type="dxa" w:w="1994"/>
+          </w:tcPr>
+          <w:p>
+            <w:r>
+              <w:t>0.108</w:t>
+            </w:r>
+          </w:p>
+        </w:tc>
+        <w:tc>
+          <w:tcPr>
+            <w:tcW w:type="dxa" w:w="1994"/>
+          </w:tcPr>
+          <w:p>
+            <w:r>
+              <w:t>0.144</w:t>
+            </w:r>
+          </w:p>
+        </w:tc>
+      </w:tr>
+      <w:tr>
+        <w:tc>
+          <w:tcPr>
+            <w:tcW w:type="dxa" w:w="1994"/>
+          </w:tcPr>
+          <w:p>
+            <w:r>
+              <w:t>生活感悟与问候</w:t>
+            </w:r>
+          </w:p>
+        </w:tc>
+        <w:tc>
+          <w:tcPr>
+            <w:tcW w:type="dxa" w:w="1994"/>
+          </w:tcPr>
+          <w:p>
+            <w:r>
+              <w:t>-0.144</w:t>
+            </w:r>
+          </w:p>
+        </w:tc>
+        <w:tc>
+          <w:tcPr>
+            <w:tcW w:type="dxa" w:w="1994"/>
+          </w:tcPr>
+          <w:p>
+            <w:r>
+              <w:t>[-0.278, -0.010]</w:t>
+            </w:r>
+          </w:p>
+        </w:tc>
+        <w:tc>
+          <w:tcPr>
+            <w:tcW w:type="dxa" w:w="1994"/>
+          </w:tcPr>
+          <w:p>
+            <w:r>
+              <w:t>0.035</w:t>
+            </w:r>
+          </w:p>
+        </w:tc>
+        <w:tc>
+          <w:tcPr>
+            <w:tcW w:type="dxa" w:w="1994"/>
+          </w:tcPr>
+          <w:p>
+            <w:r>
+              <w:t>0.107</w:t>
+            </w:r>
+          </w:p>
+        </w:tc>
+      </w:tr>
+    </w:tbl>
+    <w:p>
+      <w:r>
+        <w:t>探索性回归在上述2,470帖中保留原模型控制项，并加入四个主题权重；基准主题按主导文档数确定。四项权重作为独立的探索性检验家族进行BH校正。联合检验p=0.166，各项校正后均未达到5%显著性水平，未提供足够证据支持主题权重在原有控制之外具有明确关联。</w:t>
+      </w:r>
+    </w:p>
+    <w:p>
+      <w:r>
+        <w:t>三次初始化的前10关键词平均Jaccard为1.000，仅表明对初始化较稳定。表内系数对应主题权重变化1单位；10个百分点的变化对应0.1β。区间以主题特征为给定输入，未计入主题估计的不确定性。</w:t>
+      </w:r>
+    </w:p>
+    <w:p>
+      <w:r>
+        <w:br w:type="page"/>
+      </w:r>
+    </w:p>
+    <w:p>
+      <w:pPr>
+        <w:pStyle w:val="Subtitle"/>
+      </w:pPr>
+      <w:r>
+        <w:t>11 · 从描述到回归</w:t>
       </w:r>
     </w:p>
     <w:p>
@@ -2723,7 +3866,7 @@
         <w:pStyle w:val="Subtitle"/>
       </w:pPr>
       <w:r>
-        <w:t>09 · 模型与统计推断</w:t>
+        <w:t>12 · 模型与统计推断</w:t>
       </w:r>
     </w:p>
     <w:p>
@@ -2971,7 +4114,7 @@
         <w:pStyle w:val="Subtitle"/>
       </w:pPr>
       <w:r>
-        <w:t>10 · 回归结果</w:t>
+        <w:t>13 · 回归结果</w:t>
       </w:r>
     </w:p>
     <w:p>
@@ -3582,7 +4725,7 @@
         <w:pStyle w:val="Subtitle"/>
       </w:pPr>
       <w:r>
-        <w:t>11 · 系数及效应含义</w:t>
+        <w:t>14 · 系数及效应含义</w:t>
       </w:r>
     </w:p>
     <w:p>
@@ -3598,7 +4741,7 @@
         <w:drawing>
           <wp:inline xmlns:a="http://schemas.openxmlformats.org/drawingml/2006/main" xmlns:pic="http://schemas.openxmlformats.org/drawingml/2006/picture">
             <wp:extent cx="5940000" cy="2337388"/>
-            <wp:docPr id="4" name="Picture 4"/>
+            <wp:docPr id="6" name="Picture 6"/>
             <wp:cNvGraphicFramePr>
               <a:graphicFrameLocks noChangeAspect="1"/>
             </wp:cNvGraphicFramePr>
@@ -3610,7 +4753,7 @@
                     <pic:cNvPicPr/>
                   </pic:nvPicPr>
                   <pic:blipFill>
-                    <a:blip r:embed="rId12"/>
+                    <a:blip r:embed="rId14"/>
                     <a:stretch>
                       <a:fillRect/>
                     </a:stretch>
@@ -3634,7 +4777,7 @@
         <w:pStyle w:val="Caption"/>
       </w:pPr>
       <w:r>
-        <w:t>图4　M3五项核心文本系数和按作者聚类的95%置信区间。此处区间未进行多重检验调整；q值见表。</w:t>
+        <w:t>图6　M3五项核心文本系数和按作者聚类的95%置信区间。此处区间未进行多重检验调整；q值见表。</w:t>
       </w:r>
     </w:p>
     <w:p>
@@ -3675,7 +4818,7 @@
         <w:pStyle w:val="Subtitle"/>
       </w:pPr>
       <w:r>
-        <w:t>12 · 稳健性检验</w:t>
+        <w:t>15 · 稳健性检验</w:t>
       </w:r>
     </w:p>
     <w:p>
@@ -3691,7 +4834,7 @@
         <w:drawing>
           <wp:inline xmlns:a="http://schemas.openxmlformats.org/drawingml/2006/main" xmlns:pic="http://schemas.openxmlformats.org/drawingml/2006/picture">
             <wp:extent cx="5940000" cy="1828332"/>
-            <wp:docPr id="5" name="Picture 5"/>
+            <wp:docPr id="7" name="Picture 7"/>
             <wp:cNvGraphicFramePr>
               <a:graphicFrameLocks noChangeAspect="1"/>
             </wp:cNvGraphicFramePr>
@@ -3703,7 +4846,7 @@
                     <pic:cNvPicPr/>
                   </pic:nvPicPr>
                   <pic:blipFill>
-                    <a:blip r:embed="rId13"/>
+                    <a:blip r:embed="rId15"/>
                     <a:stretch>
                       <a:fillRect/>
                     </a:stretch>
@@ -3727,7 +4870,7 @@
         <w:pStyle w:val="Caption"/>
       </w:pPr>
       <w:r>
-        <w:t>图5　三类词汇在不同规格下的系数与原始95%聚类置信区间。OLS刻画ln(1+点赞数)；PPML刻画算术条件期望点赞数的对数，系数不能直接视作同一估计量。</w:t>
+        <w:t>图7　三类词汇在不同规格下的系数与原始95%聚类置信区间。OLS刻画ln(1+点赞数)；PPML刻画算术条件期望点赞数的对数，系数不能直接视作同一估计量。</w:t>
       </w:r>
     </w:p>
     <w:tbl>
@@ -4081,7 +5224,1642 @@
         <w:pStyle w:val="Subtitle"/>
       </w:pPr>
       <w:r>
-        <w:t>13 · 文本测量核查</w:t>
+        <w:t>16 · 作者影响检验</w:t>
+      </w:r>
+    </w:p>
+    <w:p>
+      <w:pPr>
+        <w:pStyle w:val="Heading1"/>
+      </w:pPr>
+      <w:r>
+        <w:t>逐作者剔除后的系数敏感性</w:t>
+      </w:r>
+    </w:p>
+    <w:p>
+      <w:r>
+        <w:t>作者固定效应可以控制稳定的作者差异，但个别作者仍可能为某些文本特征提供较多变化。为检验这种影响，依次剔除一位作者，重新估计原主模型，共进行100次计算；模型控制项与变量定义保持一致。该检验观察点估计的敏感性，不将100次结果作为额外的显著性检验。</w:t>
+      </w:r>
+    </w:p>
+    <w:p>
+      <w:r>
+        <w:drawing>
+          <wp:inline xmlns:a="http://schemas.openxmlformats.org/drawingml/2006/main" xmlns:pic="http://schemas.openxmlformats.org/drawingml/2006/picture">
+            <wp:extent cx="5940000" cy="2241945"/>
+            <wp:docPr id="8" name="Picture 8"/>
+            <wp:cNvGraphicFramePr>
+              <a:graphicFrameLocks noChangeAspect="1"/>
+            </wp:cNvGraphicFramePr>
+            <a:graphic>
+              <a:graphicData uri="http://schemas.openxmlformats.org/drawingml/2006/picture">
+                <pic:pic>
+                  <pic:nvPicPr>
+                    <pic:cNvPr id="0" name="12_author_influence.png"/>
+                    <pic:cNvPicPr/>
+                  </pic:nvPicPr>
+                  <pic:blipFill>
+                    <a:blip r:embed="rId16"/>
+                    <a:stretch>
+                      <a:fillRect/>
+                    </a:stretch>
+                  </pic:blipFill>
+                  <pic:spPr>
+                    <a:xfrm>
+                      <a:off x="0" y="0"/>
+                      <a:ext cx="5940000" cy="2241945"/>
+                    </a:xfrm>
+                    <a:prstGeom prst="rect"/>
+                  </pic:spPr>
+                </pic:pic>
+              </a:graphicData>
+            </a:graphic>
+          </wp:inline>
+        </w:drawing>
+      </w:r>
+    </w:p>
+    <w:p>
+      <w:pPr>
+        <w:pStyle w:val="Caption"/>
+      </w:pPr>
+      <w:r>
+        <w:t>图8　逐次剔除一位作者后的五项核心系数分布。箱体表示中间50%，散点表示箱须之外的结果。</w:t>
+      </w:r>
+    </w:p>
+    <w:tbl>
+      <w:tblPr>
+        <w:tblStyle w:val="LightShading-Accent1"/>
+        <w:tblW w:type="auto" w:w="0"/>
+        <w:tblLook w:firstColumn="1" w:firstRow="1" w:lastColumn="0" w:lastRow="0" w:noHBand="0" w:noVBand="1" w:val="04A0"/>
+      </w:tblPr>
+      <w:tblGrid>
+        <w:gridCol w:w="2493"/>
+        <w:gridCol w:w="2493"/>
+        <w:gridCol w:w="2493"/>
+        <w:gridCol w:w="2493"/>
+      </w:tblGrid>
+      <w:tr>
+        <w:tc>
+          <w:tcPr>
+            <w:tcW w:type="dxa" w:w="2493"/>
+          </w:tcPr>
+          <w:p>
+            <w:r>
+              <w:t>特征</w:t>
+            </w:r>
+          </w:p>
+        </w:tc>
+        <w:tc>
+          <w:tcPr>
+            <w:tcW w:type="dxa" w:w="2493"/>
+          </w:tcPr>
+          <w:p>
+            <w:r>
+              <w:t>最小系数</w:t>
+            </w:r>
+          </w:p>
+        </w:tc>
+        <w:tc>
+          <w:tcPr>
+            <w:tcW w:type="dxa" w:w="2493"/>
+          </w:tcPr>
+          <w:p>
+            <w:r>
+              <w:t>最大系数</w:t>
+            </w:r>
+          </w:p>
+        </w:tc>
+        <w:tc>
+          <w:tcPr>
+            <w:tcW w:type="dxa" w:w="2493"/>
+          </w:tcPr>
+          <w:p>
+            <w:r>
+              <w:t>正向/负向次数</w:t>
+            </w:r>
+          </w:p>
+        </w:tc>
+      </w:tr>
+      <w:tr>
+        <w:tc>
+          <w:tcPr>
+            <w:tcW w:type="dxa" w:w="2493"/>
+          </w:tcPr>
+          <w:p>
+            <w:r>
+              <w:t>正文长度</w:t>
+            </w:r>
+          </w:p>
+        </w:tc>
+        <w:tc>
+          <w:tcPr>
+            <w:tcW w:type="dxa" w:w="2493"/>
+          </w:tcPr>
+          <w:p>
+            <w:r>
+              <w:t>0.021</w:t>
+            </w:r>
+          </w:p>
+        </w:tc>
+        <w:tc>
+          <w:tcPr>
+            <w:tcW w:type="dxa" w:w="2493"/>
+          </w:tcPr>
+          <w:p>
+            <w:r>
+              <w:t>0.038</w:t>
+            </w:r>
+          </w:p>
+        </w:tc>
+        <w:tc>
+          <w:tcPr>
+            <w:tcW w:type="dxa" w:w="2493"/>
+          </w:tcPr>
+          <w:p>
+            <w:r>
+              <w:t>100/0</w:t>
+            </w:r>
+          </w:p>
+        </w:tc>
+      </w:tr>
+      <w:tr>
+        <w:tc>
+          <w:tcPr>
+            <w:tcW w:type="dxa" w:w="2493"/>
+          </w:tcPr>
+          <w:p>
+            <w:r>
+              <w:t>积极表达词</w:t>
+            </w:r>
+          </w:p>
+        </w:tc>
+        <w:tc>
+          <w:tcPr>
+            <w:tcW w:type="dxa" w:w="2493"/>
+          </w:tcPr>
+          <w:p>
+            <w:r>
+              <w:t>-0.100</w:t>
+            </w:r>
+          </w:p>
+        </w:tc>
+        <w:tc>
+          <w:tcPr>
+            <w:tcW w:type="dxa" w:w="2493"/>
+          </w:tcPr>
+          <w:p>
+            <w:r>
+              <w:t>-0.074</w:t>
+            </w:r>
+          </w:p>
+        </w:tc>
+        <w:tc>
+          <w:tcPr>
+            <w:tcW w:type="dxa" w:w="2493"/>
+          </w:tcPr>
+          <w:p>
+            <w:r>
+              <w:t>0/100</w:t>
+            </w:r>
+          </w:p>
+        </w:tc>
+      </w:tr>
+      <w:tr>
+        <w:tc>
+          <w:tcPr>
+            <w:tcW w:type="dxa" w:w="2493"/>
+          </w:tcPr>
+          <w:p>
+            <w:r>
+              <w:t>问号</w:t>
+            </w:r>
+          </w:p>
+        </w:tc>
+        <w:tc>
+          <w:tcPr>
+            <w:tcW w:type="dxa" w:w="2493"/>
+          </w:tcPr>
+          <w:p>
+            <w:r>
+              <w:t>0.065</w:t>
+            </w:r>
+          </w:p>
+        </w:tc>
+        <w:tc>
+          <w:tcPr>
+            <w:tcW w:type="dxa" w:w="2493"/>
+          </w:tcPr>
+          <w:p>
+            <w:r>
+              <w:t>0.147</w:t>
+            </w:r>
+          </w:p>
+        </w:tc>
+        <w:tc>
+          <w:tcPr>
+            <w:tcW w:type="dxa" w:w="2493"/>
+          </w:tcPr>
+          <w:p>
+            <w:r>
+              <w:t>100/0</w:t>
+            </w:r>
+          </w:p>
+        </w:tc>
+      </w:tr>
+      <w:tr>
+        <w:tc>
+          <w:tcPr>
+            <w:tcW w:type="dxa" w:w="2493"/>
+          </w:tcPr>
+          <w:p>
+            <w:r>
+              <w:t>自律/目标词</w:t>
+            </w:r>
+          </w:p>
+        </w:tc>
+        <w:tc>
+          <w:tcPr>
+            <w:tcW w:type="dxa" w:w="2493"/>
+          </w:tcPr>
+          <w:p>
+            <w:r>
+              <w:t>-0.140</w:t>
+            </w:r>
+          </w:p>
+        </w:tc>
+        <w:tc>
+          <w:tcPr>
+            <w:tcW w:type="dxa" w:w="2493"/>
+          </w:tcPr>
+          <w:p>
+            <w:r>
+              <w:t>-0.024</w:t>
+            </w:r>
+          </w:p>
+        </w:tc>
+        <w:tc>
+          <w:tcPr>
+            <w:tcW w:type="dxa" w:w="2493"/>
+          </w:tcPr>
+          <w:p>
+            <w:r>
+              <w:t>0/100</w:t>
+            </w:r>
+          </w:p>
+        </w:tc>
+      </w:tr>
+      <w:tr>
+        <w:tc>
+          <w:tcPr>
+            <w:tcW w:type="dxa" w:w="2493"/>
+          </w:tcPr>
+          <w:p>
+            <w:r>
+              <w:t>社交称呼/互助词</w:t>
+            </w:r>
+          </w:p>
+        </w:tc>
+        <w:tc>
+          <w:tcPr>
+            <w:tcW w:type="dxa" w:w="2493"/>
+          </w:tcPr>
+          <w:p>
+            <w:r>
+              <w:t>-0.032</w:t>
+            </w:r>
+          </w:p>
+        </w:tc>
+        <w:tc>
+          <w:tcPr>
+            <w:tcW w:type="dxa" w:w="2493"/>
+          </w:tcPr>
+          <w:p>
+            <w:r>
+              <w:t>0.037</w:t>
+            </w:r>
+          </w:p>
+        </w:tc>
+        <w:tc>
+          <w:tcPr>
+            <w:tcW w:type="dxa" w:w="2493"/>
+          </w:tcPr>
+          <w:p>
+            <w:r>
+              <w:t>11/89</w:t>
+            </w:r>
+          </w:p>
+        </w:tc>
+      </w:tr>
+    </w:tbl>
+    <w:p>
+      <w:r>
+        <w:t>积极表达词在100次剔除中均为负，系数范围为[-0.100, -0.074]，说明其OLS负向点估计并非由单一作者决定。但符号稳定不能替代统计推断，原BH校正和PPML结果仍显示证据有限。社交称呼/互助词在11次剔除后转为正值，与原系数接近零的结果一致。</w:t>
+      </w:r>
+    </w:p>
+    <w:p>
+      <w:r>
+        <w:t>逐作者结果及以主模型聚类标准误为单位的系数变化见extension_author_influence.csv。</w:t>
+      </w:r>
+    </w:p>
+    <w:p>
+      <w:r>
+        <w:br w:type="page"/>
+      </w:r>
+    </w:p>
+    <w:p>
+      <w:pPr>
+        <w:pStyle w:val="Subtitle"/>
+      </w:pPr>
+      <w:r>
+        <w:t>17 · 样本外预测对照</w:t>
+      </w:r>
+    </w:p>
+    <w:p>
+      <w:pPr>
+        <w:pStyle w:val="Heading1"/>
+      </w:pPr>
+      <w:r>
+        <w:t>文本特征能否改善样本外预测？</w:t>
+      </w:r>
+    </w:p>
+    <w:p>
+      <w:r>
+        <w:t>固定效应回归主要回答给定控制项后的关联问题，较高的样本内R²不意味着文本能够改善新样本预测。为补充这一判断，本研究在相同划分下比较四种预测模型，考察逐步加入文本后的误差变化。所有模型设置均在本次留出结果生成前固定，未根据测试集表现调参。</w:t>
+      </w:r>
+    </w:p>
+    <w:tbl>
+      <w:tblPr>
+        <w:tblStyle w:val="LightShading-Accent1"/>
+        <w:tblW w:type="auto" w:w="0"/>
+        <w:tblLook w:firstColumn="1" w:firstRow="1" w:lastColumn="0" w:lastRow="0" w:noHBand="0" w:noVBand="1" w:val="04A0"/>
+      </w:tblPr>
+      <w:tblGrid>
+        <w:gridCol w:w="4986"/>
+        <w:gridCol w:w="4986"/>
+      </w:tblGrid>
+      <w:tr>
+        <w:tc>
+          <w:tcPr>
+            <w:tcW w:type="dxa" w:w="4986"/>
+          </w:tcPr>
+          <w:p>
+            <w:r>
+              <w:t>模型</w:t>
+            </w:r>
+          </w:p>
+        </w:tc>
+        <w:tc>
+          <w:tcPr>
+            <w:tcW w:type="dxa" w:w="4986"/>
+          </w:tcPr>
+          <w:p>
+            <w:r>
+              <w:t>输入与设定</w:t>
+            </w:r>
+          </w:p>
+        </w:tc>
+      </w:tr>
+      <w:tr>
+        <w:tc>
+          <w:tcPr>
+            <w:tcW w:type="dxa" w:w="4986"/>
+          </w:tcPr>
+          <w:p>
+            <w:r>
+              <w:t>训练集均值</w:t>
+            </w:r>
+          </w:p>
+        </w:tc>
+        <w:tc>
+          <w:tcPr>
+            <w:tcW w:type="dxa" w:w="4986"/>
+          </w:tcPr>
+          <w:p>
+            <w:r>
+              <w:t>对所有测试帖预测训练集ln(1+点赞数)的均值。</w:t>
+            </w:r>
+          </w:p>
+        </w:tc>
+      </w:tr>
+      <w:tr>
+        <w:tc>
+          <w:tcPr>
+            <w:tcW w:type="dxa" w:w="4986"/>
+          </w:tcPr>
+          <w:p>
+            <w:r>
+              <w:t>结构化基线</w:t>
+            </w:r>
+          </w:p>
+        </w:tc>
+        <w:tc>
+          <w:tcPr>
+            <w:tcW w:type="dxa" w:w="4986"/>
+          </w:tcPr>
+          <w:p>
+            <w:r>
+              <w:t>作者编号、性别、Keep值、等级、会员、内容形式、业务类型、时段、星期、日期序号和话题标记。</w:t>
+            </w:r>
+          </w:p>
+        </w:tc>
+      </w:tr>
+      <w:tr>
+        <w:tc>
+          <w:tcPr>
+            <w:tcW w:type="dxa" w:w="4986"/>
+          </w:tcPr>
+          <w:p>
+            <w:r>
+              <w:t>结构化＋词典</w:t>
+            </w:r>
+          </w:p>
+        </w:tc>
+        <w:tc>
+          <w:tcPr>
+            <w:tcW w:type="dxa" w:w="4986"/>
+          </w:tcPr>
+          <w:p>
+            <w:r>
+              <w:t>在结构化基线上增加五项核心文本特征、正文可用状态、表情与课程标记。</w:t>
+            </w:r>
+          </w:p>
+        </w:tc>
+      </w:tr>
+      <w:tr>
+        <w:tc>
+          <w:tcPr>
+            <w:tcW w:type="dxa" w:w="4986"/>
+          </w:tcPr>
+          <w:p>
+            <w:r>
+              <w:t>结构化＋词典＋字符文本</w:t>
+            </w:r>
+          </w:p>
+        </w:tc>
+        <w:tc>
+          <w:tcPr>
+            <w:tcW w:type="dxa" w:w="4986"/>
+          </w:tcPr>
+          <w:p>
+            <w:r>
+              <w:t>进一步加入正文字符2—4元组TF-IDF，词项至少出现于3条训练帖，最多12,000项。</w:t>
+            </w:r>
+          </w:p>
+        </w:tc>
+      </w:tr>
+    </w:tbl>
+    <w:p>
+      <w:r>
+        <w:t>后三种模型均采用岭回归，正则化参数固定为10。类别编码、数值标准化及TF-IDF词表与逆文档频率均只在训练集中拟合，再应用于测试集。字符表示用于减少对人工词典及分词的依赖。</w:t>
+      </w:r>
+    </w:p>
+    <w:tbl>
+      <w:tblPr>
+        <w:tblStyle w:val="LightShading-Accent1"/>
+        <w:tblW w:type="auto" w:w="0"/>
+        <w:tblLook w:firstColumn="1" w:firstRow="1" w:lastColumn="0" w:lastRow="0" w:noHBand="0" w:noVBand="1" w:val="04A0"/>
+      </w:tblPr>
+      <w:tblGrid>
+        <w:gridCol w:w="3324"/>
+        <w:gridCol w:w="3324"/>
+        <w:gridCol w:w="3324"/>
+      </w:tblGrid>
+      <w:tr>
+        <w:tc>
+          <w:tcPr>
+            <w:tcW w:type="dxa" w:w="3324"/>
+          </w:tcPr>
+          <w:p>
+            <w:r>
+              <w:t>划分</w:t>
+            </w:r>
+          </w:p>
+        </w:tc>
+        <w:tc>
+          <w:tcPr>
+            <w:tcW w:type="dxa" w:w="3324"/>
+          </w:tcPr>
+          <w:p>
+            <w:r>
+              <w:t>训练与测试范围</w:t>
+            </w:r>
+          </w:p>
+        </w:tc>
+        <w:tc>
+          <w:tcPr>
+            <w:tcW w:type="dxa" w:w="3324"/>
+          </w:tcPr>
+          <w:p>
+            <w:r>
+              <w:t>主要回答的问题</w:t>
+            </w:r>
+          </w:p>
+        </w:tc>
+      </w:tr>
+      <w:tr>
+        <w:tc>
+          <w:tcPr>
+            <w:tcW w:type="dxa" w:w="3324"/>
+          </w:tcPr>
+          <w:p>
+            <w:r>
+              <w:t>时间留出</w:t>
+            </w:r>
+          </w:p>
+        </w:tc>
+        <w:tc>
+          <w:tcPr>
+            <w:tcW w:type="dxa" w:w="3324"/>
+          </w:tcPr>
+          <w:p>
+            <w:r>
+              <w:t>2020-12-15之前的7,098帖训练，之后的2,434帖测试；测试集含88位作者，其中87位在训练集中出现。</w:t>
+            </w:r>
+          </w:p>
+        </w:tc>
+        <w:tc>
+          <w:tcPr>
+            <w:tcW w:type="dxa" w:w="3324"/>
+          </w:tcPr>
+          <w:p>
+            <w:r>
+              <w:t>对较晚发布、主要来自已见作者的帖子，文本是否提供增量信息？</w:t>
+            </w:r>
+          </w:p>
+        </w:tc>
+      </w:tr>
+      <w:tr>
+        <w:tc>
+          <w:tcPr>
+            <w:tcW w:type="dxa" w:w="3324"/>
+          </w:tcPr>
+          <w:p>
+            <w:r>
+              <w:t>作者分组五折</w:t>
+            </w:r>
+          </w:p>
+        </w:tc>
+        <w:tc>
+          <w:tcPr>
+            <w:tcW w:type="dxa" w:w="3324"/>
+          </w:tcPr>
+          <w:p>
+            <w:r>
+              <w:t>按作者分为5折，每位作者的全部帖子只进入一个测试折，训练与测试作者不重叠。[8]</w:t>
+            </w:r>
+          </w:p>
+        </w:tc>
+        <w:tc>
+          <w:tcPr>
+            <w:tcW w:type="dxa" w:w="3324"/>
+          </w:tcPr>
+          <w:p>
+            <w:r>
+              <w:t>对未参与训练的作者，文本是否有助于泛化？</w:t>
+            </w:r>
+          </w:p>
+        </w:tc>
+      </w:tr>
+    </w:tbl>
+    <w:p>
+      <w:r>
+        <w:t>目标为采集时点的累计点赞，作者属性也缺少历史时戳。因此，“时间留出”是回顾性样本外检验，不代表按真实上线时点预测未来7天点赞的效果。</w:t>
+      </w:r>
+    </w:p>
+    <w:p>
+      <w:r>
+        <w:br w:type="page"/>
+      </w:r>
+    </w:p>
+    <w:p>
+      <w:pPr>
+        <w:pStyle w:val="Subtitle"/>
+      </w:pPr>
+      <w:r>
+        <w:t>18 · 样本外预测结果</w:t>
+      </w:r>
+    </w:p>
+    <w:p>
+      <w:pPr>
+        <w:pStyle w:val="Heading1"/>
+      </w:pPr>
+      <w:r>
+        <w:t>留出预测中的文本增益有限</w:t>
+      </w:r>
+    </w:p>
+    <w:p>
+      <w:r>
+        <w:drawing>
+          <wp:inline xmlns:a="http://schemas.openxmlformats.org/drawingml/2006/main" xmlns:pic="http://schemas.openxmlformats.org/drawingml/2006/picture">
+            <wp:extent cx="5940000" cy="1986838"/>
+            <wp:docPr id="9" name="Picture 9"/>
+            <wp:cNvGraphicFramePr>
+              <a:graphicFrameLocks noChangeAspect="1"/>
+            </wp:cNvGraphicFramePr>
+            <a:graphic>
+              <a:graphicData uri="http://schemas.openxmlformats.org/drawingml/2006/picture">
+                <pic:pic>
+                  <pic:nvPicPr>
+                    <pic:cNvPr id="0" name="10_prediction_comparison.png"/>
+                    <pic:cNvPicPr/>
+                  </pic:nvPicPr>
+                  <pic:blipFill>
+                    <a:blip r:embed="rId17"/>
+                    <a:stretch>
+                      <a:fillRect/>
+                    </a:stretch>
+                  </pic:blipFill>
+                  <pic:spPr>
+                    <a:xfrm>
+                      <a:off x="0" y="0"/>
+                      <a:ext cx="5940000" cy="1986838"/>
+                    </a:xfrm>
+                    <a:prstGeom prst="rect"/>
+                  </pic:spPr>
+                </pic:pic>
+              </a:graphicData>
+            </a:graphic>
+          </wp:inline>
+        </w:drawing>
+      </w:r>
+    </w:p>
+    <w:p>
+      <w:pPr>
+        <w:pStyle w:val="Caption"/>
+      </w:pPr>
+      <w:r>
+        <w:t>图9　两种划分下四类模型的留出MAE。误差均在ln(1+点赞数)尺度计算，越小越好。</w:t>
+      </w:r>
+    </w:p>
+    <w:tbl>
+      <w:tblPr>
+        <w:tblStyle w:val="LightShading-Accent1"/>
+        <w:tblW w:type="auto" w:w="0"/>
+        <w:tblLook w:firstColumn="1" w:firstRow="1" w:lastColumn="0" w:lastRow="0" w:noHBand="0" w:noVBand="1" w:val="04A0"/>
+      </w:tblPr>
+      <w:tblGrid>
+        <w:gridCol w:w="1994"/>
+        <w:gridCol w:w="1994"/>
+        <w:gridCol w:w="1994"/>
+        <w:gridCol w:w="1994"/>
+        <w:gridCol w:w="1994"/>
+      </w:tblGrid>
+      <w:tr>
+        <w:tc>
+          <w:tcPr>
+            <w:tcW w:type="dxa" w:w="1994"/>
+          </w:tcPr>
+          <w:p>
+            <w:r>
+              <w:t>划分</w:t>
+            </w:r>
+          </w:p>
+        </w:tc>
+        <w:tc>
+          <w:tcPr>
+            <w:tcW w:type="dxa" w:w="1994"/>
+          </w:tcPr>
+          <w:p>
+            <w:r>
+              <w:t>模型</w:t>
+            </w:r>
+          </w:p>
+        </w:tc>
+        <w:tc>
+          <w:tcPr>
+            <w:tcW w:type="dxa" w:w="1994"/>
+          </w:tcPr>
+          <w:p>
+            <w:r>
+              <w:t>MAE</w:t>
+            </w:r>
+          </w:p>
+        </w:tc>
+        <w:tc>
+          <w:tcPr>
+            <w:tcW w:type="dxa" w:w="1994"/>
+          </w:tcPr>
+          <w:p>
+            <w:r>
+              <w:t>RMSE</w:t>
+            </w:r>
+          </w:p>
+        </w:tc>
+        <w:tc>
+          <w:tcPr>
+            <w:tcW w:type="dxa" w:w="1994"/>
+          </w:tcPr>
+          <w:p>
+            <w:r>
+              <w:t>R²</w:t>
+            </w:r>
+          </w:p>
+        </w:tc>
+      </w:tr>
+      <w:tr>
+        <w:tc>
+          <w:tcPr>
+            <w:tcW w:type="dxa" w:w="1994"/>
+          </w:tcPr>
+          <w:p>
+            <w:r>
+              <w:t>时间留出</w:t>
+            </w:r>
+          </w:p>
+        </w:tc>
+        <w:tc>
+          <w:tcPr>
+            <w:tcW w:type="dxa" w:w="1994"/>
+          </w:tcPr>
+          <w:p>
+            <w:r>
+              <w:t>训练集均值</w:t>
+            </w:r>
+          </w:p>
+        </w:tc>
+        <w:tc>
+          <w:tcPr>
+            <w:tcW w:type="dxa" w:w="1994"/>
+          </w:tcPr>
+          <w:p>
+            <w:r>
+              <w:t>1.2452</w:t>
+            </w:r>
+          </w:p>
+        </w:tc>
+        <w:tc>
+          <w:tcPr>
+            <w:tcW w:type="dxa" w:w="1994"/>
+          </w:tcPr>
+          <w:p>
+            <w:r>
+              <w:t>1.4100</w:t>
+            </w:r>
+          </w:p>
+        </w:tc>
+        <w:tc>
+          <w:tcPr>
+            <w:tcW w:type="dxa" w:w="1994"/>
+          </w:tcPr>
+          <w:p>
+            <w:r>
+              <w:t>-0.007</w:t>
+            </w:r>
+          </w:p>
+        </w:tc>
+      </w:tr>
+      <w:tr>
+        <w:tc>
+          <w:tcPr>
+            <w:tcW w:type="dxa" w:w="1994"/>
+          </w:tcPr>
+          <w:p>
+            <w:r>
+              <w:t>时间留出</w:t>
+            </w:r>
+          </w:p>
+        </w:tc>
+        <w:tc>
+          <w:tcPr>
+            <w:tcW w:type="dxa" w:w="1994"/>
+          </w:tcPr>
+          <w:p>
+            <w:r>
+              <w:t>结构化基线</w:t>
+            </w:r>
+          </w:p>
+        </w:tc>
+        <w:tc>
+          <w:tcPr>
+            <w:tcW w:type="dxa" w:w="1994"/>
+          </w:tcPr>
+          <w:p>
+            <w:r>
+              <w:t>0.5641</w:t>
+            </w:r>
+          </w:p>
+        </w:tc>
+        <w:tc>
+          <w:tcPr>
+            <w:tcW w:type="dxa" w:w="1994"/>
+          </w:tcPr>
+          <w:p>
+            <w:r>
+              <w:t>0.7933</w:t>
+            </w:r>
+          </w:p>
+        </w:tc>
+        <w:tc>
+          <w:tcPr>
+            <w:tcW w:type="dxa" w:w="1994"/>
+          </w:tcPr>
+          <w:p>
+            <w:r>
+              <w:t>0.681</w:t>
+            </w:r>
+          </w:p>
+        </w:tc>
+      </w:tr>
+      <w:tr>
+        <w:tc>
+          <w:tcPr>
+            <w:tcW w:type="dxa" w:w="1994"/>
+          </w:tcPr>
+          <w:p>
+            <w:r>
+              <w:t>时间留出</w:t>
+            </w:r>
+          </w:p>
+        </w:tc>
+        <w:tc>
+          <w:tcPr>
+            <w:tcW w:type="dxa" w:w="1994"/>
+          </w:tcPr>
+          <w:p>
+            <w:r>
+              <w:t>结构化＋词典</w:t>
+            </w:r>
+          </w:p>
+        </w:tc>
+        <w:tc>
+          <w:tcPr>
+            <w:tcW w:type="dxa" w:w="1994"/>
+          </w:tcPr>
+          <w:p>
+            <w:r>
+              <w:t>0.5687</w:t>
+            </w:r>
+          </w:p>
+        </w:tc>
+        <w:tc>
+          <w:tcPr>
+            <w:tcW w:type="dxa" w:w="1994"/>
+          </w:tcPr>
+          <w:p>
+            <w:r>
+              <w:t>0.7971</w:t>
+            </w:r>
+          </w:p>
+        </w:tc>
+        <w:tc>
+          <w:tcPr>
+            <w:tcW w:type="dxa" w:w="1994"/>
+          </w:tcPr>
+          <w:p>
+            <w:r>
+              <w:t>0.678</w:t>
+            </w:r>
+          </w:p>
+        </w:tc>
+      </w:tr>
+      <w:tr>
+        <w:tc>
+          <w:tcPr>
+            <w:tcW w:type="dxa" w:w="1994"/>
+          </w:tcPr>
+          <w:p>
+            <w:r>
+              <w:t>时间留出</w:t>
+            </w:r>
+          </w:p>
+        </w:tc>
+        <w:tc>
+          <w:tcPr>
+            <w:tcW w:type="dxa" w:w="1994"/>
+          </w:tcPr>
+          <w:p>
+            <w:r>
+              <w:t>结构化＋词典＋字符文本</w:t>
+            </w:r>
+          </w:p>
+        </w:tc>
+        <w:tc>
+          <w:tcPr>
+            <w:tcW w:type="dxa" w:w="1994"/>
+          </w:tcPr>
+          <w:p>
+            <w:r>
+              <w:t>0.5656</w:t>
+            </w:r>
+          </w:p>
+        </w:tc>
+        <w:tc>
+          <w:tcPr>
+            <w:tcW w:type="dxa" w:w="1994"/>
+          </w:tcPr>
+          <w:p>
+            <w:r>
+              <w:t>0.7952</w:t>
+            </w:r>
+          </w:p>
+        </w:tc>
+        <w:tc>
+          <w:tcPr>
+            <w:tcW w:type="dxa" w:w="1994"/>
+          </w:tcPr>
+          <w:p>
+            <w:r>
+              <w:t>0.680</w:t>
+            </w:r>
+          </w:p>
+        </w:tc>
+      </w:tr>
+      <w:tr>
+        <w:tc>
+          <w:tcPr>
+            <w:tcW w:type="dxa" w:w="1994"/>
+          </w:tcPr>
+          <w:p>
+            <w:r>
+              <w:t>作者分组五折</w:t>
+            </w:r>
+          </w:p>
+        </w:tc>
+        <w:tc>
+          <w:tcPr>
+            <w:tcW w:type="dxa" w:w="1994"/>
+          </w:tcPr>
+          <w:p>
+            <w:r>
+              <w:t>训练集均值</w:t>
+            </w:r>
+          </w:p>
+        </w:tc>
+        <w:tc>
+          <w:tcPr>
+            <w:tcW w:type="dxa" w:w="1994"/>
+          </w:tcPr>
+          <w:p>
+            <w:r>
+              <w:t>1.2417</w:t>
+            </w:r>
+          </w:p>
+        </w:tc>
+        <w:tc>
+          <w:tcPr>
+            <w:tcW w:type="dxa" w:w="1994"/>
+          </w:tcPr>
+          <w:p>
+            <w:r>
+              <w:t>1.4148</w:t>
+            </w:r>
+          </w:p>
+        </w:tc>
+        <w:tc>
+          <w:tcPr>
+            <w:tcW w:type="dxa" w:w="1994"/>
+          </w:tcPr>
+          <w:p>
+            <w:r>
+              <w:t>-0.038</w:t>
+            </w:r>
+          </w:p>
+        </w:tc>
+      </w:tr>
+      <w:tr>
+        <w:tc>
+          <w:tcPr>
+            <w:tcW w:type="dxa" w:w="1994"/>
+          </w:tcPr>
+          <w:p>
+            <w:r>
+              <w:t>作者分组五折</w:t>
+            </w:r>
+          </w:p>
+        </w:tc>
+        <w:tc>
+          <w:tcPr>
+            <w:tcW w:type="dxa" w:w="1994"/>
+          </w:tcPr>
+          <w:p>
+            <w:r>
+              <w:t>结构化基线</w:t>
+            </w:r>
+          </w:p>
+        </w:tc>
+        <w:tc>
+          <w:tcPr>
+            <w:tcW w:type="dxa" w:w="1994"/>
+          </w:tcPr>
+          <w:p>
+            <w:r>
+              <w:t>0.7180</w:t>
+            </w:r>
+          </w:p>
+        </w:tc>
+        <w:tc>
+          <w:tcPr>
+            <w:tcW w:type="dxa" w:w="1994"/>
+          </w:tcPr>
+          <w:p>
+            <w:r>
+              <w:t>0.9837</w:t>
+            </w:r>
+          </w:p>
+        </w:tc>
+        <w:tc>
+          <w:tcPr>
+            <w:tcW w:type="dxa" w:w="1994"/>
+          </w:tcPr>
+          <w:p>
+            <w:r>
+              <w:t>0.498</w:t>
+            </w:r>
+          </w:p>
+        </w:tc>
+      </w:tr>
+      <w:tr>
+        <w:tc>
+          <w:tcPr>
+            <w:tcW w:type="dxa" w:w="1994"/>
+          </w:tcPr>
+          <w:p>
+            <w:r>
+              <w:t>作者分组五折</w:t>
+            </w:r>
+          </w:p>
+        </w:tc>
+        <w:tc>
+          <w:tcPr>
+            <w:tcW w:type="dxa" w:w="1994"/>
+          </w:tcPr>
+          <w:p>
+            <w:r>
+              <w:t>结构化＋词典</w:t>
+            </w:r>
+          </w:p>
+        </w:tc>
+        <w:tc>
+          <w:tcPr>
+            <w:tcW w:type="dxa" w:w="1994"/>
+          </w:tcPr>
+          <w:p>
+            <w:r>
+              <w:t>0.7141</w:t>
+            </w:r>
+          </w:p>
+        </w:tc>
+        <w:tc>
+          <w:tcPr>
+            <w:tcW w:type="dxa" w:w="1994"/>
+          </w:tcPr>
+          <w:p>
+            <w:r>
+              <w:t>0.9722</w:t>
+            </w:r>
+          </w:p>
+        </w:tc>
+        <w:tc>
+          <w:tcPr>
+            <w:tcW w:type="dxa" w:w="1994"/>
+          </w:tcPr>
+          <w:p>
+            <w:r>
+              <w:t>0.510</w:t>
+            </w:r>
+          </w:p>
+        </w:tc>
+      </w:tr>
+      <w:tr>
+        <w:tc>
+          <w:tcPr>
+            <w:tcW w:type="dxa" w:w="1994"/>
+          </w:tcPr>
+          <w:p>
+            <w:r>
+              <w:t>作者分组五折</w:t>
+            </w:r>
+          </w:p>
+        </w:tc>
+        <w:tc>
+          <w:tcPr>
+            <w:tcW w:type="dxa" w:w="1994"/>
+          </w:tcPr>
+          <w:p>
+            <w:r>
+              <w:t>结构化＋词典＋字符文本</w:t>
+            </w:r>
+          </w:p>
+        </w:tc>
+        <w:tc>
+          <w:tcPr>
+            <w:tcW w:type="dxa" w:w="1994"/>
+          </w:tcPr>
+          <w:p>
+            <w:r>
+              <w:t>0.7164</w:t>
+            </w:r>
+          </w:p>
+        </w:tc>
+        <w:tc>
+          <w:tcPr>
+            <w:tcW w:type="dxa" w:w="1994"/>
+          </w:tcPr>
+          <w:p>
+            <w:r>
+              <w:t>0.9711</w:t>
+            </w:r>
+          </w:p>
+        </w:tc>
+        <w:tc>
+          <w:tcPr>
+            <w:tcW w:type="dxa" w:w="1994"/>
+          </w:tcPr>
+          <w:p>
+            <w:r>
+              <w:t>0.511</w:t>
+            </w:r>
+          </w:p>
+        </w:tc>
+      </w:tr>
+    </w:tbl>
+    <w:p>
+      <w:r>
+        <w:t>结构化基线在两种划分中均明显优于训练集均值，说明现有作者与帖子元数据具有一定的样本外预测信息。时间留出中，加入词典和字符文本后MAE均未低于结构化基线；作者分组五折中，改进幅度则很小，且不同文本表示的排序并不一致。</w:t>
+      </w:r>
+    </w:p>
+    <w:p>
+      <w:r>
+        <w:t>两种划分面向不同对象，不宜把误差差距全部归因于单一因素；样本内固定效应R²也不与此表R²直接比较。</w:t>
+      </w:r>
+    </w:p>
+    <w:p>
+      <w:r>
+        <w:br w:type="page"/>
+      </w:r>
+    </w:p>
+    <w:p>
+      <w:pPr>
+        <w:pStyle w:val="Subtitle"/>
+      </w:pPr>
+      <w:r>
+        <w:t>19 · 预测误差与敏感性</w:t>
+      </w:r>
+    </w:p>
+    <w:p>
+      <w:pPr>
+        <w:pStyle w:val="Heading1"/>
+      </w:pPr>
+      <w:r>
+        <w:t>预测增益的不确定性与重复文本敏感性</w:t>
+      </w:r>
+    </w:p>
+    <w:p>
+      <w:r>
+        <w:drawing>
+          <wp:inline xmlns:a="http://schemas.openxmlformats.org/drawingml/2006/main" xmlns:pic="http://schemas.openxmlformats.org/drawingml/2006/picture">
+            <wp:extent cx="5940000" cy="1878411"/>
+            <wp:docPr id="10" name="Picture 10"/>
+            <wp:cNvGraphicFramePr>
+              <a:graphicFrameLocks noChangeAspect="1"/>
+            </wp:cNvGraphicFramePr>
+            <a:graphic>
+              <a:graphicData uri="http://schemas.openxmlformats.org/drawingml/2006/picture">
+                <pic:pic>
+                  <pic:nvPicPr>
+                    <pic:cNvPr id="0" name="11_prediction_uncertainty.png"/>
+                    <pic:cNvPicPr/>
+                  </pic:nvPicPr>
+                  <pic:blipFill>
+                    <a:blip r:embed="rId18"/>
+                    <a:stretch>
+                      <a:fillRect/>
+                    </a:stretch>
+                  </pic:blipFill>
+                  <pic:spPr>
+                    <a:xfrm>
+                      <a:off x="0" y="0"/>
+                      <a:ext cx="5940000" cy="1878411"/>
+                    </a:xfrm>
+                    <a:prstGeom prst="rect"/>
+                  </pic:spPr>
+                </pic:pic>
+              </a:graphicData>
+            </a:graphic>
+          </wp:inline>
+        </w:drawing>
+      </w:r>
+    </w:p>
+    <w:p>
+      <w:pPr>
+        <w:pStyle w:val="Caption"/>
+      </w:pPr>
+      <w:r>
+        <w:t>图10　增强模型相对基线的MAE差，负值表示误差降低。区间为2,000次按作者聚类重采样的95%百分位区间。</w:t>
+      </w:r>
+    </w:p>
+    <w:tbl>
+      <w:tblPr>
+        <w:tblStyle w:val="LightShading-Accent1"/>
+        <w:tblW w:type="auto" w:w="0"/>
+        <w:tblLook w:firstColumn="1" w:firstRow="1" w:lastColumn="0" w:lastRow="0" w:noHBand="0" w:noVBand="1" w:val="04A0"/>
+      </w:tblPr>
+      <w:tblGrid>
+        <w:gridCol w:w="2493"/>
+        <w:gridCol w:w="2493"/>
+        <w:gridCol w:w="2493"/>
+        <w:gridCol w:w="2493"/>
+      </w:tblGrid>
+      <w:tr>
+        <w:tc>
+          <w:tcPr>
+            <w:tcW w:type="dxa" w:w="2493"/>
+          </w:tcPr>
+          <w:p>
+            <w:r>
+              <w:t>划分</w:t>
+            </w:r>
+          </w:p>
+        </w:tc>
+        <w:tc>
+          <w:tcPr>
+            <w:tcW w:type="dxa" w:w="2493"/>
+          </w:tcPr>
+          <w:p>
+            <w:r>
+              <w:t>相对结构化基线</w:t>
+            </w:r>
+          </w:p>
+        </w:tc>
+        <w:tc>
+          <w:tcPr>
+            <w:tcW w:type="dxa" w:w="2493"/>
+          </w:tcPr>
+          <w:p>
+            <w:r>
+              <w:t>ΔMAE</w:t>
+            </w:r>
+          </w:p>
+        </w:tc>
+        <w:tc>
+          <w:tcPr>
+            <w:tcW w:type="dxa" w:w="2493"/>
+          </w:tcPr>
+          <w:p>
+            <w:r>
+              <w:t>95%区间</w:t>
+            </w:r>
+          </w:p>
+        </w:tc>
+      </w:tr>
+      <w:tr>
+        <w:tc>
+          <w:tcPr>
+            <w:tcW w:type="dxa" w:w="2493"/>
+          </w:tcPr>
+          <w:p>
+            <w:r>
+              <w:t>时间留出</w:t>
+            </w:r>
+          </w:p>
+        </w:tc>
+        <w:tc>
+          <w:tcPr>
+            <w:tcW w:type="dxa" w:w="2493"/>
+          </w:tcPr>
+          <w:p>
+            <w:r>
+              <w:t>词典</w:t>
+            </w:r>
+          </w:p>
+        </w:tc>
+        <w:tc>
+          <w:tcPr>
+            <w:tcW w:type="dxa" w:w="2493"/>
+          </w:tcPr>
+          <w:p>
+            <w:r>
+              <w:t>+0.0046</w:t>
+            </w:r>
+          </w:p>
+        </w:tc>
+        <w:tc>
+          <w:tcPr>
+            <w:tcW w:type="dxa" w:w="2493"/>
+          </w:tcPr>
+          <w:p>
+            <w:r>
+              <w:t>[-0.0001, +0.0098]</w:t>
+            </w:r>
+          </w:p>
+        </w:tc>
+      </w:tr>
+      <w:tr>
+        <w:tc>
+          <w:tcPr>
+            <w:tcW w:type="dxa" w:w="2493"/>
+          </w:tcPr>
+          <w:p>
+            <w:r>
+              <w:t>时间留出</w:t>
+            </w:r>
+          </w:p>
+        </w:tc>
+        <w:tc>
+          <w:tcPr>
+            <w:tcW w:type="dxa" w:w="2493"/>
+          </w:tcPr>
+          <w:p>
+            <w:r>
+              <w:t>词典＋字符文本</w:t>
+            </w:r>
+          </w:p>
+        </w:tc>
+        <w:tc>
+          <w:tcPr>
+            <w:tcW w:type="dxa" w:w="2493"/>
+          </w:tcPr>
+          <w:p>
+            <w:r>
+              <w:t>+0.0015</w:t>
+            </w:r>
+          </w:p>
+        </w:tc>
+        <w:tc>
+          <w:tcPr>
+            <w:tcW w:type="dxa" w:w="2493"/>
+          </w:tcPr>
+          <w:p>
+            <w:r>
+              <w:t>[-0.0060, +0.0093]</w:t>
+            </w:r>
+          </w:p>
+        </w:tc>
+      </w:tr>
+      <w:tr>
+        <w:tc>
+          <w:tcPr>
+            <w:tcW w:type="dxa" w:w="2493"/>
+          </w:tcPr>
+          <w:p>
+            <w:r>
+              <w:t>作者分组五折</w:t>
+            </w:r>
+          </w:p>
+        </w:tc>
+        <w:tc>
+          <w:tcPr>
+            <w:tcW w:type="dxa" w:w="2493"/>
+          </w:tcPr>
+          <w:p>
+            <w:r>
+              <w:t>词典</w:t>
+            </w:r>
+          </w:p>
+        </w:tc>
+        <w:tc>
+          <w:tcPr>
+            <w:tcW w:type="dxa" w:w="2493"/>
+          </w:tcPr>
+          <w:p>
+            <w:r>
+              <w:t>-0.0039</w:t>
+            </w:r>
+          </w:p>
+        </w:tc>
+        <w:tc>
+          <w:tcPr>
+            <w:tcW w:type="dxa" w:w="2493"/>
+          </w:tcPr>
+          <w:p>
+            <w:r>
+              <w:t>[-0.0112, +0.0027]</w:t>
+            </w:r>
+          </w:p>
+        </w:tc>
+      </w:tr>
+      <w:tr>
+        <w:tc>
+          <w:tcPr>
+            <w:tcW w:type="dxa" w:w="2493"/>
+          </w:tcPr>
+          <w:p>
+            <w:r>
+              <w:t>作者分组五折</w:t>
+            </w:r>
+          </w:p>
+        </w:tc>
+        <w:tc>
+          <w:tcPr>
+            <w:tcW w:type="dxa" w:w="2493"/>
+          </w:tcPr>
+          <w:p>
+            <w:r>
+              <w:t>词典＋字符文本</w:t>
+            </w:r>
+          </w:p>
+        </w:tc>
+        <w:tc>
+          <w:tcPr>
+            <w:tcW w:type="dxa" w:w="2493"/>
+          </w:tcPr>
+          <w:p>
+            <w:r>
+              <w:t>-0.0016</w:t>
+            </w:r>
+          </w:p>
+        </w:tc>
+        <w:tc>
+          <w:tcPr>
+            <w:tcW w:type="dxa" w:w="2493"/>
+          </w:tcPr>
+          <w:p>
+            <w:r>
+              <w:t>[-0.0118, +0.0075]</w:t>
+            </w:r>
+          </w:p>
+        </w:tc>
+      </w:tr>
+    </w:tbl>
+    <w:p>
+      <w:r>
+        <w:t>在固定的留出预测上，按作者保留全部帖子进行配对重采样，以兼顾同一作者内的相关性和各模型对同一帖的预测差异。所有比较区间均包含零，当前评估未显示明确的文本增益。区间没有重新训练模型，因此仅反映给定预测结果下的评估样本不确定性。</w:t>
+      </w:r>
+    </w:p>
+    <w:tbl>
+      <w:tblPr>
+        <w:tblStyle w:val="LightShading-Accent1"/>
+        <w:tblW w:type="auto" w:w="0"/>
+        <w:tblLook w:firstColumn="1" w:firstRow="1" w:lastColumn="0" w:lastRow="0" w:noHBand="0" w:noVBand="1" w:val="04A0"/>
+      </w:tblPr>
+      <w:tblGrid>
+        <w:gridCol w:w="1994"/>
+        <w:gridCol w:w="1994"/>
+        <w:gridCol w:w="1994"/>
+        <w:gridCol w:w="1994"/>
+        <w:gridCol w:w="1994"/>
+      </w:tblGrid>
+      <w:tr>
+        <w:tc>
+          <w:tcPr>
+            <w:tcW w:type="dxa" w:w="1994"/>
+          </w:tcPr>
+          <w:p>
+            <w:r>
+              <w:t>未见正文子集</w:t>
+            </w:r>
+          </w:p>
+        </w:tc>
+        <w:tc>
+          <w:tcPr>
+            <w:tcW w:type="dxa" w:w="1994"/>
+          </w:tcPr>
+          <w:p>
+            <w:r>
+              <w:t>N</w:t>
+            </w:r>
+          </w:p>
+        </w:tc>
+        <w:tc>
+          <w:tcPr>
+            <w:tcW w:type="dxa" w:w="1994"/>
+          </w:tcPr>
+          <w:p>
+            <w:r>
+              <w:t>结构化MAE</w:t>
+            </w:r>
+          </w:p>
+        </w:tc>
+        <w:tc>
+          <w:tcPr>
+            <w:tcW w:type="dxa" w:w="1994"/>
+          </w:tcPr>
+          <w:p>
+            <w:r>
+              <w:t>＋词典</w:t>
+            </w:r>
+          </w:p>
+        </w:tc>
+        <w:tc>
+          <w:tcPr>
+            <w:tcW w:type="dxa" w:w="1994"/>
+          </w:tcPr>
+          <w:p>
+            <w:r>
+              <w:t>＋字符文本</w:t>
+            </w:r>
+          </w:p>
+        </w:tc>
+      </w:tr>
+      <w:tr>
+        <w:tc>
+          <w:tcPr>
+            <w:tcW w:type="dxa" w:w="1994"/>
+          </w:tcPr>
+          <w:p>
+            <w:r>
+              <w:t>时间留出</w:t>
+            </w:r>
+          </w:p>
+        </w:tc>
+        <w:tc>
+          <w:tcPr>
+            <w:tcW w:type="dxa" w:w="1994"/>
+          </w:tcPr>
+          <w:p>
+            <w:r>
+              <w:t>692</w:t>
+            </w:r>
+          </w:p>
+        </w:tc>
+        <w:tc>
+          <w:tcPr>
+            <w:tcW w:type="dxa" w:w="1994"/>
+          </w:tcPr>
+          <w:p>
+            <w:r>
+              <w:t>0.6155</w:t>
+            </w:r>
+          </w:p>
+        </w:tc>
+        <w:tc>
+          <w:tcPr>
+            <w:tcW w:type="dxa" w:w="1994"/>
+          </w:tcPr>
+          <w:p>
+            <w:r>
+              <w:t>0.6253</w:t>
+            </w:r>
+          </w:p>
+        </w:tc>
+        <w:tc>
+          <w:tcPr>
+            <w:tcW w:type="dxa" w:w="1994"/>
+          </w:tcPr>
+          <w:p>
+            <w:r>
+              <w:t>0.6167</w:t>
+            </w:r>
+          </w:p>
+        </w:tc>
+      </w:tr>
+      <w:tr>
+        <w:tc>
+          <w:tcPr>
+            <w:tcW w:type="dxa" w:w="1994"/>
+          </w:tcPr>
+          <w:p>
+            <w:r>
+              <w:t>作者分组五折</w:t>
+            </w:r>
+          </w:p>
+        </w:tc>
+        <w:tc>
+          <w:tcPr>
+            <w:tcW w:type="dxa" w:w="1994"/>
+          </w:tcPr>
+          <w:p>
+            <w:r>
+              <w:t>2947</w:t>
+            </w:r>
+          </w:p>
+        </w:tc>
+        <w:tc>
+          <w:tcPr>
+            <w:tcW w:type="dxa" w:w="1994"/>
+          </w:tcPr>
+          <w:p>
+            <w:r>
+              <w:t>0.7522</w:t>
+            </w:r>
+          </w:p>
+        </w:tc>
+        <w:tc>
+          <w:tcPr>
+            <w:tcW w:type="dxa" w:w="1994"/>
+          </w:tcPr>
+          <w:p>
+            <w:r>
+              <w:t>0.7384</w:t>
+            </w:r>
+          </w:p>
+        </w:tc>
+        <w:tc>
+          <w:tcPr>
+            <w:tcW w:type="dxa" w:w="1994"/>
+          </w:tcPr>
+          <w:p>
+            <w:r>
+              <w:t>0.7447</w:t>
+            </w:r>
+          </w:p>
+        </w:tc>
+      </w:tr>
+    </w:tbl>
+    <w:p>
+      <w:r>
+        <w:t>另限制测试正文至少10个字符，且清理后文本不与该训练集中的正文完全相同，以检查重复模板是否影响判断。时间留出中，字符模型优于词典模型，但仍未优于结构化基线；作者分组中，字符模型未优于词典模型，模型排序未呈现一致优势。这一限制只能排除完全重复文本，不能消除近似改写或共同话题带来的相似性。</w:t>
+      </w:r>
+    </w:p>
+    <w:p>
+      <w:r>
+        <w:br w:type="page"/>
+      </w:r>
+    </w:p>
+    <w:p>
+      <w:pPr>
+        <w:pStyle w:val="Subtitle"/>
+      </w:pPr>
+      <w:r>
+        <w:t>20 · 文本测量核查</w:t>
       </w:r>
     </w:p>
     <w:p>
@@ -4302,7 +7080,7 @@
         <w:pStyle w:val="Subtitle"/>
       </w:pPr>
       <w:r>
-        <w:t>14 · 评论网络构建</w:t>
+        <w:t>21 · 评论网络构建</w:t>
       </w:r>
     </w:p>
     <w:p>
@@ -4541,7 +7319,7 @@
         <w:pStyle w:val="Subtitle"/>
       </w:pPr>
       <w:r>
-        <w:t>15 · 网络结构</w:t>
+        <w:t>22 · 网络结构</w:t>
       </w:r>
     </w:p>
     <w:p>
@@ -4557,7 +7335,7 @@
         <w:drawing>
           <wp:inline xmlns:a="http://schemas.openxmlformats.org/drawingml/2006/main" xmlns:pic="http://schemas.openxmlformats.org/drawingml/2006/picture">
             <wp:extent cx="5940000" cy="3293690"/>
-            <wp:docPr id="6" name="Picture 6"/>
+            <wp:docPr id="11" name="Picture 11"/>
             <wp:cNvGraphicFramePr>
               <a:graphicFrameLocks noChangeAspect="1"/>
             </wp:cNvGraphicFramePr>
@@ -4569,7 +7347,7 @@
                     <pic:cNvPicPr/>
                   </pic:nvPicPr>
                   <pic:blipFill>
-                    <a:blip r:embed="rId14"/>
+                    <a:blip r:embed="rId19"/>
                     <a:stretch>
                       <a:fillRect/>
                     </a:stretch>
@@ -4593,7 +7371,7 @@
         <w:pStyle w:val="Caption"/>
       </w:pPr>
       <w:r>
-        <w:t>图6　全部2932个有边节点、4069条有向边。为可读性省略箭头；金色为样本帖子作者，蓝色为其他参与者；节点大小按接收事件数的对数缩放。仅标注前5位接收者。</w:t>
+        <w:t>图11　全部2932个有边节点、4069条有向边。为可读性省略箭头；金色为样本帖子作者，蓝色为其他参与者；节点大小按接收事件数的对数缩放。仅标注前5位接收者。</w:t>
       </w:r>
     </w:p>
     <w:tbl>
@@ -4820,7 +7598,7 @@
         <w:pStyle w:val="Subtitle"/>
       </w:pPr>
       <w:r>
-        <w:t>16 · 互动集中度</w:t>
+        <w:t>23 · 互动集中度</w:t>
       </w:r>
     </w:p>
     <w:p>
@@ -4836,7 +7614,7 @@
         <w:drawing>
           <wp:inline xmlns:a="http://schemas.openxmlformats.org/drawingml/2006/main" xmlns:pic="http://schemas.openxmlformats.org/drawingml/2006/picture">
             <wp:extent cx="5940000" cy="1990050"/>
-            <wp:docPr id="7" name="Picture 7"/>
+            <wp:docPr id="12" name="Picture 12"/>
             <wp:cNvGraphicFramePr>
               <a:graphicFrameLocks noChangeAspect="1"/>
             </wp:cNvGraphicFramePr>
@@ -4848,7 +7626,7 @@
                     <pic:cNvPicPr/>
                   </pic:nvPicPr>
                   <pic:blipFill>
-                    <a:blip r:embed="rId15"/>
+                    <a:blip r:embed="rId20"/>
                     <a:stretch>
                       <a:fillRect/>
                     </a:stretch>
@@ -4872,7 +7650,7 @@
         <w:pStyle w:val="Caption"/>
       </w:pPr>
       <w:r>
-        <w:t>图7　接收事件前10位与累计接收分布。排序和占比均按边权，分母为11511次非自我互动事件；同一用户可重复产生事件。</w:t>
+        <w:t>图12　接收事件前10位与累计接收分布。排序和占比均按边权，分母为11511次非自我互动事件；同一用户可重复产生事件。</w:t>
       </w:r>
     </w:p>
     <w:p>
@@ -4913,7 +7691,485 @@
         <w:pStyle w:val="Subtitle"/>
       </w:pPr>
       <w:r>
-        <w:t>17 · 解释与建议</w:t>
+        <w:t>24 · 评论时序与角色</w:t>
+      </w:r>
+    </w:p>
+    <w:p>
+      <w:pPr>
+        <w:pStyle w:val="Heading1"/>
+      </w:pPr>
+      <w:r>
+        <w:t>多数明确回复由帖主发出</w:t>
+      </w:r>
+    </w:p>
+    <w:p>
+      <w:r>
+        <w:drawing>
+          <wp:inline xmlns:a="http://schemas.openxmlformats.org/drawingml/2006/main" xmlns:pic="http://schemas.openxmlformats.org/drawingml/2006/picture">
+            <wp:extent cx="5940000" cy="1935044"/>
+            <wp:docPr id="13" name="Picture 13"/>
+            <wp:cNvGraphicFramePr>
+              <a:graphicFrameLocks noChangeAspect="1"/>
+            </wp:cNvGraphicFramePr>
+            <a:graphic>
+              <a:graphicData uri="http://schemas.openxmlformats.org/drawingml/2006/picture">
+                <pic:pic>
+                  <pic:nvPicPr>
+                    <pic:cNvPr id="0" name="13_comment_timing_roles.png"/>
+                    <pic:cNvPicPr/>
+                  </pic:nvPicPr>
+                  <pic:blipFill>
+                    <a:blip r:embed="rId21"/>
+                    <a:stretch>
+                      <a:fillRect/>
+                    </a:stretch>
+                  </pic:blipFill>
+                  <pic:spPr>
+                    <a:xfrm>
+                      <a:off x="0" y="0"/>
+                      <a:ext cx="5940000" cy="1935044"/>
+                    </a:xfrm>
+                    <a:prstGeom prst="rect"/>
+                  </pic:spPr>
+                </pic:pic>
+              </a:graphicData>
+            </a:graphic>
+          </wp:inline>
+        </w:drawing>
+      </w:r>
+    </w:p>
+    <w:p>
+      <w:pPr>
+        <w:pStyle w:val="Caption"/>
+      </w:pPr>
+      <w:r>
+        <w:t>图13　已采集评论的发生时序，以及4,902次非自我明确回复的角色分布。时序分母为全部11,595条去重评论。</w:t>
+      </w:r>
+    </w:p>
+    <w:p>
+      <w:r>
+        <w:t>在已采集评论中，64.5%发生于发帖后24小时内，82.2%发生于7天内，间隔中位数为11.3小时。这些比例描述记录的相对时间分布；由于各帖评论覆盖情况未知，不能将其视为完整的评论增长曲线。</w:t>
+      </w:r>
+    </w:p>
+    <w:tbl>
+      <w:tblPr>
+        <w:tblStyle w:val="LightShading-Accent1"/>
+        <w:tblW w:type="auto" w:w="0"/>
+        <w:tblLook w:firstColumn="1" w:firstRow="1" w:lastColumn="0" w:lastRow="0" w:noHBand="0" w:noVBand="1" w:val="04A0"/>
+      </w:tblPr>
+      <w:tblGrid>
+        <w:gridCol w:w="3324"/>
+        <w:gridCol w:w="3324"/>
+        <w:gridCol w:w="3324"/>
+      </w:tblGrid>
+      <w:tr>
+        <w:tc>
+          <w:tcPr>
+            <w:tcW w:type="dxa" w:w="3324"/>
+          </w:tcPr>
+          <w:p>
+            <w:r>
+              <w:t>明确回复的角色</w:t>
+            </w:r>
+          </w:p>
+        </w:tc>
+        <w:tc>
+          <w:tcPr>
+            <w:tcW w:type="dxa" w:w="3324"/>
+          </w:tcPr>
+          <w:p>
+            <w:r>
+              <w:t>事件数</w:t>
+            </w:r>
+          </w:p>
+        </w:tc>
+        <w:tc>
+          <w:tcPr>
+            <w:tcW w:type="dxa" w:w="3324"/>
+          </w:tcPr>
+          <w:p>
+            <w:r>
+              <w:t>占明确回复比例</w:t>
+            </w:r>
+          </w:p>
+        </w:tc>
+      </w:tr>
+      <w:tr>
+        <w:tc>
+          <w:tcPr>
+            <w:tcW w:type="dxa" w:w="3324"/>
+          </w:tcPr>
+          <w:p>
+            <w:r>
+              <w:t>帖主回复其他用户</w:t>
+            </w:r>
+          </w:p>
+        </w:tc>
+        <w:tc>
+          <w:tcPr>
+            <w:tcW w:type="dxa" w:w="3324"/>
+          </w:tcPr>
+          <w:p>
+            <w:r>
+              <w:t>4,361</w:t>
+            </w:r>
+          </w:p>
+        </w:tc>
+        <w:tc>
+          <w:tcPr>
+            <w:tcW w:type="dxa" w:w="3324"/>
+          </w:tcPr>
+          <w:p>
+            <w:r>
+              <w:t>89.0%</w:t>
+            </w:r>
+          </w:p>
+        </w:tc>
+      </w:tr>
+      <w:tr>
+        <w:tc>
+          <w:tcPr>
+            <w:tcW w:type="dxa" w:w="3324"/>
+          </w:tcPr>
+          <w:p>
+            <w:r>
+              <w:t>其他用户回复帖主</w:t>
+            </w:r>
+          </w:p>
+        </w:tc>
+        <w:tc>
+          <w:tcPr>
+            <w:tcW w:type="dxa" w:w="3324"/>
+          </w:tcPr>
+          <w:p>
+            <w:r>
+              <w:t>444</w:t>
+            </w:r>
+          </w:p>
+        </w:tc>
+        <w:tc>
+          <w:tcPr>
+            <w:tcW w:type="dxa" w:w="3324"/>
+          </w:tcPr>
+          <w:p>
+            <w:r>
+              <w:t>9.1%</w:t>
+            </w:r>
+          </w:p>
+        </w:tc>
+      </w:tr>
+      <w:tr>
+        <w:tc>
+          <w:tcPr>
+            <w:tcW w:type="dxa" w:w="3324"/>
+          </w:tcPr>
+          <w:p>
+            <w:r>
+              <w:t>其他用户彼此回复</w:t>
+            </w:r>
+          </w:p>
+        </w:tc>
+        <w:tc>
+          <w:tcPr>
+            <w:tcW w:type="dxa" w:w="3324"/>
+          </w:tcPr>
+          <w:p>
+            <w:r>
+              <w:t>97</w:t>
+            </w:r>
+          </w:p>
+        </w:tc>
+        <w:tc>
+          <w:tcPr>
+            <w:tcW w:type="dxa" w:w="3324"/>
+          </w:tcPr>
+          <w:p>
+            <w:r>
+              <w:t>2.0%</w:t>
+            </w:r>
+          </w:p>
+        </w:tc>
+      </w:tr>
+    </w:tbl>
+    <w:p>
+      <w:r>
+        <w:t>帖主发出的回复占89.0%，其他用户彼此回复仅占2.0%。这表明，当前样本的显式回复主要表现为围绕帖主展开的交流。结合根评论指向帖主的建边方式，原网络的互惠性应更多从这种回应结构理解，而非直接解释为用户间普遍存在的横向交流。</w:t>
+      </w:r>
+    </w:p>
+    <w:p>
+      <w:r>
+        <w:t>有781条回复的直接被回复评论未被采集，但其replyUserId可用，且parentId均能关联到根评论；角色划分因此使用明确用户指向，线程分析使用parentId。</w:t>
+      </w:r>
+    </w:p>
+    <w:p>
+      <w:r>
+        <w:br w:type="page"/>
+      </w:r>
+    </w:p>
+    <w:p>
+      <w:pPr>
+        <w:pStyle w:val="Subtitle"/>
+      </w:pPr>
+      <w:r>
+        <w:t>25 · 观察窗口敏感性</w:t>
+      </w:r>
+    </w:p>
+    <w:p>
+      <w:pPr>
+        <w:pStyle w:val="Heading1"/>
+      </w:pPr>
+      <w:r>
+        <w:t>首周网络的互惠性更高，集中度略低</w:t>
+      </w:r>
+    </w:p>
+    <w:tbl>
+      <w:tblPr>
+        <w:tblStyle w:val="LightShading-Accent1"/>
+        <w:tblW w:type="auto" w:w="0"/>
+        <w:tblLook w:firstColumn="1" w:firstRow="1" w:lastColumn="0" w:lastRow="0" w:noHBand="0" w:noVBand="1" w:val="04A0"/>
+      </w:tblPr>
+      <w:tblGrid>
+        <w:gridCol w:w="1662"/>
+        <w:gridCol w:w="1662"/>
+        <w:gridCol w:w="1662"/>
+        <w:gridCol w:w="1662"/>
+        <w:gridCol w:w="1662"/>
+        <w:gridCol w:w="1662"/>
+      </w:tblGrid>
+      <w:tr>
+        <w:tc>
+          <w:tcPr>
+            <w:tcW w:type="dxa" w:w="1662"/>
+          </w:tcPr>
+          <w:p>
+            <w:r>
+              <w:t>评论窗口</w:t>
+            </w:r>
+          </w:p>
+        </w:tc>
+        <w:tc>
+          <w:tcPr>
+            <w:tcW w:type="dxa" w:w="1662"/>
+          </w:tcPr>
+          <w:p>
+            <w:r>
+              <w:t>事件数</w:t>
+            </w:r>
+          </w:p>
+        </w:tc>
+        <w:tc>
+          <w:tcPr>
+            <w:tcW w:type="dxa" w:w="1662"/>
+          </w:tcPr>
+          <w:p>
+            <w:r>
+              <w:t>节点数</w:t>
+            </w:r>
+          </w:p>
+        </w:tc>
+        <w:tc>
+          <w:tcPr>
+            <w:tcW w:type="dxa" w:w="1662"/>
+          </w:tcPr>
+          <w:p>
+            <w:r>
+              <w:t>有向边</w:t>
+            </w:r>
+          </w:p>
+        </w:tc>
+        <w:tc>
+          <w:tcPr>
+            <w:tcW w:type="dxa" w:w="1662"/>
+          </w:tcPr>
+          <w:p>
+            <w:r>
+              <w:t>互惠率</w:t>
+            </w:r>
+          </w:p>
+        </w:tc>
+        <w:tc>
+          <w:tcPr>
+            <w:tcW w:type="dxa" w:w="1662"/>
+          </w:tcPr>
+          <w:p>
+            <w:r>
+              <w:t>前10接收占比</w:t>
+            </w:r>
+          </w:p>
+        </w:tc>
+      </w:tr>
+      <w:tr>
+        <w:tc>
+          <w:tcPr>
+            <w:tcW w:type="dxa" w:w="1662"/>
+          </w:tcPr>
+          <w:p>
+            <w:r>
+              <w:t>全部已采集互动</w:t>
+            </w:r>
+          </w:p>
+        </w:tc>
+        <w:tc>
+          <w:tcPr>
+            <w:tcW w:type="dxa" w:w="1662"/>
+          </w:tcPr>
+          <w:p>
+            <w:r>
+              <w:t>11,511</w:t>
+            </w:r>
+          </w:p>
+        </w:tc>
+        <w:tc>
+          <w:tcPr>
+            <w:tcW w:type="dxa" w:w="1662"/>
+          </w:tcPr>
+          <w:p>
+            <w:r>
+              <w:t>2,932</w:t>
+            </w:r>
+          </w:p>
+        </w:tc>
+        <w:tc>
+          <w:tcPr>
+            <w:tcW w:type="dxa" w:w="1662"/>
+          </w:tcPr>
+          <w:p>
+            <w:r>
+              <w:t>4,069</w:t>
+            </w:r>
+          </w:p>
+        </w:tc>
+        <w:tc>
+          <w:tcPr>
+            <w:tcW w:type="dxa" w:w="1662"/>
+          </w:tcPr>
+          <w:p>
+            <w:r>
+              <w:t>49.6%</w:t>
+            </w:r>
+          </w:p>
+        </w:tc>
+        <w:tc>
+          <w:tcPr>
+            <w:tcW w:type="dxa" w:w="1662"/>
+          </w:tcPr>
+          <w:p>
+            <w:r>
+              <w:t>54.0%</w:t>
+            </w:r>
+          </w:p>
+        </w:tc>
+      </w:tr>
+      <w:tr>
+        <w:tc>
+          <w:tcPr>
+            <w:tcW w:type="dxa" w:w="1662"/>
+          </w:tcPr>
+          <w:p>
+            <w:r>
+              <w:t>发帖后7天内</w:t>
+            </w:r>
+          </w:p>
+        </w:tc>
+        <w:tc>
+          <w:tcPr>
+            <w:tcW w:type="dxa" w:w="1662"/>
+          </w:tcPr>
+          <w:p>
+            <w:r>
+              <w:t>9,451</w:t>
+            </w:r>
+          </w:p>
+        </w:tc>
+        <w:tc>
+          <w:tcPr>
+            <w:tcW w:type="dxa" w:w="1662"/>
+          </w:tcPr>
+          <w:p>
+            <w:r>
+              <w:t>1,376</w:t>
+            </w:r>
+          </w:p>
+        </w:tc>
+        <w:tc>
+          <w:tcPr>
+            <w:tcW w:type="dxa" w:w="1662"/>
+          </w:tcPr>
+          <w:p>
+            <w:r>
+              <w:t>2,278</w:t>
+            </w:r>
+          </w:p>
+        </w:tc>
+        <w:tc>
+          <w:tcPr>
+            <w:tcW w:type="dxa" w:w="1662"/>
+          </w:tcPr>
+          <w:p>
+            <w:r>
+              <w:t>74.1%</w:t>
+            </w:r>
+          </w:p>
+        </w:tc>
+        <w:tc>
+          <w:tcPr>
+            <w:tcW w:type="dxa" w:w="1662"/>
+          </w:tcPr>
+          <w:p>
+            <w:r>
+              <w:t>48.3%</w:t>
+            </w:r>
+          </w:p>
+        </w:tc>
+      </w:tr>
+    </w:tbl>
+    <w:p>
+      <w:r>
+        <w:t>将每帖发出后的7天作为统一的相对时间截点，得到9,451次非自我互动、1,376个有边节点和2,278条边。相比使用全部已采集互动，首周网络的互惠率由49.6%提高至74.1%，前10位账号的接收占比由54.0%降至48.3%。这表明，晚期评论的纳入会改变网络的规模与结构描述。</w:t>
+      </w:r>
+    </w:p>
+    <w:p>
+      <w:pPr>
+        <w:pStyle w:val="Heading2"/>
+      </w:pPr>
+      <w:r>
+        <w:t>根评论线程中的帖主参与</w:t>
+      </w:r>
+    </w:p>
+    <w:p>
+      <w:r>
+        <w:t>共有6,609条外来根评论；其中3,770个线程内观察到帖主参与回复，占57.0%。在这些有帖主回复的线程中，首次帖主回复距离根评论的中位间隔为2.05小时。这里的参与比例是采集记录中的观测比例，未见回复的线程也可能存在未采集的回应。</w:t>
+      </w:r>
+    </w:p>
+    <w:p>
+      <w:pPr>
+        <w:pStyle w:val="Heading2"/>
+      </w:pPr>
+      <w:r>
+        <w:t>对原网络结果的补充解释</w:t>
+      </w:r>
+    </w:p>
+    <w:p>
+      <w:r>
+        <w:t>两种窗口的节点和边集合不同，指标差异不代表同一群体的互惠行为发生了时间趋势。首周截点减少了跨度极长的晚期评论，却无法补回未采集记录，也不能证明每个帖子都获得了完整的7天观察。网络结论因此应同时注明评论窗口、采集边界和角色构成。</w:t>
+      </w:r>
+    </w:p>
+    <w:p>
+      <w:r>
+        <w:t>窗口指标见extension_window_networks.csv。回复时延仅在已观测到帖主参与的线程中计算，未将缺失回应当作无限等待或零时延。</w:t>
+      </w:r>
+    </w:p>
+    <w:p>
+      <w:r>
+        <w:br w:type="page"/>
+      </w:r>
+    </w:p>
+    <w:p>
+      <w:pPr>
+        <w:pStyle w:val="Subtitle"/>
+      </w:pPr>
+      <w:r>
+        <w:t>26 · 解释与建议</w:t>
       </w:r>
     </w:p>
     <w:p>
@@ -5064,6 +8320,19 @@
         </w:tc>
       </w:tr>
     </w:tbl>
+    <w:p>
+      <w:pPr>
+        <w:pStyle w:val="Heading2"/>
+      </w:pPr>
+      <w:r>
+        <w:t>扩展实验的综合判断</w:t>
+      </w:r>
+    </w:p>
+    <w:p>
+      <w:r>
+        <w:t>字面词典、潜在主题和字符文本从不同层面表示内容，结果均未提供稳定、明确的点赞增量证据。逐作者剔除说明积极表达的OLS负向点估计并非单一作者造成，但这一结果仍未通过原多重检验和计数模型比较。评论角色与时间窗口分析则表明，互动结构的解释需要考虑帖主回应及晚期评论的纳入范围。</w:t>
+      </w:r>
+    </w:p>
     <w:p>
       <w:pPr>
         <w:pStyle w:val="Heading2"/>
@@ -5134,7 +8403,7 @@
         <w:pStyle w:val="Subtitle"/>
       </w:pPr>
       <w:r>
-        <w:t>18 · 参考资料与复现</w:t>
+        <w:t>27 · 参考资料与复现</w:t>
       </w:r>
     </w:p>
     <w:p>
@@ -5170,6 +8439,18 @@
         <w:t>[5] 课程材料《Social Network Influencial.pdf》：第30页入度/出度，第35页中心性与影响力的解释限制。</w:t>
         <w:br/>
         <w:t>[6] 课程数据《KeepData_dictionary.pdf》与两份原始CSV；字段字典和数据原样保留在提交包。</w:t>
+        <w:br/>
+        <w:t>[7] scikit-learn官方文档：NMF（1.5系列），用于非负矩阵分解与主题提取。</w:t>
+        <w:br/>
+        <w:t>官方链接</w:t>
+        <w:br/>
+        <w:t>。访问：2026-10-17。</w:t>
+        <w:br/>
+        <w:t>[8] scikit-learn官方文档：GroupKFold及交叉验证（1.5系列），用于按作者隔离训练与测试。</w:t>
+        <w:br/>
+        <w:t>官方链接</w:t>
+        <w:br/>
+        <w:t>。访问：2026-10-17。</w:t>
       </w:r>
     </w:p>
     <w:p>
@@ -5205,7 +8486,7 @@
         <w:pStyle w:val="Subtitle"/>
       </w:pPr>
       <w:r>
-        <w:t>19 · 附录</w:t>
+        <w:t>28 · 附录</w:t>
       </w:r>
     </w:p>
     <w:p>
@@ -5287,7 +8568,7 @@
           </w:tcPr>
           <w:p>
             <w:r>
-              <w:t>报告02—07及代码、Notebook</w:t>
+              <w:t>数据、描述统计与文本分析部分；代码及Notebook</w:t>
             </w:r>
           </w:p>
         </w:tc>
@@ -5309,7 +8590,7 @@
           </w:tcPr>
           <w:p>
             <w:r>
-              <w:t>报告05—13；post_features.csv与回归结果</w:t>
+              <w:t>文本编码、主题与回归部分；特征表及模型结果</w:t>
             </w:r>
           </w:p>
         </w:tc>
@@ -5353,7 +8634,7 @@
           </w:tcPr>
           <w:p>
             <w:r>
-              <w:t>报告10—17；明确不显著结果及局限</w:t>
+              <w:t>回归、预测及网络结果的解释与讨论</w:t>
             </w:r>
           </w:p>
         </w:tc>
@@ -5375,7 +8656,7 @@
           </w:tcPr>
           <w:p>
             <w:r>
-              <w:t>16页PPTX、逐页讲稿及建议分工表</w:t>
+              <w:t>23页PPTX、逐页讲稿及建议分工表</w:t>
             </w:r>
           </w:p>
         </w:tc>
@@ -5503,7 +8784,7 @@
           </w:tcPr>
           <w:p>
             <w:r>
-              <w:t>数据清洗、描述统计与文本编码核查</w:t>
+              <w:t>数据清洗、文本编码与主题分析</w:t>
             </w:r>
           </w:p>
         </w:tc>
@@ -5513,7 +8794,7 @@
           </w:tcPr>
           <w:p>
             <w:r>
-              <w:t>4—7</w:t>
+              <w:t>4—10</w:t>
             </w:r>
           </w:p>
         </w:tc>
@@ -5535,7 +8816,7 @@
           </w:tcPr>
           <w:p>
             <w:r>
-              <w:t>回归模型、推断与稳健性检验</w:t>
+              <w:t>回归、样本外预测与稳健性检验</w:t>
             </w:r>
           </w:p>
         </w:tc>
@@ -5545,7 +8826,7 @@
           </w:tcPr>
           <w:p>
             <w:r>
-              <w:t>8—11</w:t>
+              <w:t>11—17</w:t>
             </w:r>
           </w:p>
         </w:tc>
@@ -5567,7 +8848,7 @@
           </w:tcPr>
           <w:p>
             <w:r>
-              <w:t>网络分析、建议与局限</w:t>
+              <w:t>网络、评论时序、建议与局限</w:t>
             </w:r>
           </w:p>
         </w:tc>
@@ -5577,7 +8858,7 @@
           </w:tcPr>
           <w:p>
             <w:r>
-              <w:t>12—16</w:t>
+              <w:t>18—23</w:t>
             </w:r>
           </w:p>
         </w:tc>

</xml_diff>

<commit_message>
Add linked table of contents to analysis report
</commit_message>
<xml_diff>
--- a/分析报告_可编辑.docx
+++ b/分析报告_可编辑.docx
@@ -14,9 +14,11 @@
       <w:pPr>
         <w:pStyle w:val="Title"/>
       </w:pPr>
+      <w:bookmarkStart w:id="1" w:name="page_1"/>
       <w:r>
         <w:t>什么样的健身分享更容易获得点赞？</w:t>
       </w:r>
+      <w:bookmarkEnd w:id="1"/>
     </w:p>
     <w:p>
       <w:r>
@@ -80,6 +82,701 @@
         <w:pStyle w:val="Subtitle"/>
       </w:pPr>
       <w:r>
+        <w:t>CONTENTS · 目录</w:t>
+      </w:r>
+    </w:p>
+    <w:p>
+      <w:pPr>
+        <w:pStyle w:val="Title"/>
+      </w:pPr>
+      <w:bookmarkStart w:id="2" w:name="page_2"/>
+      <w:r>
+        <w:t>目录</w:t>
+      </w:r>
+      <w:bookmarkEnd w:id="2"/>
+    </w:p>
+    <w:p>
+      <w:pPr>
+        <w:tabs>
+          <w:tab w:pos="9638" w:val="right" w:leader="dot"/>
+        </w:tabs>
+        <w:spacing w:after="0" w:lineRule="exact" w:line="400"/>
+      </w:pPr>
+      <w:hyperlink w:anchor="page_3">
+        <w:r>
+          <w:rPr>
+            <w:color w:val="243746"/>
+          </w:rPr>
+          <w:t>01  健身社区中的内容表达与互动反馈</w:t>
+        </w:r>
+      </w:hyperlink>
+      <w:r>
+        <w:tab/>
+      </w:r>
+      <w:fldSimple w:instr="PAGEREF page_3 \h" w:dirty="true">
+        <w:r>
+          <w:t>3</w:t>
+        </w:r>
+      </w:fldSimple>
+    </w:p>
+    <w:p>
+      <w:pPr>
+        <w:tabs>
+          <w:tab w:pos="9638" w:val="right" w:leader="dot"/>
+        </w:tabs>
+        <w:spacing w:after="0" w:lineRule="exact" w:line="400"/>
+      </w:pPr>
+      <w:hyperlink w:anchor="page_4">
+        <w:r>
+          <w:rPr>
+            <w:color w:val="243746"/>
+          </w:rPr>
+          <w:t>02  数据来源、样本范围与清洗</w:t>
+        </w:r>
+      </w:hyperlink>
+      <w:r>
+        <w:tab/>
+      </w:r>
+      <w:fldSimple w:instr="PAGEREF page_4 \h" w:dirty="true">
+        <w:r>
+          <w:t>4</w:t>
+        </w:r>
+      </w:fldSimple>
+    </w:p>
+    <w:p>
+      <w:pPr>
+        <w:tabs>
+          <w:tab w:pos="9638" w:val="right" w:leader="dot"/>
+        </w:tabs>
+        <w:spacing w:after="0" w:lineRule="exact" w:line="400"/>
+      </w:pPr>
+      <w:hyperlink w:anchor="page_5">
+        <w:r>
+          <w:rPr>
+            <w:color w:val="243746"/>
+          </w:rPr>
+          <w:t>03  正文缺失与内容形式、作者均有关联</w:t>
+        </w:r>
+      </w:hyperlink>
+      <w:r>
+        <w:tab/>
+      </w:r>
+      <w:fldSimple w:instr="PAGEREF page_5 \h" w:dirty="true">
+        <w:r>
+          <w:t>5</w:t>
+        </w:r>
+      </w:fldSimple>
+    </w:p>
+    <w:p>
+      <w:pPr>
+        <w:tabs>
+          <w:tab w:pos="9638" w:val="right" w:leader="dot"/>
+        </w:tabs>
+        <w:spacing w:after="0" w:lineRule="exact" w:line="400"/>
+      </w:pPr>
+      <w:hyperlink w:anchor="page_6">
+        <w:r>
+          <w:rPr>
+            <w:color w:val="243746"/>
+          </w:rPr>
+          <w:t>04  点赞分布长尾明显，均值高于中位数</w:t>
+        </w:r>
+      </w:hyperlink>
+      <w:r>
+        <w:tab/>
+      </w:r>
+      <w:fldSimple w:instr="PAGEREF page_6 \h" w:dirty="true">
+        <w:r>
+          <w:t>6</w:t>
+        </w:r>
+      </w:fldSimple>
+    </w:p>
+    <w:p>
+      <w:pPr>
+        <w:tabs>
+          <w:tab w:pos="9638" w:val="right" w:leader="dot"/>
+        </w:tabs>
+        <w:spacing w:after="0" w:lineRule="exact" w:line="400"/>
+      </w:pPr>
+      <w:hyperlink w:anchor="page_7">
+        <w:r>
+          <w:rPr>
+            <w:color w:val="243746"/>
+          </w:rPr>
+          <w:t>05  不同内容形式的点赞表现存在差异</w:t>
+        </w:r>
+      </w:hyperlink>
+      <w:r>
+        <w:tab/>
+      </w:r>
+      <w:fldSimple w:instr="PAGEREF page_7 \h" w:dirty="true">
+        <w:r>
+          <w:t>7</w:t>
+        </w:r>
+      </w:fldSimple>
+    </w:p>
+    <w:p>
+      <w:pPr>
+        <w:tabs>
+          <w:tab w:pos="9638" w:val="right" w:leader="dot"/>
+        </w:tabs>
+        <w:spacing w:after="0" w:lineRule="exact" w:line="400"/>
+      </w:pPr>
+      <w:hyperlink w:anchor="page_8">
+        <w:r>
+          <w:rPr>
+            <w:color w:val="243746"/>
+          </w:rPr>
+          <w:t>06  正文预处理与变量构建</w:t>
+        </w:r>
+      </w:hyperlink>
+      <w:r>
+        <w:tab/>
+      </w:r>
+      <w:fldSimple w:instr="PAGEREF page_8 \h" w:dirty="true">
+        <w:r>
+          <w:t>8</w:t>
+        </w:r>
+      </w:fldSimple>
+    </w:p>
+    <w:p>
+      <w:pPr>
+        <w:tabs>
+          <w:tab w:pos="9638" w:val="right" w:leader="dot"/>
+        </w:tabs>
+        <w:spacing w:after="0" w:lineRule="exact" w:line="400"/>
+      </w:pPr>
+      <w:hyperlink w:anchor="page_9">
+        <w:r>
+          <w:rPr>
+            <w:color w:val="243746"/>
+          </w:rPr>
+          <w:t>07  词典编码规则及其解释范围</w:t>
+        </w:r>
+      </w:hyperlink>
+      <w:r>
+        <w:tab/>
+      </w:r>
+      <w:fldSimple w:instr="PAGEREF page_9 \h" w:dirty="true">
+        <w:r>
+          <w:t>9</w:t>
+        </w:r>
+      </w:fldSimple>
+    </w:p>
+    <w:p>
+      <w:pPr>
+        <w:tabs>
+          <w:tab w:pos="9638" w:val="right" w:leader="dot"/>
+        </w:tabs>
+        <w:spacing w:after="0" w:lineRule="exact" w:line="400"/>
+      </w:pPr>
+      <w:hyperlink w:anchor="page_10">
+        <w:r>
+          <w:rPr>
+            <w:color w:val="243746"/>
+          </w:rPr>
+          <w:t>08  文本特征的分布与作者覆盖</w:t>
+        </w:r>
+      </w:hyperlink>
+      <w:r>
+        <w:tab/>
+      </w:r>
+      <w:fldSimple w:instr="PAGEREF page_10 \h" w:dirty="true">
+        <w:r>
+          <w:t>10</w:t>
+        </w:r>
+      </w:fldSimple>
+    </w:p>
+    <w:p>
+      <w:pPr>
+        <w:tabs>
+          <w:tab w:pos="9638" w:val="right" w:leader="dot"/>
+        </w:tabs>
+        <w:spacing w:after="0" w:lineRule="exact" w:line="400"/>
+      </w:pPr>
+      <w:hyperlink w:anchor="page_11">
+        <w:r>
+          <w:rPr>
+            <w:color w:val="243746"/>
+          </w:rPr>
+          <w:t>09  TF-IDF与非负矩阵分解的主题分析</w:t>
+        </w:r>
+      </w:hyperlink>
+      <w:r>
+        <w:tab/>
+      </w:r>
+      <w:fldSimple w:instr="PAGEREF page_11 \h" w:dirty="true">
+        <w:r>
+          <w:t>11</w:t>
+        </w:r>
+      </w:fldSimple>
+    </w:p>
+    <w:p>
+      <w:pPr>
+        <w:tabs>
+          <w:tab w:pos="9638" w:val="right" w:leader="dot"/>
+        </w:tabs>
+        <w:spacing w:after="0" w:lineRule="exact" w:line="400"/>
+      </w:pPr>
+      <w:hyperlink w:anchor="page_12">
+        <w:r>
+          <w:rPr>
+            <w:color w:val="243746"/>
+          </w:rPr>
+          <w:t>10  主题分布及其作者集中度</w:t>
+        </w:r>
+      </w:hyperlink>
+      <w:r>
+        <w:tab/>
+      </w:r>
+      <w:fldSimple w:instr="PAGEREF page_12 \h" w:dirty="true">
+        <w:r>
+          <w:t>12</w:t>
+        </w:r>
+      </w:fldSimple>
+    </w:p>
+    <w:p>
+      <w:pPr>
+        <w:tabs>
+          <w:tab w:pos="9638" w:val="right" w:leader="dot"/>
+        </w:tabs>
+        <w:spacing w:after="0" w:lineRule="exact" w:line="400"/>
+      </w:pPr>
+      <w:hyperlink w:anchor="page_13">
+        <w:r>
+          <w:rPr>
+            <w:color w:val="243746"/>
+          </w:rPr>
+          <w:t>11  从组间差异到作者内比较</w:t>
+        </w:r>
+      </w:hyperlink>
+      <w:r>
+        <w:tab/>
+      </w:r>
+      <w:fldSimple w:instr="PAGEREF page_13 \h" w:dirty="true">
+        <w:r>
+          <w:t>13</w:t>
+        </w:r>
+      </w:fldSimple>
+    </w:p>
+    <w:p>
+      <w:pPr>
+        <w:tabs>
+          <w:tab w:pos="9638" w:val="right" w:leader="dot"/>
+        </w:tabs>
+        <w:spacing w:after="0" w:lineRule="exact" w:line="400"/>
+      </w:pPr>
+      <w:hyperlink w:anchor="page_14">
+        <w:r>
+          <w:rPr>
+            <w:color w:val="243746"/>
+          </w:rPr>
+          <w:t>12  固定效应模型与统计推断</w:t>
+        </w:r>
+      </w:hyperlink>
+      <w:r>
+        <w:tab/>
+      </w:r>
+      <w:fldSimple w:instr="PAGEREF page_14 \h" w:dirty="true">
+        <w:r>
+          <w:t>14</w:t>
+        </w:r>
+      </w:fldSimple>
+    </w:p>
+    <w:p>
+      <w:pPr>
+        <w:tabs>
+          <w:tab w:pos="9638" w:val="right" w:leader="dot"/>
+        </w:tabs>
+        <w:spacing w:after="0" w:lineRule="exact" w:line="400"/>
+      </w:pPr>
+      <w:hyperlink w:anchor="page_15">
+        <w:r>
+          <w:rPr>
+            <w:color w:val="243746"/>
+          </w:rPr>
+          <w:t>13  核心文本特征的关联证据有限</w:t>
+        </w:r>
+      </w:hyperlink>
+      <w:r>
+        <w:tab/>
+      </w:r>
+      <w:fldSimple w:instr="PAGEREF page_15 \h" w:dirty="true">
+        <w:r>
+          <w:t>15</w:t>
+        </w:r>
+      </w:fldSimple>
+    </w:p>
+    <w:p>
+      <w:pPr>
+        <w:tabs>
+          <w:tab w:pos="9638" w:val="right" w:leader="dot"/>
+        </w:tabs>
+        <w:spacing w:after="0" w:lineRule="exact" w:line="400"/>
+      </w:pPr>
+      <w:hyperlink w:anchor="page_16">
+        <w:r>
+          <w:rPr>
+            <w:color w:val="243746"/>
+          </w:rPr>
+          <w:t>14  回归系数的量级与解释</w:t>
+        </w:r>
+      </w:hyperlink>
+      <w:r>
+        <w:tab/>
+      </w:r>
+      <w:fldSimple w:instr="PAGEREF page_16 \h" w:dirty="true">
+        <w:r>
+          <w:t>16</w:t>
+        </w:r>
+      </w:fldSimple>
+    </w:p>
+    <w:p>
+      <w:pPr>
+        <w:tabs>
+          <w:tab w:pos="9638" w:val="right" w:leader="dot"/>
+        </w:tabs>
+        <w:spacing w:after="0" w:lineRule="exact" w:line="400"/>
+      </w:pPr>
+      <w:hyperlink w:anchor="page_17">
+        <w:r>
+          <w:rPr>
+            <w:color w:val="243746"/>
+          </w:rPr>
+          <w:t>15  积极表达的负关联对模型设定敏感</w:t>
+        </w:r>
+      </w:hyperlink>
+      <w:r>
+        <w:tab/>
+      </w:r>
+      <w:fldSimple w:instr="PAGEREF page_17 \h" w:dirty="true">
+        <w:r>
+          <w:t>17</w:t>
+        </w:r>
+      </w:fldSimple>
+    </w:p>
+    <w:p>
+      <w:pPr>
+        <w:tabs>
+          <w:tab w:pos="9638" w:val="right" w:leader="dot"/>
+        </w:tabs>
+        <w:spacing w:after="0" w:lineRule="exact" w:line="400"/>
+      </w:pPr>
+      <w:hyperlink w:anchor="page_18">
+        <w:r>
+          <w:rPr>
+            <w:color w:val="243746"/>
+          </w:rPr>
+          <w:t>16  逐作者剔除后的系数敏感性</w:t>
+        </w:r>
+      </w:hyperlink>
+      <w:r>
+        <w:tab/>
+      </w:r>
+      <w:fldSimple w:instr="PAGEREF page_18 \h" w:dirty="true">
+        <w:r>
+          <w:t>18</w:t>
+        </w:r>
+      </w:fldSimple>
+    </w:p>
+    <w:p>
+      <w:pPr>
+        <w:tabs>
+          <w:tab w:pos="9638" w:val="right" w:leader="dot"/>
+        </w:tabs>
+        <w:spacing w:after="0" w:lineRule="exact" w:line="400"/>
+      </w:pPr>
+      <w:hyperlink w:anchor="page_19">
+        <w:r>
+          <w:rPr>
+            <w:color w:val="243746"/>
+          </w:rPr>
+          <w:t>17  文本特征能否改善样本外预测？</w:t>
+        </w:r>
+      </w:hyperlink>
+      <w:r>
+        <w:tab/>
+      </w:r>
+      <w:fldSimple w:instr="PAGEREF page_19 \h" w:dirty="true">
+        <w:r>
+          <w:t>19</w:t>
+        </w:r>
+      </w:fldSimple>
+    </w:p>
+    <w:p>
+      <w:pPr>
+        <w:tabs>
+          <w:tab w:pos="9638" w:val="right" w:leader="dot"/>
+        </w:tabs>
+        <w:spacing w:after="0" w:lineRule="exact" w:line="400"/>
+      </w:pPr>
+      <w:hyperlink w:anchor="page_20">
+        <w:r>
+          <w:rPr>
+            <w:color w:val="243746"/>
+          </w:rPr>
+          <w:t>18  留出预测中的文本增益有限</w:t>
+        </w:r>
+      </w:hyperlink>
+      <w:r>
+        <w:tab/>
+      </w:r>
+      <w:fldSimple w:instr="PAGEREF page_20 \h" w:dirty="true">
+        <w:r>
+          <w:t>20</w:t>
+        </w:r>
+      </w:fldSimple>
+    </w:p>
+    <w:p>
+      <w:pPr>
+        <w:tabs>
+          <w:tab w:pos="9638" w:val="right" w:leader="dot"/>
+        </w:tabs>
+        <w:spacing w:after="0" w:lineRule="exact" w:line="400"/>
+      </w:pPr>
+      <w:hyperlink w:anchor="page_21">
+        <w:r>
+          <w:rPr>
+            <w:color w:val="243746"/>
+          </w:rPr>
+          <w:t>19  预测增益的不确定性与重复文本敏感性</w:t>
+        </w:r>
+      </w:hyperlink>
+      <w:r>
+        <w:tab/>
+      </w:r>
+      <w:fldSimple w:instr="PAGEREF page_21 \h" w:dirty="true">
+        <w:r>
+          <w:t>21</w:t>
+        </w:r>
+      </w:fldSimple>
+    </w:p>
+    <w:p>
+      <w:pPr>
+        <w:tabs>
+          <w:tab w:pos="9638" w:val="right" w:leader="dot"/>
+        </w:tabs>
+        <w:spacing w:after="0" w:lineRule="exact" w:line="400"/>
+      </w:pPr>
+      <w:hyperlink w:anchor="page_22">
+        <w:r>
+          <w:rPr>
+            <w:color w:val="243746"/>
+          </w:rPr>
+          <w:t>20  词典编码的语义局限与抽查</w:t>
+        </w:r>
+      </w:hyperlink>
+      <w:r>
+        <w:tab/>
+      </w:r>
+      <w:fldSimple w:instr="PAGEREF page_22 \h" w:dirty="true">
+        <w:r>
+          <w:t>22</w:t>
+        </w:r>
+      </w:fldSimple>
+    </w:p>
+    <w:p>
+      <w:pPr>
+        <w:tabs>
+          <w:tab w:pos="9638" w:val="right" w:leader="dot"/>
+        </w:tabs>
+        <w:spacing w:after="0" w:lineRule="exact" w:line="400"/>
+      </w:pPr>
+      <w:hyperlink w:anchor="page_23">
+        <w:r>
+          <w:rPr>
+            <w:color w:val="243746"/>
+          </w:rPr>
+          <w:t>21  评论关系的识别与建图规则</w:t>
+        </w:r>
+      </w:hyperlink>
+      <w:r>
+        <w:tab/>
+      </w:r>
+      <w:fldSimple w:instr="PAGEREF page_23 \h" w:dirty="true">
+        <w:r>
+          <w:t>23</w:t>
+        </w:r>
+      </w:fldSimple>
+    </w:p>
+    <w:p>
+      <w:pPr>
+        <w:tabs>
+          <w:tab w:pos="9638" w:val="right" w:leader="dot"/>
+        </w:tabs>
+        <w:spacing w:after="0" w:lineRule="exact" w:line="400"/>
+      </w:pPr>
+      <w:hyperlink w:anchor="page_24">
+        <w:r>
+          <w:rPr>
+            <w:color w:val="243746"/>
+          </w:rPr>
+          <w:t>22  评论互动网络的连通性与互惠性</w:t>
+        </w:r>
+      </w:hyperlink>
+      <w:r>
+        <w:tab/>
+      </w:r>
+      <w:fldSimple w:instr="PAGEREF page_24 \h" w:dirty="true">
+        <w:r>
+          <w:t>24</w:t>
+        </w:r>
+      </w:fldSimple>
+    </w:p>
+    <w:p>
+      <w:pPr>
+        <w:tabs>
+          <w:tab w:pos="9638" w:val="right" w:leader="dot"/>
+        </w:tabs>
+        <w:spacing w:after="0" w:lineRule="exact" w:line="400"/>
+      </w:pPr>
+      <w:hyperlink w:anchor="page_25">
+        <w:r>
+          <w:rPr>
+            <w:color w:val="243746"/>
+          </w:rPr>
+          <w:t>23  前10位接收者获得54.0%的互动事件</w:t>
+        </w:r>
+      </w:hyperlink>
+      <w:r>
+        <w:tab/>
+      </w:r>
+      <w:fldSimple w:instr="PAGEREF page_25 \h" w:dirty="true">
+        <w:r>
+          <w:t>25</w:t>
+        </w:r>
+      </w:fldSimple>
+    </w:p>
+    <w:p>
+      <w:pPr>
+        <w:tabs>
+          <w:tab w:pos="9638" w:val="right" w:leader="dot"/>
+        </w:tabs>
+        <w:spacing w:after="0" w:lineRule="exact" w:line="400"/>
+      </w:pPr>
+      <w:hyperlink w:anchor="page_26">
+        <w:r>
+          <w:rPr>
+            <w:color w:val="243746"/>
+          </w:rPr>
+          <w:t>24  多数明确回复由帖主发出</w:t>
+        </w:r>
+      </w:hyperlink>
+      <w:r>
+        <w:tab/>
+      </w:r>
+      <w:fldSimple w:instr="PAGEREF page_26 \h" w:dirty="true">
+        <w:r>
+          <w:t>26</w:t>
+        </w:r>
+      </w:fldSimple>
+    </w:p>
+    <w:p>
+      <w:pPr>
+        <w:tabs>
+          <w:tab w:pos="9638" w:val="right" w:leader="dot"/>
+        </w:tabs>
+        <w:spacing w:after="0" w:lineRule="exact" w:line="400"/>
+      </w:pPr>
+      <w:hyperlink w:anchor="page_27">
+        <w:r>
+          <w:rPr>
+            <w:color w:val="243746"/>
+          </w:rPr>
+          <w:t>25  首周网络的互惠性更高，集中度略低</w:t>
+        </w:r>
+      </w:hyperlink>
+      <w:r>
+        <w:tab/>
+      </w:r>
+      <w:fldSimple w:instr="PAGEREF page_27 \h" w:dirty="true">
+        <w:r>
+          <w:t>27</w:t>
+        </w:r>
+      </w:fldSimple>
+    </w:p>
+    <w:p>
+      <w:pPr>
+        <w:tabs>
+          <w:tab w:pos="9638" w:val="right" w:leader="dot"/>
+        </w:tabs>
+        <w:spacing w:after="0" w:lineRule="exact" w:line="400"/>
+      </w:pPr>
+      <w:hyperlink w:anchor="page_28">
+        <w:r>
+          <w:rPr>
+            <w:color w:val="243746"/>
+          </w:rPr>
+          <w:t>26  研究结论、实践启示与后续设计</w:t>
+        </w:r>
+      </w:hyperlink>
+      <w:r>
+        <w:tab/>
+      </w:r>
+      <w:fldSimple w:instr="PAGEREF page_28 \h" w:dirty="true">
+        <w:r>
+          <w:t>28</w:t>
+        </w:r>
+      </w:fldSimple>
+    </w:p>
+    <w:p>
+      <w:pPr>
+        <w:tabs>
+          <w:tab w:pos="9638" w:val="right" w:leader="dot"/>
+        </w:tabs>
+        <w:spacing w:after="0" w:lineRule="exact" w:line="400"/>
+      </w:pPr>
+      <w:hyperlink w:anchor="page_29">
+        <w:r>
+          <w:rPr>
+            <w:color w:val="243746"/>
+          </w:rPr>
+          <w:t>27  参考文献与复现说明</w:t>
+        </w:r>
+      </w:hyperlink>
+      <w:r>
+        <w:tab/>
+      </w:r>
+      <w:fldSimple w:instr="PAGEREF page_29 \h" w:dirty="true">
+        <w:r>
+          <w:t>29</w:t>
+        </w:r>
+      </w:fldSimple>
+    </w:p>
+    <w:p>
+      <w:pPr>
+        <w:tabs>
+          <w:tab w:pos="9638" w:val="right" w:leader="dot"/>
+        </w:tabs>
+        <w:spacing w:after="0" w:lineRule="exact" w:line="400"/>
+      </w:pPr>
+      <w:hyperlink w:anchor="page_30">
+        <w:r>
+          <w:rPr>
+            <w:color w:val="243746"/>
+          </w:rPr>
+          <w:t>28  课程要求与小组分工</w:t>
+        </w:r>
+      </w:hyperlink>
+      <w:r>
+        <w:tab/>
+      </w:r>
+      <w:fldSimple w:instr="PAGEREF page_30 \h" w:dirty="true">
+        <w:r>
+          <w:t>30</w:t>
+        </w:r>
+      </w:fldSimple>
+    </w:p>
+    <w:p>
+      <w:r>
+        <w:br w:type="page"/>
+      </w:r>
+    </w:p>
+    <w:p>
+      <w:pPr>
+        <w:pStyle w:val="Subtitle"/>
+      </w:pPr>
+      <w:r>
         <w:t>01 · 研究背景与意义</w:t>
       </w:r>
     </w:p>
@@ -87,9 +784,11 @@
       <w:pPr>
         <w:pStyle w:val="Heading1"/>
       </w:pPr>
+      <w:bookmarkStart w:id="3" w:name="page_3"/>
       <w:r>
         <w:t>健身社区中的内容表达与互动反馈</w:t>
       </w:r>
+      <w:bookmarkEnd w:id="3"/>
     </w:p>
     <w:p>
       <w:r>
@@ -340,9 +1039,11 @@
       <w:pPr>
         <w:pStyle w:val="Heading1"/>
       </w:pPr>
+      <w:bookmarkStart w:id="4" w:name="page_4"/>
       <w:r>
         <w:t>数据来源、样本范围与清洗</w:t>
       </w:r>
+      <w:bookmarkEnd w:id="4"/>
     </w:p>
     <w:tbl>
       <w:tblPr>
@@ -686,9 +1387,11 @@
       <w:pPr>
         <w:pStyle w:val="Heading1"/>
       </w:pPr>
+      <w:bookmarkStart w:id="5" w:name="page_5"/>
       <w:r>
         <w:t>正文缺失与内容形式、作者均有关联</w:t>
       </w:r>
+      <w:bookmarkEnd w:id="5"/>
     </w:p>
     <w:p>
       <w:r>
@@ -989,9 +1692,11 @@
       <w:pPr>
         <w:pStyle w:val="Heading1"/>
       </w:pPr>
+      <w:bookmarkStart w:id="6" w:name="page_6"/>
       <w:r>
         <w:t>点赞分布长尾明显，均值高于中位数</w:t>
       </w:r>
+      <w:bookmarkEnd w:id="6"/>
     </w:p>
     <w:p>
       <w:r>
@@ -1343,9 +2048,11 @@
       <w:pPr>
         <w:pStyle w:val="Heading1"/>
       </w:pPr>
+      <w:bookmarkStart w:id="7" w:name="page_7"/>
       <w:r>
         <w:t>不同内容形式的点赞表现存在差异</w:t>
       </w:r>
+      <w:bookmarkEnd w:id="7"/>
     </w:p>
     <w:p>
       <w:r>
@@ -1697,9 +2404,11 @@
       <w:pPr>
         <w:pStyle w:val="Heading1"/>
       </w:pPr>
+      <w:bookmarkStart w:id="8" w:name="page_8"/>
       <w:r>
         <w:t>正文预处理与变量构建</w:t>
       </w:r>
+      <w:bookmarkEnd w:id="8"/>
     </w:p>
     <w:p>
       <w:r>
@@ -2072,9 +2781,11 @@
       <w:pPr>
         <w:pStyle w:val="Heading1"/>
       </w:pPr>
+      <w:bookmarkStart w:id="9" w:name="page_9"/>
       <w:r>
         <w:t>词典编码规则及其解释范围</w:t>
       </w:r>
+      <w:bookmarkEnd w:id="9"/>
     </w:p>
     <w:tbl>
       <w:tblPr>
@@ -2358,9 +3069,11 @@
       <w:pPr>
         <w:pStyle w:val="Heading1"/>
       </w:pPr>
+      <w:bookmarkStart w:id="10" w:name="page_10"/>
       <w:r>
         <w:t>文本特征的分布与作者覆盖</w:t>
       </w:r>
+      <w:bookmarkEnd w:id="10"/>
     </w:p>
     <w:p>
       <w:r>
@@ -2712,9 +3425,11 @@
       <w:pPr>
         <w:pStyle w:val="Heading1"/>
       </w:pPr>
+      <w:bookmarkStart w:id="11" w:name="page_11"/>
       <w:r>
         <w:t>TF-IDF与非负矩阵分解的主题分析</w:t>
       </w:r>
+      <w:bookmarkEnd w:id="11"/>
     </w:p>
     <w:p>
       <w:r>
@@ -3161,9 +3876,11 @@
       <w:pPr>
         <w:pStyle w:val="Heading1"/>
       </w:pPr>
+      <w:bookmarkStart w:id="12" w:name="page_12"/>
       <w:r>
         <w:t>主题分布及其作者集中度</w:t>
       </w:r>
+      <w:bookmarkEnd w:id="12"/>
     </w:p>
     <w:p>
       <w:r>
@@ -3515,9 +4232,11 @@
       <w:pPr>
         <w:pStyle w:val="Heading1"/>
       </w:pPr>
+      <w:bookmarkStart w:id="13" w:name="page_13"/>
       <w:r>
         <w:t>从组间差异到作者内比较</w:t>
       </w:r>
+      <w:bookmarkEnd w:id="13"/>
     </w:p>
     <w:tbl>
       <w:tblPr>
@@ -3873,9 +4592,11 @@
       <w:pPr>
         <w:pStyle w:val="Heading1"/>
       </w:pPr>
+      <w:bookmarkStart w:id="14" w:name="page_14"/>
       <w:r>
         <w:t>固定效应模型与统计推断</w:t>
       </w:r>
+      <w:bookmarkEnd w:id="14"/>
     </w:p>
     <w:p>
       <w:r>
@@ -4121,9 +4842,11 @@
       <w:pPr>
         <w:pStyle w:val="Heading1"/>
       </w:pPr>
+      <w:bookmarkStart w:id="15" w:name="page_15"/>
       <w:r>
         <w:t>核心文本特征的关联证据有限</w:t>
       </w:r>
+      <w:bookmarkEnd w:id="15"/>
     </w:p>
     <w:tbl>
       <w:tblPr>
@@ -4732,9 +5455,11 @@
       <w:pPr>
         <w:pStyle w:val="Heading1"/>
       </w:pPr>
+      <w:bookmarkStart w:id="16" w:name="page_16"/>
       <w:r>
         <w:t>回归系数的量级与解释</w:t>
       </w:r>
+      <w:bookmarkEnd w:id="16"/>
     </w:p>
     <w:p>
       <w:r>
@@ -4825,9 +5550,11 @@
       <w:pPr>
         <w:pStyle w:val="Heading1"/>
       </w:pPr>
+      <w:bookmarkStart w:id="17" w:name="page_17"/>
       <w:r>
         <w:t>积极表达的负关联对模型设定敏感</w:t>
       </w:r>
+      <w:bookmarkEnd w:id="17"/>
     </w:p>
     <w:p>
       <w:r>
@@ -5231,9 +5958,11 @@
       <w:pPr>
         <w:pStyle w:val="Heading1"/>
       </w:pPr>
+      <w:bookmarkStart w:id="18" w:name="page_18"/>
       <w:r>
         <w:t>逐作者剔除后的系数敏感性</w:t>
       </w:r>
+      <w:bookmarkEnd w:id="18"/>
     </w:p>
     <w:p>
       <w:r>
@@ -5576,9 +6305,11 @@
       <w:pPr>
         <w:pStyle w:val="Heading1"/>
       </w:pPr>
+      <w:bookmarkStart w:id="19" w:name="page_19"/>
       <w:r>
         <w:t>文本特征能否改善样本外预测？</w:t>
       </w:r>
+      <w:bookmarkEnd w:id="19"/>
     </w:p>
     <w:p>
       <w:r>
@@ -5841,9 +6572,11 @@
       <w:pPr>
         <w:pStyle w:val="Heading1"/>
       </w:pPr>
+      <w:bookmarkStart w:id="20" w:name="page_20"/>
       <w:r>
         <w:t>留出预测中的文本增益有限</w:t>
       </w:r>
+      <w:bookmarkEnd w:id="20"/>
     </w:p>
     <w:p>
       <w:r>
@@ -6398,9 +7131,11 @@
       <w:pPr>
         <w:pStyle w:val="Heading1"/>
       </w:pPr>
+      <w:bookmarkStart w:id="21" w:name="page_21"/>
       <w:r>
         <w:t>预测增益的不确定性与重复文本敏感性</w:t>
       </w:r>
+      <w:bookmarkEnd w:id="21"/>
     </w:p>
     <w:p>
       <w:r>
@@ -6866,9 +7601,11 @@
       <w:pPr>
         <w:pStyle w:val="Heading1"/>
       </w:pPr>
+      <w:bookmarkStart w:id="22" w:name="page_22"/>
       <w:r>
         <w:t>词典编码的语义局限与抽查</w:t>
       </w:r>
+      <w:bookmarkEnd w:id="22"/>
     </w:p>
     <w:p>
       <w:r>
@@ -7087,9 +7824,11 @@
       <w:pPr>
         <w:pStyle w:val="Heading1"/>
       </w:pPr>
+      <w:bookmarkStart w:id="23" w:name="page_23"/>
       <w:r>
         <w:t>评论关系的识别与建图规则</w:t>
       </w:r>
+      <w:bookmarkEnd w:id="23"/>
     </w:p>
     <w:p>
       <w:r>
@@ -7326,9 +8065,11 @@
       <w:pPr>
         <w:pStyle w:val="Heading1"/>
       </w:pPr>
+      <w:bookmarkStart w:id="24" w:name="page_24"/>
       <w:r>
         <w:t>评论互动网络的连通性与互惠性</w:t>
       </w:r>
+      <w:bookmarkEnd w:id="24"/>
     </w:p>
     <w:p>
       <w:r>
@@ -7605,9 +8346,11 @@
       <w:pPr>
         <w:pStyle w:val="Heading1"/>
       </w:pPr>
+      <w:bookmarkStart w:id="25" w:name="page_25"/>
       <w:r>
         <w:t>前10位接收者获得54.0%的互动事件</w:t>
       </w:r>
+      <w:bookmarkEnd w:id="25"/>
     </w:p>
     <w:p>
       <w:r>
@@ -7698,9 +8441,11 @@
       <w:pPr>
         <w:pStyle w:val="Heading1"/>
       </w:pPr>
+      <w:bookmarkStart w:id="26" w:name="page_26"/>
       <w:r>
         <w:t>多数明确回复由帖主发出</w:t>
       </w:r>
+      <w:bookmarkEnd w:id="26"/>
     </w:p>
     <w:p>
       <w:r>
@@ -7918,9 +8663,11 @@
       <w:pPr>
         <w:pStyle w:val="Heading1"/>
       </w:pPr>
+      <w:bookmarkStart w:id="27" w:name="page_27"/>
       <w:r>
         <w:t>首周网络的互惠性更高，集中度略低</w:t>
       </w:r>
+      <w:bookmarkEnd w:id="27"/>
     </w:p>
     <w:tbl>
       <w:tblPr>
@@ -8176,9 +8923,11 @@
       <w:pPr>
         <w:pStyle w:val="Heading1"/>
       </w:pPr>
+      <w:bookmarkStart w:id="28" w:name="page_28"/>
       <w:r>
         <w:t>研究结论、实践启示与后续设计</w:t>
       </w:r>
+      <w:bookmarkEnd w:id="28"/>
     </w:p>
     <w:tbl>
       <w:tblPr>
@@ -8410,9 +9159,11 @@
       <w:pPr>
         <w:pStyle w:val="Heading1"/>
       </w:pPr>
+      <w:bookmarkStart w:id="29" w:name="page_29"/>
       <w:r>
         <w:t>参考文献与复现说明</w:t>
       </w:r>
+      <w:bookmarkEnd w:id="29"/>
     </w:p>
     <w:p>
       <w:r>
@@ -8493,9 +9244,11 @@
       <w:pPr>
         <w:pStyle w:val="Heading1"/>
       </w:pPr>
+      <w:bookmarkStart w:id="30" w:name="page_30"/>
       <w:r>
         <w:t>课程要求与小组分工</w:t>
       </w:r>
+      <w:bookmarkEnd w:id="30"/>
     </w:p>
     <w:tbl>
       <w:tblPr>

</xml_diff>

<commit_message>
Remove prediction branch from formal report and presentation
</commit_message>
<xml_diff>
--- a/分析报告_可编辑.docx
+++ b/分析报告_可编辑.docx
@@ -53,12 +53,12 @@
     </w:p>
     <w:p>
       <w:r>
-        <w:t>本研究以Keep社区100位作者的9,532条帖子及去重后的11,595条评论为样本，考察文本表达与互动反馈的关系。研究首先将正文转换为词典特征并估计作者与日期固定效应模型，继而通过NMF主题分析、逐作者剔除和两类样本外预测实验检验结果，最后结合评论时序与回复角色分析互动网络。</w:t>
+        <w:t>本研究以Keep社区100位作者的9,532条帖子及去重后的11,595条评论为样本，考察文本表达与互动反馈的关系。研究将正文转换为词典特征并估计作者与日期固定效应模型，通过调整样本范围、更换模型及逐作者剔除开展敏感性检验；进一步采用TF-IDF与NMF识别内容主题，并结合评论时序与回复角色分析互动网络。</w:t>
       </w:r>
     </w:p>
     <w:p>
       <w:r>
-        <w:t>五项核心文本特征的联合检验不显著（p=0.130），新增解释度为0.065个百分点。积极表达词呈负向关联，但BH校正后q=0.079，PPML区间也包含零。主题回归未提供更明确的关联证据；加入词典或字符文本后，两种留出评估的误差变化区间均包含零，未显示稳定的预测增益。</w:t>
+        <w:t>五项核心文本特征的联合检验不显著（p=0.130），新增解释度为0.065个百分点。积极表达词呈负向关联，但BH校正后q=0.079，PPML区间也包含零。主题权重的联合检验p=0.166，各项经BH校正后均未达到5%显著性水平，现有结果尚不足以支持特定字面表达或内容主题与点赞存在明确、稳定的关联。</w:t>
       </w:r>
     </w:p>
     <w:p>
@@ -518,31 +518,6 @@
       </w:fldSimple>
     </w:p>
     <w:p>
-      <w:pPr>
-        <w:tabs>
-          <w:tab w:pos="9638" w:val="right" w:leader="dot"/>
-        </w:tabs>
-        <w:spacing w:after="0" w:before="0" w:lineRule="exact" w:line="400"/>
-        <w:ind w:left="283"/>
-      </w:pPr>
-      <w:hyperlink w:anchor="section_4_6">
-        <w:r>
-          <w:rPr>
-            <w:color w:val="243746"/>
-          </w:rPr>
-          <w:t>4.6  样本外预测实验设计</w:t>
-        </w:r>
-      </w:hyperlink>
-      <w:r>
-        <w:tab/>
-      </w:r>
-      <w:fldSimple w:instr="PAGEREF section_4_6 \h" w:dirty="true">
-        <w:r>
-          <w:t>17</w:t>
-        </w:r>
-      </w:fldSimple>
-    </w:p>
-    <w:p>
       <w:r>
         <w:br w:type="page"/>
       </w:r>
@@ -584,7 +559,7 @@
       </w:r>
       <w:fldSimple w:instr="PAGEREF chapter_5 \h" w:dirty="true">
         <w:r>
-          <w:t>18</w:t>
+          <w:t>17</w:t>
         </w:r>
       </w:fldSimple>
     </w:p>
@@ -609,7 +584,7 @@
       </w:r>
       <w:fldSimple w:instr="PAGEREF section_5_1 \h" w:dirty="true">
         <w:r>
-          <w:t>18</w:t>
+          <w:t>17</w:t>
         </w:r>
       </w:fldSimple>
     </w:p>
@@ -634,7 +609,7 @@
       </w:r>
       <w:fldSimple w:instr="PAGEREF section_5_2 \h" w:dirty="true">
         <w:r>
-          <w:t>19</w:t>
+          <w:t>18</w:t>
         </w:r>
       </w:fldSimple>
     </w:p>
@@ -659,7 +634,7 @@
       </w:r>
       <w:fldSimple w:instr="PAGEREF section_5_3 \h" w:dirty="true">
         <w:r>
-          <w:t>20</w:t>
+          <w:t>19</w:t>
         </w:r>
       </w:fldSimple>
     </w:p>
@@ -684,7 +659,7 @@
       </w:r>
       <w:fldSimple w:instr="PAGEREF section_5_4 \h" w:dirty="true">
         <w:r>
-          <w:t>21</w:t>
+          <w:t>20</w:t>
         </w:r>
       </w:fldSimple>
     </w:p>
@@ -709,7 +684,7 @@
       </w:r>
       <w:fldSimple w:instr="PAGEREF section_5_5 \h" w:dirty="true">
         <w:r>
-          <w:t>22</w:t>
+          <w:t>21</w:t>
         </w:r>
       </w:fldSimple>
     </w:p>
@@ -734,7 +709,7 @@
       </w:r>
       <w:fldSimple w:instr="PAGEREF section_5_6 \h" w:dirty="true">
         <w:r>
-          <w:t>23</w:t>
+          <w:t>22</w:t>
         </w:r>
       </w:fldSimple>
     </w:p>
@@ -759,7 +734,7 @@
       </w:r>
       <w:fldSimple w:instr="PAGEREF section_5_7 \h" w:dirty="true">
         <w:r>
-          <w:t>24</w:t>
+          <w:t>23</w:t>
         </w:r>
       </w:fldSimple>
     </w:p>
@@ -784,7 +759,7 @@
       </w:r>
       <w:fldSimple w:instr="PAGEREF chapter_6 \h" w:dirty="true">
         <w:r>
-          <w:t>25</w:t>
+          <w:t>24</w:t>
         </w:r>
       </w:fldSimple>
     </w:p>
@@ -809,7 +784,7 @@
       </w:r>
       <w:fldSimple w:instr="PAGEREF section_6_1 \h" w:dirty="true">
         <w:r>
-          <w:t>25</w:t>
+          <w:t>24</w:t>
         </w:r>
       </w:fldSimple>
     </w:p>
@@ -834,7 +809,7 @@
       </w:r>
       <w:fldSimple w:instr="PAGEREF section_6_2 \h" w:dirty="true">
         <w:r>
-          <w:t>26</w:t>
+          <w:t>25</w:t>
         </w:r>
       </w:fldSimple>
     </w:p>
@@ -859,7 +834,7 @@
       </w:r>
       <w:fldSimple w:instr="PAGEREF section_6_3 \h" w:dirty="true">
         <w:r>
-          <w:t>27</w:t>
+          <w:t>26</w:t>
         </w:r>
       </w:fldSimple>
     </w:p>
@@ -884,7 +859,7 @@
       </w:r>
       <w:fldSimple w:instr="PAGEREF section_6_4 \h" w:dirty="true">
         <w:r>
-          <w:t>28</w:t>
+          <w:t>27</w:t>
         </w:r>
       </w:fldSimple>
     </w:p>
@@ -909,7 +884,7 @@
       </w:r>
       <w:fldSimple w:instr="PAGEREF section_6_5 \h" w:dirty="true">
         <w:r>
-          <w:t>29</w:t>
+          <w:t>28</w:t>
         </w:r>
       </w:fldSimple>
     </w:p>
@@ -926,7 +901,7 @@
           <w:rPr>
             <w:color w:val="243746"/>
           </w:rPr>
-          <w:t>6.6  留出预测结果</w:t>
+          <w:t>6.6  综合讨论与研究局限</w:t>
         </w:r>
       </w:hyperlink>
       <w:r>
@@ -934,57 +909,7 @@
       </w:r>
       <w:fldSimple w:instr="PAGEREF section_6_6 \h" w:dirty="true">
         <w:r>
-          <w:t>30</w:t>
-        </w:r>
-      </w:fldSimple>
-    </w:p>
-    <w:p>
-      <w:pPr>
-        <w:tabs>
-          <w:tab w:pos="9638" w:val="right" w:leader="dot"/>
-        </w:tabs>
-        <w:spacing w:after="0" w:before="0" w:lineRule="exact" w:line="400"/>
-        <w:ind w:left="283"/>
-      </w:pPr>
-      <w:hyperlink w:anchor="section_6_7">
-        <w:r>
-          <w:rPr>
-            <w:color w:val="243746"/>
-          </w:rPr>
-          <w:t>6.7  预测不确定性与重复文本检验</w:t>
-        </w:r>
-      </w:hyperlink>
-      <w:r>
-        <w:tab/>
-      </w:r>
-      <w:fldSimple w:instr="PAGEREF section_6_7 \h" w:dirty="true">
-        <w:r>
-          <w:t>31</w:t>
-        </w:r>
-      </w:fldSimple>
-    </w:p>
-    <w:p>
-      <w:pPr>
-        <w:tabs>
-          <w:tab w:pos="9638" w:val="right" w:leader="dot"/>
-        </w:tabs>
-        <w:spacing w:after="0" w:before="0" w:lineRule="exact" w:line="400"/>
-        <w:ind w:left="283"/>
-      </w:pPr>
-      <w:hyperlink w:anchor="section_6_8">
-        <w:r>
-          <w:rPr>
-            <w:color w:val="243746"/>
-          </w:rPr>
-          <w:t>6.8  综合讨论与研究局限</w:t>
-        </w:r>
-      </w:hyperlink>
-      <w:r>
-        <w:tab/>
-      </w:r>
-      <w:fldSimple w:instr="PAGEREF section_6_8 \h" w:dirty="true">
-        <w:r>
-          <w:t>32</w:t>
+          <w:t>29</w:t>
         </w:r>
       </w:fldSimple>
     </w:p>
@@ -1009,7 +934,7 @@
       </w:r>
       <w:fldSimple w:instr="PAGEREF chapter_7 \h" w:dirty="true">
         <w:r>
-          <w:t>33</w:t>
+          <w:t>30</w:t>
         </w:r>
       </w:fldSimple>
     </w:p>
@@ -1034,7 +959,7 @@
       </w:r>
       <w:fldSimple w:instr="PAGEREF section_7_1 \h" w:dirty="true">
         <w:r>
-          <w:t>33</w:t>
+          <w:t>30</w:t>
         </w:r>
       </w:fldSimple>
     </w:p>
@@ -1059,7 +984,7 @@
       </w:r>
       <w:fldSimple w:instr="PAGEREF section_7_2 \h" w:dirty="true">
         <w:r>
-          <w:t>34</w:t>
+          <w:t>31</w:t>
         </w:r>
       </w:fldSimple>
     </w:p>
@@ -1084,7 +1009,7 @@
       </w:r>
       <w:fldSimple w:instr="PAGEREF references \h" w:dirty="true">
         <w:r>
-          <w:t>35</w:t>
+          <w:t>32</w:t>
         </w:r>
       </w:fldSimple>
     </w:p>
@@ -1109,7 +1034,7 @@
       </w:r>
       <w:fldSimple w:instr="PAGEREF appendix \h" w:dirty="true">
         <w:r>
-          <w:t>36</w:t>
+          <w:t>33</w:t>
         </w:r>
       </w:fldSimple>
     </w:p>
@@ -1274,7 +1199,7 @@
     </w:p>
     <w:p>
       <w:r>
-        <w:t>研究先描述样本与反馈分布，再将非结构化正文转换为可检验的变量，通过作者与日期固定效应回归考察条件关联。主题建模用于补充识别内容模式，时间留出与作者分组评估用于检验文本的预测信息，评论网络则用于描述回应关系。最后综合各类证据，讨论结论的适用范围并提出后续建议。</w:t>
+        <w:t>研究先描述样本与反馈分布，再将非结构化正文转换为可检验的变量，通过作者与日期固定效应回归考察条件关联。主题建模用于补充识别内容模式，主题权重进一步进入回归以检验其条件关联，评论网络则用于描述回应关系。最后综合各类证据，讨论结论的适用范围并提出后续建议。</w:t>
       </w:r>
     </w:p>
     <w:p>
@@ -1332,7 +1257,7 @@
     </w:p>
     <w:p>
       <w:r>
-        <w:t>在方法层面，正文缺失、评论采集范围和累计点赞观察时长共同决定了分析能够回答的问题。本研究据此结合可复现的词典编码、固定效应回归、主题建模与样本外预测，分别检验内容的条件关联和预测信息，并用评论网络补充描述用户之间的回应关系。</w:t>
+        <w:t>在方法层面，正文缺失、评论采集范围和累计点赞观察时长共同决定了分析能够回答的问题。本研究据此结合可复现的词典编码、固定效应回归与主题建模，考察不同层次的文本表示与点赞的条件关联，并用评论网络补充描述用户之间的回应关系。</w:t>
       </w:r>
     </w:p>
     <w:p>
@@ -1510,38 +1435,6 @@
           </w:p>
         </w:tc>
       </w:tr>
-      <w:tr>
-        <w:tc>
-          <w:tcPr>
-            <w:tcW w:type="dxa" w:w="3213"/>
-          </w:tcPr>
-          <w:p>
-            <w:r>
-              <w:t>RQ4</w:t>
-            </w:r>
-          </w:p>
-        </w:tc>
-        <w:tc>
-          <w:tcPr>
-            <w:tcW w:type="dxa" w:w="3213"/>
-          </w:tcPr>
-          <w:p>
-            <w:r>
-              <w:t>文本特征能否改善样本外点赞预测？</w:t>
-            </w:r>
-          </w:p>
-        </w:tc>
-        <w:tc>
-          <w:tcPr>
-            <w:tcW w:type="dxa" w:w="3213"/>
-          </w:tcPr>
-          <w:p>
-            <w:r>
-              <w:t>时间留出、作者分组五折、配对误差区间</w:t>
-            </w:r>
-          </w:p>
-        </w:tc>
-      </w:tr>
     </w:tbl>
     <w:p>
       <w:pPr>
@@ -1582,7 +1475,7 @@
     </w:p>
     <w:p>
       <w:r>
-        <w:t>主题建模、预测对照、作者剔除及评论时序为2026-10-17追加的探索性分析，保留原五项核心检验作为主分析。主题数、预测划分及正则化强度在本轮首次拟合前固定；主题名称和基准依据文本内容与频数确定。</w:t>
+        <w:t>主题建模、作者剔除及评论时序为2026-10-17追加的探索性分析，保留原五项核心检验作为主分析。主题数在本轮首次拟合前固定；主题名称和基准依据文本内容与频数确定。</w:t>
       </w:r>
     </w:p>
     <w:p>
@@ -4195,7 +4088,7 @@
     </w:p>
     <w:p>
       <w:r>
-        <w:t>后续可从全部可见正文中随机抽样，在隐藏模型预测与互动指标的条件下，由两位编码者依据预先确定的语义标准独立标注，并评估编码一致性与分类误差。这样可以进一步判断回归中的有限证据在多大程度上与文本测量有关。</w:t>
+        <w:t>后续可从全部可见正文中随机抽样，在隐藏互动指标的条件下，由两位编码者依据预先确定的语义标准独立标注，并评估编码一致性与分类误差。这样可以进一步判断回归中的有限证据在多大程度上与文本测量有关。</w:t>
       </w:r>
     </w:p>
     <w:p>
@@ -4820,290 +4713,23 @@
     </w:p>
     <w:p>
       <w:pPr>
-        <w:pStyle w:val="Subtitle"/>
+        <w:pStyle w:val="Heading1"/>
       </w:pPr>
+      <w:bookmarkStart w:id="18" w:name="chapter_5"/>
       <w:r>
-        <w:t>第四章 非结构化数据的结构化与回归分析</w:t>
+        <w:t>第五章 文本与网络分析</w:t>
       </w:r>
+      <w:bookmarkEnd w:id="18"/>
     </w:p>
     <w:p>
       <w:pPr>
         <w:pStyle w:val="Heading2"/>
       </w:pPr>
-      <w:bookmarkStart w:id="18" w:name="section_4_6"/>
-      <w:r>
-        <w:t>4.6　样本外预测实验设计</w:t>
-      </w:r>
-      <w:bookmarkEnd w:id="18"/>
-    </w:p>
-    <w:p>
-      <w:r>
-        <w:t>固定效应回归主要回答给定控制项后的关联问题，较高的样本内R²不意味着文本能够改善新样本预测。为补充这一判断，本研究在相同划分下比较四种预测模型，考察逐步加入文本后的误差变化。所有模型设置均在本次留出结果生成前固定，未根据测试集表现调参。</w:t>
-      </w:r>
-    </w:p>
-    <w:tbl>
-      <w:tblPr>
-        <w:tblStyle w:val="LightShading-Accent1"/>
-        <w:tblW w:type="auto" w:w="0"/>
-        <w:tblLook w:firstColumn="1" w:firstRow="1" w:lastColumn="0" w:lastRow="0" w:noHBand="0" w:noVBand="1" w:val="04A0"/>
-      </w:tblPr>
-      <w:tblGrid>
-        <w:gridCol w:w="4819"/>
-        <w:gridCol w:w="4819"/>
-      </w:tblGrid>
-      <w:tr>
-        <w:tc>
-          <w:tcPr>
-            <w:tcW w:type="dxa" w:w="4819"/>
-          </w:tcPr>
-          <w:p>
-            <w:r>
-              <w:t>模型</w:t>
-            </w:r>
-          </w:p>
-        </w:tc>
-        <w:tc>
-          <w:tcPr>
-            <w:tcW w:type="dxa" w:w="4819"/>
-          </w:tcPr>
-          <w:p>
-            <w:r>
-              <w:t>输入与设定</w:t>
-            </w:r>
-          </w:p>
-        </w:tc>
-      </w:tr>
-      <w:tr>
-        <w:tc>
-          <w:tcPr>
-            <w:tcW w:type="dxa" w:w="4819"/>
-          </w:tcPr>
-          <w:p>
-            <w:r>
-              <w:t>训练集均值</w:t>
-            </w:r>
-          </w:p>
-        </w:tc>
-        <w:tc>
-          <w:tcPr>
-            <w:tcW w:type="dxa" w:w="4819"/>
-          </w:tcPr>
-          <w:p>
-            <w:r>
-              <w:t>对所有测试帖预测训练集ln(1+点赞数)的均值。</w:t>
-            </w:r>
-          </w:p>
-        </w:tc>
-      </w:tr>
-      <w:tr>
-        <w:tc>
-          <w:tcPr>
-            <w:tcW w:type="dxa" w:w="4819"/>
-          </w:tcPr>
-          <w:p>
-            <w:r>
-              <w:t>结构化基线</w:t>
-            </w:r>
-          </w:p>
-        </w:tc>
-        <w:tc>
-          <w:tcPr>
-            <w:tcW w:type="dxa" w:w="4819"/>
-          </w:tcPr>
-          <w:p>
-            <w:r>
-              <w:t>作者编号、性别、Keep值、等级、会员、内容形式、业务类型、时段、星期、日期序号和话题标记。</w:t>
-            </w:r>
-          </w:p>
-        </w:tc>
-      </w:tr>
-      <w:tr>
-        <w:tc>
-          <w:tcPr>
-            <w:tcW w:type="dxa" w:w="4819"/>
-          </w:tcPr>
-          <w:p>
-            <w:r>
-              <w:t>结构化＋词典</w:t>
-            </w:r>
-          </w:p>
-        </w:tc>
-        <w:tc>
-          <w:tcPr>
-            <w:tcW w:type="dxa" w:w="4819"/>
-          </w:tcPr>
-          <w:p>
-            <w:r>
-              <w:t>在结构化基线上增加五项核心文本特征、正文可用状态、表情与课程标记。</w:t>
-            </w:r>
-          </w:p>
-        </w:tc>
-      </w:tr>
-      <w:tr>
-        <w:tc>
-          <w:tcPr>
-            <w:tcW w:type="dxa" w:w="4819"/>
-          </w:tcPr>
-          <w:p>
-            <w:r>
-              <w:t>结构化＋词典＋字符文本</w:t>
-            </w:r>
-          </w:p>
-        </w:tc>
-        <w:tc>
-          <w:tcPr>
-            <w:tcW w:type="dxa" w:w="4819"/>
-          </w:tcPr>
-          <w:p>
-            <w:r>
-              <w:t>进一步加入正文字符2—4元组TF-IDF，词项至少出现于3条训练帖，最多12,000项。</w:t>
-            </w:r>
-          </w:p>
-        </w:tc>
-      </w:tr>
-    </w:tbl>
-    <w:p>
-      <w:r>
-        <w:t>后三种模型均采用岭回归，正则化参数固定为10。类别编码、数值标准化及TF-IDF词表与逆文档频率均只在训练集中拟合，再应用于测试集。字符表示用于减少对人工词典及分词的依赖。</w:t>
-      </w:r>
-    </w:p>
-    <w:tbl>
-      <w:tblPr>
-        <w:tblStyle w:val="LightShading-Accent1"/>
-        <w:tblW w:type="auto" w:w="0"/>
-        <w:tblLook w:firstColumn="1" w:firstRow="1" w:lastColumn="0" w:lastRow="0" w:noHBand="0" w:noVBand="1" w:val="04A0"/>
-      </w:tblPr>
-      <w:tblGrid>
-        <w:gridCol w:w="3213"/>
-        <w:gridCol w:w="3213"/>
-        <w:gridCol w:w="3213"/>
-      </w:tblGrid>
-      <w:tr>
-        <w:tc>
-          <w:tcPr>
-            <w:tcW w:type="dxa" w:w="3213"/>
-          </w:tcPr>
-          <w:p>
-            <w:r>
-              <w:t>划分</w:t>
-            </w:r>
-          </w:p>
-        </w:tc>
-        <w:tc>
-          <w:tcPr>
-            <w:tcW w:type="dxa" w:w="3213"/>
-          </w:tcPr>
-          <w:p>
-            <w:r>
-              <w:t>训练与测试范围</w:t>
-            </w:r>
-          </w:p>
-        </w:tc>
-        <w:tc>
-          <w:tcPr>
-            <w:tcW w:type="dxa" w:w="3213"/>
-          </w:tcPr>
-          <w:p>
-            <w:r>
-              <w:t>主要回答的问题</w:t>
-            </w:r>
-          </w:p>
-        </w:tc>
-      </w:tr>
-      <w:tr>
-        <w:tc>
-          <w:tcPr>
-            <w:tcW w:type="dxa" w:w="3213"/>
-          </w:tcPr>
-          <w:p>
-            <w:r>
-              <w:t>时间留出</w:t>
-            </w:r>
-          </w:p>
-        </w:tc>
-        <w:tc>
-          <w:tcPr>
-            <w:tcW w:type="dxa" w:w="3213"/>
-          </w:tcPr>
-          <w:p>
-            <w:r>
-              <w:t>2020-12-15之前的7,098帖训练，之后的2,434帖测试；测试集含88位作者，其中87位在训练集中出现。</w:t>
-            </w:r>
-          </w:p>
-        </w:tc>
-        <w:tc>
-          <w:tcPr>
-            <w:tcW w:type="dxa" w:w="3213"/>
-          </w:tcPr>
-          <w:p>
-            <w:r>
-              <w:t>对较晚发布、主要来自已见作者的帖子，文本是否提供增量信息？</w:t>
-            </w:r>
-          </w:p>
-        </w:tc>
-      </w:tr>
-      <w:tr>
-        <w:tc>
-          <w:tcPr>
-            <w:tcW w:type="dxa" w:w="3213"/>
-          </w:tcPr>
-          <w:p>
-            <w:r>
-              <w:t>作者分组五折</w:t>
-            </w:r>
-          </w:p>
-        </w:tc>
-        <w:tc>
-          <w:tcPr>
-            <w:tcW w:type="dxa" w:w="3213"/>
-          </w:tcPr>
-          <w:p>
-            <w:r>
-              <w:t>按作者分为5折，每位作者的全部帖子只进入一个测试折，训练与测试作者不重叠。[8]</w:t>
-            </w:r>
-          </w:p>
-        </w:tc>
-        <w:tc>
-          <w:tcPr>
-            <w:tcW w:type="dxa" w:w="3213"/>
-          </w:tcPr>
-          <w:p>
-            <w:r>
-              <w:t>对未参与训练的作者，文本是否有助于泛化？</w:t>
-            </w:r>
-          </w:p>
-        </w:tc>
-      </w:tr>
-    </w:tbl>
-    <w:p>
-      <w:r>
-        <w:t>目标为采集时点的累计点赞，作者属性也缺少历史时戳。因此，“时间留出”是回顾性样本外检验，不代表按真实上线时点预测未来7天点赞的效果。</w:t>
-      </w:r>
-    </w:p>
-    <w:p>
-      <w:r>
-        <w:br w:type="page"/>
-      </w:r>
-    </w:p>
-    <w:p>
-      <w:pPr>
-        <w:pStyle w:val="Heading1"/>
-      </w:pPr>
-      <w:bookmarkStart w:id="19" w:name="chapter_5"/>
-      <w:r>
-        <w:t>第五章 文本与网络分析</w:t>
-      </w:r>
-      <w:bookmarkEnd w:id="19"/>
-    </w:p>
-    <w:p>
-      <w:pPr>
-        <w:pStyle w:val="Heading2"/>
-      </w:pPr>
-      <w:bookmarkStart w:id="20" w:name="section_5_1"/>
+      <w:bookmarkStart w:id="19" w:name="section_5_1"/>
       <w:r>
         <w:t>5.1　TF-IDF表示与NMF主题建模</w:t>
       </w:r>
-      <w:bookmarkEnd w:id="20"/>
+      <w:bookmarkEnd w:id="19"/>
     </w:p>
     <w:p>
       <w:r>
@@ -5550,11 +5176,11 @@
       <w:pPr>
         <w:pStyle w:val="Heading2"/>
       </w:pPr>
-      <w:bookmarkStart w:id="21" w:name="section_5_2"/>
+      <w:bookmarkStart w:id="20" w:name="section_5_2"/>
       <w:r>
         <w:t>5.2　主题分布及其作者集中度</w:t>
       </w:r>
-      <w:bookmarkEnd w:id="21"/>
+      <w:bookmarkEnd w:id="20"/>
     </w:p>
     <w:p>
       <w:r>
@@ -5640,11 +5266,11 @@
       <w:pPr>
         <w:pStyle w:val="Heading2"/>
       </w:pPr>
-      <w:bookmarkStart w:id="22" w:name="section_5_3"/>
+      <w:bookmarkStart w:id="21" w:name="section_5_3"/>
       <w:r>
         <w:t>5.3　评论关系识别与建图规则</w:t>
       </w:r>
-      <w:bookmarkEnd w:id="22"/>
+      <w:bookmarkEnd w:id="21"/>
     </w:p>
     <w:p>
       <w:r>
@@ -5881,11 +5507,11 @@
       <w:pPr>
         <w:pStyle w:val="Heading2"/>
       </w:pPr>
-      <w:bookmarkStart w:id="23" w:name="section_5_4"/>
+      <w:bookmarkStart w:id="22" w:name="section_5_4"/>
       <w:r>
         <w:t>5.4　网络连通性与互惠性</w:t>
       </w:r>
-      <w:bookmarkEnd w:id="23"/>
+      <w:bookmarkEnd w:id="22"/>
     </w:p>
     <w:p>
       <w:r>
@@ -6162,11 +5788,11 @@
       <w:pPr>
         <w:pStyle w:val="Heading2"/>
       </w:pPr>
-      <w:bookmarkStart w:id="24" w:name="section_5_5"/>
+      <w:bookmarkStart w:id="23" w:name="section_5_5"/>
       <w:r>
         <w:t>5.5　互动接收的集中度</w:t>
       </w:r>
-      <w:bookmarkEnd w:id="24"/>
+      <w:bookmarkEnd w:id="23"/>
     </w:p>
     <w:p>
       <w:r>
@@ -6257,11 +5883,11 @@
       <w:pPr>
         <w:pStyle w:val="Heading2"/>
       </w:pPr>
-      <w:bookmarkStart w:id="25" w:name="section_5_6"/>
+      <w:bookmarkStart w:id="24" w:name="section_5_6"/>
       <w:r>
         <w:t>5.6　评论时序与互动角色</w:t>
       </w:r>
-      <w:bookmarkEnd w:id="25"/>
+      <w:bookmarkEnd w:id="24"/>
     </w:p>
     <w:p>
       <w:r>
@@ -6479,11 +6105,11 @@
       <w:pPr>
         <w:pStyle w:val="Heading2"/>
       </w:pPr>
-      <w:bookmarkStart w:id="26" w:name="section_5_7"/>
+      <w:bookmarkStart w:id="25" w:name="section_5_7"/>
       <w:r>
         <w:t>5.7　评论观察窗口的敏感性</w:t>
       </w:r>
-      <w:bookmarkEnd w:id="26"/>
+      <w:bookmarkEnd w:id="25"/>
     </w:p>
     <w:tbl>
       <w:tblPr>
@@ -6731,21 +6357,21 @@
       <w:pPr>
         <w:pStyle w:val="Heading1"/>
       </w:pPr>
-      <w:bookmarkStart w:id="27" w:name="chapter_6"/>
+      <w:bookmarkStart w:id="26" w:name="chapter_6"/>
       <w:r>
         <w:t>第六章 结果与解释</w:t>
       </w:r>
-      <w:bookmarkEnd w:id="27"/>
+      <w:bookmarkEnd w:id="26"/>
     </w:p>
     <w:p>
       <w:pPr>
         <w:pStyle w:val="Heading2"/>
       </w:pPr>
-      <w:bookmarkStart w:id="28" w:name="section_6_1"/>
+      <w:bookmarkStart w:id="27" w:name="section_6_1"/>
       <w:r>
         <w:t>6.1　主回归结果</w:t>
       </w:r>
-      <w:bookmarkEnd w:id="28"/>
+      <w:bookmarkEnd w:id="27"/>
     </w:p>
     <w:tbl>
       <w:tblPr>
@@ -7354,11 +6980,11 @@
       <w:pPr>
         <w:pStyle w:val="Heading2"/>
       </w:pPr>
-      <w:bookmarkStart w:id="29" w:name="section_6_2"/>
+      <w:bookmarkStart w:id="28" w:name="section_6_2"/>
       <w:r>
         <w:t>6.2　回归系数的量级与解释</w:t>
       </w:r>
-      <w:bookmarkEnd w:id="29"/>
+      <w:bookmarkEnd w:id="28"/>
     </w:p>
     <w:p>
       <w:r>
@@ -7449,11 +7075,11 @@
       <w:pPr>
         <w:pStyle w:val="Heading2"/>
       </w:pPr>
-      <w:bookmarkStart w:id="30" w:name="section_6_3"/>
+      <w:bookmarkStart w:id="29" w:name="section_6_3"/>
       <w:r>
         <w:t>6.3　样本与模型设定的稳健性</w:t>
       </w:r>
-      <w:bookmarkEnd w:id="30"/>
+      <w:bookmarkEnd w:id="29"/>
     </w:p>
     <w:p>
       <w:r>
@@ -7857,11 +7483,11 @@
       <w:pPr>
         <w:pStyle w:val="Heading2"/>
       </w:pPr>
-      <w:bookmarkStart w:id="31" w:name="section_6_4"/>
+      <w:bookmarkStart w:id="30" w:name="section_6_4"/>
       <w:r>
         <w:t>6.4　逐作者剔除的敏感性</w:t>
       </w:r>
-      <w:bookmarkEnd w:id="31"/>
+      <w:bookmarkEnd w:id="30"/>
     </w:p>
     <w:p>
       <w:r>
@@ -8204,11 +7830,11 @@
       <w:pPr>
         <w:pStyle w:val="Heading2"/>
       </w:pPr>
-      <w:bookmarkStart w:id="32" w:name="section_6_5"/>
+      <w:bookmarkStart w:id="31" w:name="section_6_5"/>
       <w:r>
         <w:t>6.5　主题权重的回归检验</w:t>
       </w:r>
-      <w:bookmarkEnd w:id="32"/>
+      <w:bookmarkEnd w:id="31"/>
     </w:p>
     <w:p>
       <w:r>
@@ -8521,1040 +8147,11 @@
       <w:pPr>
         <w:pStyle w:val="Heading2"/>
       </w:pPr>
-      <w:bookmarkStart w:id="33" w:name="section_6_6"/>
+      <w:bookmarkStart w:id="32" w:name="section_6_6"/>
       <w:r>
-        <w:t>6.6　留出预测结果</w:t>
+        <w:t>6.6　综合讨论与研究局限</w:t>
       </w:r>
-      <w:bookmarkEnd w:id="33"/>
-    </w:p>
-    <w:p>
-      <w:r>
-        <w:drawing>
-          <wp:inline xmlns:a="http://schemas.openxmlformats.org/drawingml/2006/main" xmlns:pic="http://schemas.openxmlformats.org/drawingml/2006/picture">
-            <wp:extent cx="5940000" cy="1986838"/>
-            <wp:docPr id="12" name="Picture 12"/>
-            <wp:cNvGraphicFramePr>
-              <a:graphicFrameLocks noChangeAspect="1"/>
-            </wp:cNvGraphicFramePr>
-            <a:graphic>
-              <a:graphicData uri="http://schemas.openxmlformats.org/drawingml/2006/picture">
-                <pic:pic>
-                  <pic:nvPicPr>
-                    <pic:cNvPr id="0" name="10_prediction_comparison.png"/>
-                    <pic:cNvPicPr/>
-                  </pic:nvPicPr>
-                  <pic:blipFill>
-                    <a:blip r:embed="rId20"/>
-                    <a:stretch>
-                      <a:fillRect/>
-                    </a:stretch>
-                  </pic:blipFill>
-                  <pic:spPr>
-                    <a:xfrm>
-                      <a:off x="0" y="0"/>
-                      <a:ext cx="5940000" cy="1986838"/>
-                    </a:xfrm>
-                    <a:prstGeom prst="rect"/>
-                  </pic:spPr>
-                </pic:pic>
-              </a:graphicData>
-            </a:graphic>
-          </wp:inline>
-        </w:drawing>
-      </w:r>
-    </w:p>
-    <w:p>
-      <w:pPr>
-        <w:pStyle w:val="Caption"/>
-      </w:pPr>
-      <w:r>
-        <w:t>图12　两种划分下四类模型的留出MAE。误差均在ln(1+点赞数)尺度计算，越小越好。</w:t>
-      </w:r>
-    </w:p>
-    <w:tbl>
-      <w:tblPr>
-        <w:tblStyle w:val="LightShading-Accent1"/>
-        <w:tblW w:type="auto" w:w="0"/>
-        <w:tblLook w:firstColumn="1" w:firstRow="1" w:lastColumn="0" w:lastRow="0" w:noHBand="0" w:noVBand="1" w:val="04A0"/>
-      </w:tblPr>
-      <w:tblGrid>
-        <w:gridCol w:w="1928"/>
-        <w:gridCol w:w="1928"/>
-        <w:gridCol w:w="1928"/>
-        <w:gridCol w:w="1928"/>
-        <w:gridCol w:w="1928"/>
-      </w:tblGrid>
-      <w:tr>
-        <w:tc>
-          <w:tcPr>
-            <w:tcW w:type="dxa" w:w="1928"/>
-          </w:tcPr>
-          <w:p>
-            <w:r>
-              <w:t>划分</w:t>
-            </w:r>
-          </w:p>
-        </w:tc>
-        <w:tc>
-          <w:tcPr>
-            <w:tcW w:type="dxa" w:w="1928"/>
-          </w:tcPr>
-          <w:p>
-            <w:r>
-              <w:t>模型</w:t>
-            </w:r>
-          </w:p>
-        </w:tc>
-        <w:tc>
-          <w:tcPr>
-            <w:tcW w:type="dxa" w:w="1928"/>
-          </w:tcPr>
-          <w:p>
-            <w:r>
-              <w:t>MAE</w:t>
-            </w:r>
-          </w:p>
-        </w:tc>
-        <w:tc>
-          <w:tcPr>
-            <w:tcW w:type="dxa" w:w="1928"/>
-          </w:tcPr>
-          <w:p>
-            <w:r>
-              <w:t>RMSE</w:t>
-            </w:r>
-          </w:p>
-        </w:tc>
-        <w:tc>
-          <w:tcPr>
-            <w:tcW w:type="dxa" w:w="1928"/>
-          </w:tcPr>
-          <w:p>
-            <w:r>
-              <w:t>R²</w:t>
-            </w:r>
-          </w:p>
-        </w:tc>
-      </w:tr>
-      <w:tr>
-        <w:tc>
-          <w:tcPr>
-            <w:tcW w:type="dxa" w:w="1928"/>
-          </w:tcPr>
-          <w:p>
-            <w:r>
-              <w:t>时间留出</w:t>
-            </w:r>
-          </w:p>
-        </w:tc>
-        <w:tc>
-          <w:tcPr>
-            <w:tcW w:type="dxa" w:w="1928"/>
-          </w:tcPr>
-          <w:p>
-            <w:r>
-              <w:t>训练集均值</w:t>
-            </w:r>
-          </w:p>
-        </w:tc>
-        <w:tc>
-          <w:tcPr>
-            <w:tcW w:type="dxa" w:w="1928"/>
-          </w:tcPr>
-          <w:p>
-            <w:r>
-              <w:t>1.2452</w:t>
-            </w:r>
-          </w:p>
-        </w:tc>
-        <w:tc>
-          <w:tcPr>
-            <w:tcW w:type="dxa" w:w="1928"/>
-          </w:tcPr>
-          <w:p>
-            <w:r>
-              <w:t>1.4100</w:t>
-            </w:r>
-          </w:p>
-        </w:tc>
-        <w:tc>
-          <w:tcPr>
-            <w:tcW w:type="dxa" w:w="1928"/>
-          </w:tcPr>
-          <w:p>
-            <w:r>
-              <w:t>-0.007</w:t>
-            </w:r>
-          </w:p>
-        </w:tc>
-      </w:tr>
-      <w:tr>
-        <w:tc>
-          <w:tcPr>
-            <w:tcW w:type="dxa" w:w="1928"/>
-          </w:tcPr>
-          <w:p>
-            <w:r>
-              <w:t>时间留出</w:t>
-            </w:r>
-          </w:p>
-        </w:tc>
-        <w:tc>
-          <w:tcPr>
-            <w:tcW w:type="dxa" w:w="1928"/>
-          </w:tcPr>
-          <w:p>
-            <w:r>
-              <w:t>结构化基线</w:t>
-            </w:r>
-          </w:p>
-        </w:tc>
-        <w:tc>
-          <w:tcPr>
-            <w:tcW w:type="dxa" w:w="1928"/>
-          </w:tcPr>
-          <w:p>
-            <w:r>
-              <w:t>0.5641</w:t>
-            </w:r>
-          </w:p>
-        </w:tc>
-        <w:tc>
-          <w:tcPr>
-            <w:tcW w:type="dxa" w:w="1928"/>
-          </w:tcPr>
-          <w:p>
-            <w:r>
-              <w:t>0.7933</w:t>
-            </w:r>
-          </w:p>
-        </w:tc>
-        <w:tc>
-          <w:tcPr>
-            <w:tcW w:type="dxa" w:w="1928"/>
-          </w:tcPr>
-          <w:p>
-            <w:r>
-              <w:t>0.681</w:t>
-            </w:r>
-          </w:p>
-        </w:tc>
-      </w:tr>
-      <w:tr>
-        <w:tc>
-          <w:tcPr>
-            <w:tcW w:type="dxa" w:w="1928"/>
-          </w:tcPr>
-          <w:p>
-            <w:r>
-              <w:t>时间留出</w:t>
-            </w:r>
-          </w:p>
-        </w:tc>
-        <w:tc>
-          <w:tcPr>
-            <w:tcW w:type="dxa" w:w="1928"/>
-          </w:tcPr>
-          <w:p>
-            <w:r>
-              <w:t>结构化＋词典</w:t>
-            </w:r>
-          </w:p>
-        </w:tc>
-        <w:tc>
-          <w:tcPr>
-            <w:tcW w:type="dxa" w:w="1928"/>
-          </w:tcPr>
-          <w:p>
-            <w:r>
-              <w:t>0.5687</w:t>
-            </w:r>
-          </w:p>
-        </w:tc>
-        <w:tc>
-          <w:tcPr>
-            <w:tcW w:type="dxa" w:w="1928"/>
-          </w:tcPr>
-          <w:p>
-            <w:r>
-              <w:t>0.7971</w:t>
-            </w:r>
-          </w:p>
-        </w:tc>
-        <w:tc>
-          <w:tcPr>
-            <w:tcW w:type="dxa" w:w="1928"/>
-          </w:tcPr>
-          <w:p>
-            <w:r>
-              <w:t>0.678</w:t>
-            </w:r>
-          </w:p>
-        </w:tc>
-      </w:tr>
-      <w:tr>
-        <w:tc>
-          <w:tcPr>
-            <w:tcW w:type="dxa" w:w="1928"/>
-          </w:tcPr>
-          <w:p>
-            <w:r>
-              <w:t>时间留出</w:t>
-            </w:r>
-          </w:p>
-        </w:tc>
-        <w:tc>
-          <w:tcPr>
-            <w:tcW w:type="dxa" w:w="1928"/>
-          </w:tcPr>
-          <w:p>
-            <w:r>
-              <w:t>结构化＋词典＋字符文本</w:t>
-            </w:r>
-          </w:p>
-        </w:tc>
-        <w:tc>
-          <w:tcPr>
-            <w:tcW w:type="dxa" w:w="1928"/>
-          </w:tcPr>
-          <w:p>
-            <w:r>
-              <w:t>0.5656</w:t>
-            </w:r>
-          </w:p>
-        </w:tc>
-        <w:tc>
-          <w:tcPr>
-            <w:tcW w:type="dxa" w:w="1928"/>
-          </w:tcPr>
-          <w:p>
-            <w:r>
-              <w:t>0.7952</w:t>
-            </w:r>
-          </w:p>
-        </w:tc>
-        <w:tc>
-          <w:tcPr>
-            <w:tcW w:type="dxa" w:w="1928"/>
-          </w:tcPr>
-          <w:p>
-            <w:r>
-              <w:t>0.680</w:t>
-            </w:r>
-          </w:p>
-        </w:tc>
-      </w:tr>
-      <w:tr>
-        <w:tc>
-          <w:tcPr>
-            <w:tcW w:type="dxa" w:w="1928"/>
-          </w:tcPr>
-          <w:p>
-            <w:r>
-              <w:t>作者分组五折</w:t>
-            </w:r>
-          </w:p>
-        </w:tc>
-        <w:tc>
-          <w:tcPr>
-            <w:tcW w:type="dxa" w:w="1928"/>
-          </w:tcPr>
-          <w:p>
-            <w:r>
-              <w:t>训练集均值</w:t>
-            </w:r>
-          </w:p>
-        </w:tc>
-        <w:tc>
-          <w:tcPr>
-            <w:tcW w:type="dxa" w:w="1928"/>
-          </w:tcPr>
-          <w:p>
-            <w:r>
-              <w:t>1.2417</w:t>
-            </w:r>
-          </w:p>
-        </w:tc>
-        <w:tc>
-          <w:tcPr>
-            <w:tcW w:type="dxa" w:w="1928"/>
-          </w:tcPr>
-          <w:p>
-            <w:r>
-              <w:t>1.4148</w:t>
-            </w:r>
-          </w:p>
-        </w:tc>
-        <w:tc>
-          <w:tcPr>
-            <w:tcW w:type="dxa" w:w="1928"/>
-          </w:tcPr>
-          <w:p>
-            <w:r>
-              <w:t>-0.038</w:t>
-            </w:r>
-          </w:p>
-        </w:tc>
-      </w:tr>
-      <w:tr>
-        <w:tc>
-          <w:tcPr>
-            <w:tcW w:type="dxa" w:w="1928"/>
-          </w:tcPr>
-          <w:p>
-            <w:r>
-              <w:t>作者分组五折</w:t>
-            </w:r>
-          </w:p>
-        </w:tc>
-        <w:tc>
-          <w:tcPr>
-            <w:tcW w:type="dxa" w:w="1928"/>
-          </w:tcPr>
-          <w:p>
-            <w:r>
-              <w:t>结构化基线</w:t>
-            </w:r>
-          </w:p>
-        </w:tc>
-        <w:tc>
-          <w:tcPr>
-            <w:tcW w:type="dxa" w:w="1928"/>
-          </w:tcPr>
-          <w:p>
-            <w:r>
-              <w:t>0.7180</w:t>
-            </w:r>
-          </w:p>
-        </w:tc>
-        <w:tc>
-          <w:tcPr>
-            <w:tcW w:type="dxa" w:w="1928"/>
-          </w:tcPr>
-          <w:p>
-            <w:r>
-              <w:t>0.9837</w:t>
-            </w:r>
-          </w:p>
-        </w:tc>
-        <w:tc>
-          <w:tcPr>
-            <w:tcW w:type="dxa" w:w="1928"/>
-          </w:tcPr>
-          <w:p>
-            <w:r>
-              <w:t>0.498</w:t>
-            </w:r>
-          </w:p>
-        </w:tc>
-      </w:tr>
-      <w:tr>
-        <w:tc>
-          <w:tcPr>
-            <w:tcW w:type="dxa" w:w="1928"/>
-          </w:tcPr>
-          <w:p>
-            <w:r>
-              <w:t>作者分组五折</w:t>
-            </w:r>
-          </w:p>
-        </w:tc>
-        <w:tc>
-          <w:tcPr>
-            <w:tcW w:type="dxa" w:w="1928"/>
-          </w:tcPr>
-          <w:p>
-            <w:r>
-              <w:t>结构化＋词典</w:t>
-            </w:r>
-          </w:p>
-        </w:tc>
-        <w:tc>
-          <w:tcPr>
-            <w:tcW w:type="dxa" w:w="1928"/>
-          </w:tcPr>
-          <w:p>
-            <w:r>
-              <w:t>0.7141</w:t>
-            </w:r>
-          </w:p>
-        </w:tc>
-        <w:tc>
-          <w:tcPr>
-            <w:tcW w:type="dxa" w:w="1928"/>
-          </w:tcPr>
-          <w:p>
-            <w:r>
-              <w:t>0.9722</w:t>
-            </w:r>
-          </w:p>
-        </w:tc>
-        <w:tc>
-          <w:tcPr>
-            <w:tcW w:type="dxa" w:w="1928"/>
-          </w:tcPr>
-          <w:p>
-            <w:r>
-              <w:t>0.510</w:t>
-            </w:r>
-          </w:p>
-        </w:tc>
-      </w:tr>
-      <w:tr>
-        <w:tc>
-          <w:tcPr>
-            <w:tcW w:type="dxa" w:w="1928"/>
-          </w:tcPr>
-          <w:p>
-            <w:r>
-              <w:t>作者分组五折</w:t>
-            </w:r>
-          </w:p>
-        </w:tc>
-        <w:tc>
-          <w:tcPr>
-            <w:tcW w:type="dxa" w:w="1928"/>
-          </w:tcPr>
-          <w:p>
-            <w:r>
-              <w:t>结构化＋词典＋字符文本</w:t>
-            </w:r>
-          </w:p>
-        </w:tc>
-        <w:tc>
-          <w:tcPr>
-            <w:tcW w:type="dxa" w:w="1928"/>
-          </w:tcPr>
-          <w:p>
-            <w:r>
-              <w:t>0.7164</w:t>
-            </w:r>
-          </w:p>
-        </w:tc>
-        <w:tc>
-          <w:tcPr>
-            <w:tcW w:type="dxa" w:w="1928"/>
-          </w:tcPr>
-          <w:p>
-            <w:r>
-              <w:t>0.9711</w:t>
-            </w:r>
-          </w:p>
-        </w:tc>
-        <w:tc>
-          <w:tcPr>
-            <w:tcW w:type="dxa" w:w="1928"/>
-          </w:tcPr>
-          <w:p>
-            <w:r>
-              <w:t>0.511</w:t>
-            </w:r>
-          </w:p>
-        </w:tc>
-      </w:tr>
-    </w:tbl>
-    <w:p>
-      <w:r>
-        <w:t>结构化基线在两种划分中均明显优于训练集均值，说明现有作者与帖子元数据具有一定的样本外预测信息。时间留出中，加入词典和字符文本后MAE均未低于结构化基线；作者分组五折中，改进幅度则很小，且不同文本表示的排序并不一致。</w:t>
-      </w:r>
-    </w:p>
-    <w:p>
-      <w:r>
-        <w:t>两种划分面向不同对象，不宜把误差差距全部归因于单一因素；样本内固定效应R²也不与此表R²直接比较。</w:t>
-      </w:r>
-    </w:p>
-    <w:p>
-      <w:r>
-        <w:br w:type="page"/>
-      </w:r>
-    </w:p>
-    <w:p>
-      <w:pPr>
-        <w:pStyle w:val="Subtitle"/>
-      </w:pPr>
-      <w:r>
-        <w:t>第六章 结果与解释</w:t>
-      </w:r>
-    </w:p>
-    <w:p>
-      <w:pPr>
-        <w:pStyle w:val="Heading2"/>
-      </w:pPr>
-      <w:bookmarkStart w:id="34" w:name="section_6_7"/>
-      <w:r>
-        <w:t>6.7　预测不确定性与重复文本检验</w:t>
-      </w:r>
-      <w:bookmarkEnd w:id="34"/>
-    </w:p>
-    <w:p>
-      <w:r>
-        <w:drawing>
-          <wp:inline xmlns:a="http://schemas.openxmlformats.org/drawingml/2006/main" xmlns:pic="http://schemas.openxmlformats.org/drawingml/2006/picture">
-            <wp:extent cx="5940000" cy="1878411"/>
-            <wp:docPr id="13" name="Picture 13"/>
-            <wp:cNvGraphicFramePr>
-              <a:graphicFrameLocks noChangeAspect="1"/>
-            </wp:cNvGraphicFramePr>
-            <a:graphic>
-              <a:graphicData uri="http://schemas.openxmlformats.org/drawingml/2006/picture">
-                <pic:pic>
-                  <pic:nvPicPr>
-                    <pic:cNvPr id="0" name="11_prediction_uncertainty.png"/>
-                    <pic:cNvPicPr/>
-                  </pic:nvPicPr>
-                  <pic:blipFill>
-                    <a:blip r:embed="rId21"/>
-                    <a:stretch>
-                      <a:fillRect/>
-                    </a:stretch>
-                  </pic:blipFill>
-                  <pic:spPr>
-                    <a:xfrm>
-                      <a:off x="0" y="0"/>
-                      <a:ext cx="5940000" cy="1878411"/>
-                    </a:xfrm>
-                    <a:prstGeom prst="rect"/>
-                  </pic:spPr>
-                </pic:pic>
-              </a:graphicData>
-            </a:graphic>
-          </wp:inline>
-        </w:drawing>
-      </w:r>
-    </w:p>
-    <w:p>
-      <w:pPr>
-        <w:pStyle w:val="Caption"/>
-      </w:pPr>
-      <w:r>
-        <w:t>图13　增强模型相对基线的MAE差，负值表示误差降低。区间为2,000次按作者聚类重采样的95%百分位区间。</w:t>
-      </w:r>
-    </w:p>
-    <w:tbl>
-      <w:tblPr>
-        <w:tblStyle w:val="LightShading-Accent1"/>
-        <w:tblW w:type="auto" w:w="0"/>
-        <w:tblLook w:firstColumn="1" w:firstRow="1" w:lastColumn="0" w:lastRow="0" w:noHBand="0" w:noVBand="1" w:val="04A0"/>
-      </w:tblPr>
-      <w:tblGrid>
-        <w:gridCol w:w="2409"/>
-        <w:gridCol w:w="2409"/>
-        <w:gridCol w:w="2409"/>
-        <w:gridCol w:w="2409"/>
-      </w:tblGrid>
-      <w:tr>
-        <w:tc>
-          <w:tcPr>
-            <w:tcW w:type="dxa" w:w="2409"/>
-          </w:tcPr>
-          <w:p>
-            <w:r>
-              <w:t>划分</w:t>
-            </w:r>
-          </w:p>
-        </w:tc>
-        <w:tc>
-          <w:tcPr>
-            <w:tcW w:type="dxa" w:w="2409"/>
-          </w:tcPr>
-          <w:p>
-            <w:r>
-              <w:t>相对结构化基线</w:t>
-            </w:r>
-          </w:p>
-        </w:tc>
-        <w:tc>
-          <w:tcPr>
-            <w:tcW w:type="dxa" w:w="2409"/>
-          </w:tcPr>
-          <w:p>
-            <w:r>
-              <w:t>ΔMAE</w:t>
-            </w:r>
-          </w:p>
-        </w:tc>
-        <w:tc>
-          <w:tcPr>
-            <w:tcW w:type="dxa" w:w="2409"/>
-          </w:tcPr>
-          <w:p>
-            <w:r>
-              <w:t>95%区间</w:t>
-            </w:r>
-          </w:p>
-        </w:tc>
-      </w:tr>
-      <w:tr>
-        <w:tc>
-          <w:tcPr>
-            <w:tcW w:type="dxa" w:w="2409"/>
-          </w:tcPr>
-          <w:p>
-            <w:r>
-              <w:t>时间留出</w:t>
-            </w:r>
-          </w:p>
-        </w:tc>
-        <w:tc>
-          <w:tcPr>
-            <w:tcW w:type="dxa" w:w="2409"/>
-          </w:tcPr>
-          <w:p>
-            <w:r>
-              <w:t>词典</w:t>
-            </w:r>
-          </w:p>
-        </w:tc>
-        <w:tc>
-          <w:tcPr>
-            <w:tcW w:type="dxa" w:w="2409"/>
-          </w:tcPr>
-          <w:p>
-            <w:r>
-              <w:t>+0.0046</w:t>
-            </w:r>
-          </w:p>
-        </w:tc>
-        <w:tc>
-          <w:tcPr>
-            <w:tcW w:type="dxa" w:w="2409"/>
-          </w:tcPr>
-          <w:p>
-            <w:r>
-              <w:t>[-0.0001, +0.0098]</w:t>
-            </w:r>
-          </w:p>
-        </w:tc>
-      </w:tr>
-      <w:tr>
-        <w:tc>
-          <w:tcPr>
-            <w:tcW w:type="dxa" w:w="2409"/>
-          </w:tcPr>
-          <w:p>
-            <w:r>
-              <w:t>时间留出</w:t>
-            </w:r>
-          </w:p>
-        </w:tc>
-        <w:tc>
-          <w:tcPr>
-            <w:tcW w:type="dxa" w:w="2409"/>
-          </w:tcPr>
-          <w:p>
-            <w:r>
-              <w:t>词典＋字符文本</w:t>
-            </w:r>
-          </w:p>
-        </w:tc>
-        <w:tc>
-          <w:tcPr>
-            <w:tcW w:type="dxa" w:w="2409"/>
-          </w:tcPr>
-          <w:p>
-            <w:r>
-              <w:t>+0.0015</w:t>
-            </w:r>
-          </w:p>
-        </w:tc>
-        <w:tc>
-          <w:tcPr>
-            <w:tcW w:type="dxa" w:w="2409"/>
-          </w:tcPr>
-          <w:p>
-            <w:r>
-              <w:t>[-0.0060, +0.0093]</w:t>
-            </w:r>
-          </w:p>
-        </w:tc>
-      </w:tr>
-      <w:tr>
-        <w:tc>
-          <w:tcPr>
-            <w:tcW w:type="dxa" w:w="2409"/>
-          </w:tcPr>
-          <w:p>
-            <w:r>
-              <w:t>作者分组五折</w:t>
-            </w:r>
-          </w:p>
-        </w:tc>
-        <w:tc>
-          <w:tcPr>
-            <w:tcW w:type="dxa" w:w="2409"/>
-          </w:tcPr>
-          <w:p>
-            <w:r>
-              <w:t>词典</w:t>
-            </w:r>
-          </w:p>
-        </w:tc>
-        <w:tc>
-          <w:tcPr>
-            <w:tcW w:type="dxa" w:w="2409"/>
-          </w:tcPr>
-          <w:p>
-            <w:r>
-              <w:t>-0.0039</w:t>
-            </w:r>
-          </w:p>
-        </w:tc>
-        <w:tc>
-          <w:tcPr>
-            <w:tcW w:type="dxa" w:w="2409"/>
-          </w:tcPr>
-          <w:p>
-            <w:r>
-              <w:t>[-0.0112, +0.0027]</w:t>
-            </w:r>
-          </w:p>
-        </w:tc>
-      </w:tr>
-      <w:tr>
-        <w:tc>
-          <w:tcPr>
-            <w:tcW w:type="dxa" w:w="2409"/>
-          </w:tcPr>
-          <w:p>
-            <w:r>
-              <w:t>作者分组五折</w:t>
-            </w:r>
-          </w:p>
-        </w:tc>
-        <w:tc>
-          <w:tcPr>
-            <w:tcW w:type="dxa" w:w="2409"/>
-          </w:tcPr>
-          <w:p>
-            <w:r>
-              <w:t>词典＋字符文本</w:t>
-            </w:r>
-          </w:p>
-        </w:tc>
-        <w:tc>
-          <w:tcPr>
-            <w:tcW w:type="dxa" w:w="2409"/>
-          </w:tcPr>
-          <w:p>
-            <w:r>
-              <w:t>-0.0016</w:t>
-            </w:r>
-          </w:p>
-        </w:tc>
-        <w:tc>
-          <w:tcPr>
-            <w:tcW w:type="dxa" w:w="2409"/>
-          </w:tcPr>
-          <w:p>
-            <w:r>
-              <w:t>[-0.0118, +0.0075]</w:t>
-            </w:r>
-          </w:p>
-        </w:tc>
-      </w:tr>
-    </w:tbl>
-    <w:p>
-      <w:r>
-        <w:t>在固定的留出预测上，按作者保留全部帖子进行配对重采样，以兼顾同一作者内的相关性和各模型对同一帖的预测差异。所有比较区间均包含零，当前评估未显示明确的文本增益。区间没有重新训练模型，因此仅反映给定预测结果下的评估样本不确定性。</w:t>
-      </w:r>
-    </w:p>
-    <w:tbl>
-      <w:tblPr>
-        <w:tblStyle w:val="LightShading-Accent1"/>
-        <w:tblW w:type="auto" w:w="0"/>
-        <w:tblLook w:firstColumn="1" w:firstRow="1" w:lastColumn="0" w:lastRow="0" w:noHBand="0" w:noVBand="1" w:val="04A0"/>
-      </w:tblPr>
-      <w:tblGrid>
-        <w:gridCol w:w="1928"/>
-        <w:gridCol w:w="1928"/>
-        <w:gridCol w:w="1928"/>
-        <w:gridCol w:w="1928"/>
-        <w:gridCol w:w="1928"/>
-      </w:tblGrid>
-      <w:tr>
-        <w:tc>
-          <w:tcPr>
-            <w:tcW w:type="dxa" w:w="1928"/>
-          </w:tcPr>
-          <w:p>
-            <w:r>
-              <w:t>未见正文子集</w:t>
-            </w:r>
-          </w:p>
-        </w:tc>
-        <w:tc>
-          <w:tcPr>
-            <w:tcW w:type="dxa" w:w="1928"/>
-          </w:tcPr>
-          <w:p>
-            <w:r>
-              <w:t>N</w:t>
-            </w:r>
-          </w:p>
-        </w:tc>
-        <w:tc>
-          <w:tcPr>
-            <w:tcW w:type="dxa" w:w="1928"/>
-          </w:tcPr>
-          <w:p>
-            <w:r>
-              <w:t>结构化MAE</w:t>
-            </w:r>
-          </w:p>
-        </w:tc>
-        <w:tc>
-          <w:tcPr>
-            <w:tcW w:type="dxa" w:w="1928"/>
-          </w:tcPr>
-          <w:p>
-            <w:r>
-              <w:t>＋词典</w:t>
-            </w:r>
-          </w:p>
-        </w:tc>
-        <w:tc>
-          <w:tcPr>
-            <w:tcW w:type="dxa" w:w="1928"/>
-          </w:tcPr>
-          <w:p>
-            <w:r>
-              <w:t>＋字符文本</w:t>
-            </w:r>
-          </w:p>
-        </w:tc>
-      </w:tr>
-      <w:tr>
-        <w:tc>
-          <w:tcPr>
-            <w:tcW w:type="dxa" w:w="1928"/>
-          </w:tcPr>
-          <w:p>
-            <w:r>
-              <w:t>时间留出</w:t>
-            </w:r>
-          </w:p>
-        </w:tc>
-        <w:tc>
-          <w:tcPr>
-            <w:tcW w:type="dxa" w:w="1928"/>
-          </w:tcPr>
-          <w:p>
-            <w:r>
-              <w:t>692</w:t>
-            </w:r>
-          </w:p>
-        </w:tc>
-        <w:tc>
-          <w:tcPr>
-            <w:tcW w:type="dxa" w:w="1928"/>
-          </w:tcPr>
-          <w:p>
-            <w:r>
-              <w:t>0.6155</w:t>
-            </w:r>
-          </w:p>
-        </w:tc>
-        <w:tc>
-          <w:tcPr>
-            <w:tcW w:type="dxa" w:w="1928"/>
-          </w:tcPr>
-          <w:p>
-            <w:r>
-              <w:t>0.6253</w:t>
-            </w:r>
-          </w:p>
-        </w:tc>
-        <w:tc>
-          <w:tcPr>
-            <w:tcW w:type="dxa" w:w="1928"/>
-          </w:tcPr>
-          <w:p>
-            <w:r>
-              <w:t>0.6167</w:t>
-            </w:r>
-          </w:p>
-        </w:tc>
-      </w:tr>
-      <w:tr>
-        <w:tc>
-          <w:tcPr>
-            <w:tcW w:type="dxa" w:w="1928"/>
-          </w:tcPr>
-          <w:p>
-            <w:r>
-              <w:t>作者分组五折</w:t>
-            </w:r>
-          </w:p>
-        </w:tc>
-        <w:tc>
-          <w:tcPr>
-            <w:tcW w:type="dxa" w:w="1928"/>
-          </w:tcPr>
-          <w:p>
-            <w:r>
-              <w:t>2947</w:t>
-            </w:r>
-          </w:p>
-        </w:tc>
-        <w:tc>
-          <w:tcPr>
-            <w:tcW w:type="dxa" w:w="1928"/>
-          </w:tcPr>
-          <w:p>
-            <w:r>
-              <w:t>0.7522</w:t>
-            </w:r>
-          </w:p>
-        </w:tc>
-        <w:tc>
-          <w:tcPr>
-            <w:tcW w:type="dxa" w:w="1928"/>
-          </w:tcPr>
-          <w:p>
-            <w:r>
-              <w:t>0.7384</w:t>
-            </w:r>
-          </w:p>
-        </w:tc>
-        <w:tc>
-          <w:tcPr>
-            <w:tcW w:type="dxa" w:w="1928"/>
-          </w:tcPr>
-          <w:p>
-            <w:r>
-              <w:t>0.7447</w:t>
-            </w:r>
-          </w:p>
-        </w:tc>
-      </w:tr>
-    </w:tbl>
-    <w:p>
-      <w:r>
-        <w:t>另限制测试正文至少10个字符，且清理后文本不与该训练集中的正文完全相同，以检查重复模板是否影响判断。时间留出中，字符模型优于词典模型，但仍未优于结构化基线；作者分组中，字符模型未优于词典模型，模型排序未呈现一致优势。这一限制只能排除完全重复文本，不能消除近似改写或共同话题带来的相似性。</w:t>
-      </w:r>
-    </w:p>
-    <w:p>
-      <w:r>
-        <w:br w:type="page"/>
-      </w:r>
-    </w:p>
-    <w:p>
-      <w:pPr>
-        <w:pStyle w:val="Subtitle"/>
-      </w:pPr>
-      <w:r>
-        <w:t>第六章 结果与解释</w:t>
-      </w:r>
-    </w:p>
-    <w:p>
-      <w:pPr>
-        <w:pStyle w:val="Heading2"/>
-      </w:pPr>
-      <w:bookmarkStart w:id="35" w:name="section_6_8"/>
-      <w:r>
-        <w:t>6.8　综合讨论与研究局限</w:t>
-      </w:r>
-      <w:bookmarkEnd w:id="35"/>
+      <w:bookmarkEnd w:id="32"/>
     </w:p>
     <w:tbl>
       <w:tblPr>
@@ -9654,32 +8251,10 @@
           </w:p>
         </w:tc>
       </w:tr>
-      <w:tr>
-        <w:tc>
-          <w:tcPr>
-            <w:tcW w:type="dxa" w:w="4819"/>
-          </w:tcPr>
-          <w:p>
-            <w:r>
-              <w:t>RQ4：文本能否改善预测？</w:t>
-            </w:r>
-          </w:p>
-        </w:tc>
-        <w:tc>
-          <w:tcPr>
-            <w:tcW w:type="dxa" w:w="4819"/>
-          </w:tcPr>
-          <w:p>
-            <w:r>
-              <w:t>词典及字符文本的配对误差差异区间均包含零，两类留出评估未显示明确、稳定的文本增益。</w:t>
-            </w:r>
-          </w:p>
-        </w:tc>
-      </w:tr>
     </w:tbl>
     <w:p>
       <w:r>
-        <w:t>字面词典、潜在主题和字符文本从不同层面表示内容，结果均未提供稳定、明确的点赞增量证据。逐作者剔除说明积极表达的OLS负向点估计并非单一作者造成，但这一结果仍未通过原多重检验和计数模型比较。评论角色与时间窗口分析则表明，互动结构的解释需要考虑帖主回应及晚期评论的纳入范围。</w:t>
+        <w:t>词典特征与潜在主题分别从字面表达和内容模式刻画正文，两类回归均未提供明确、稳定的点赞关联证据。逐作者剔除说明积极表达词的OLS负向点估计并非由单一作者决定，但这一发现仍需结合BH校正与PPML结果理解。评论角色和时间窗口分析则表明，网络互惠性与接收集中度的解释，需要考虑帖主回应及晚期评论的纳入范围。</w:t>
       </w:r>
     </w:p>
     <w:p>
@@ -9738,21 +8313,21 @@
       <w:pPr>
         <w:pStyle w:val="Heading1"/>
       </w:pPr>
-      <w:bookmarkStart w:id="36" w:name="chapter_7"/>
+      <w:bookmarkStart w:id="33" w:name="chapter_7"/>
       <w:r>
         <w:t>第七章 建议</w:t>
       </w:r>
-      <w:bookmarkEnd w:id="36"/>
+      <w:bookmarkEnd w:id="33"/>
     </w:p>
     <w:p>
       <w:pPr>
         <w:pStyle w:val="Heading2"/>
       </w:pPr>
-      <w:bookmarkStart w:id="37" w:name="section_7_1"/>
+      <w:bookmarkStart w:id="34" w:name="section_7_1"/>
       <w:r>
         <w:t>7.1　内容表达与社区互动建议</w:t>
       </w:r>
-      <w:bookmarkEnd w:id="37"/>
+      <w:bookmarkEnd w:id="34"/>
     </w:p>
     <w:p>
       <w:r>
@@ -9939,11 +8514,11 @@
       <w:pPr>
         <w:pStyle w:val="Heading2"/>
       </w:pPr>
-      <w:bookmarkStart w:id="38" w:name="section_7_2"/>
+      <w:bookmarkStart w:id="35" w:name="section_7_2"/>
       <w:r>
         <w:t>7.2　后续研究与对照实验方案</w:t>
       </w:r>
-      <w:bookmarkEnd w:id="38"/>
+      <w:bookmarkEnd w:id="35"/>
     </w:p>
     <w:p>
       <w:r>
@@ -10116,11 +8691,11 @@
       <w:pPr>
         <w:pStyle w:val="Heading1"/>
       </w:pPr>
-      <w:bookmarkStart w:id="39" w:name="references"/>
+      <w:bookmarkStart w:id="36" w:name="references"/>
       <w:r>
         <w:t>参考文献与复现说明</w:t>
       </w:r>
-      <w:bookmarkEnd w:id="39"/>
+      <w:bookmarkEnd w:id="36"/>
     </w:p>
     <w:p>
       <w:r>
@@ -10149,12 +8724,6 @@
         <w:t>[6] 课程数据《KeepData_dictionary.pdf》与两份原始CSV；字段字典和数据原样保留在提交包。</w:t>
         <w:br/>
         <w:t>[7] scikit-learn官方文档：NMF（1.5系列），用于非负矩阵分解与主题提取。</w:t>
-        <w:br/>
-        <w:t>官方链接</w:t>
-        <w:br/>
-        <w:t>。访问：2026-10-17。</w:t>
-        <w:br/>
-        <w:t>[8] scikit-learn官方文档：GroupKFold及交叉验证（1.5系列），用于按作者隔离训练与测试。</w:t>
         <w:br/>
         <w:t>官方链接</w:t>
         <w:br/>
@@ -10201,11 +8770,11 @@
       <w:pPr>
         <w:pStyle w:val="Heading1"/>
       </w:pPr>
-      <w:bookmarkStart w:id="40" w:name="appendix"/>
+      <w:bookmarkStart w:id="37" w:name="appendix"/>
       <w:r>
         <w:t>附录：课程要求与小组分工</w:t>
       </w:r>
-      <w:bookmarkEnd w:id="40"/>
+      <w:bookmarkEnd w:id="37"/>
     </w:p>
     <w:tbl>
       <w:tblPr>
@@ -10366,7 +8935,7 @@
           </w:tcPr>
           <w:p>
             <w:r>
-              <w:t>23页PPTX、逐页讲稿及建议分工表</w:t>
+              <w:t>21页PPTX、逐页讲稿及建议分工表</w:t>
             </w:r>
           </w:p>
         </w:tc>
@@ -10526,7 +9095,7 @@
           </w:tcPr>
           <w:p>
             <w:r>
-              <w:t>回归、样本外预测与稳健性检验</w:t>
+              <w:t>回归、稳健性与测量核查</w:t>
             </w:r>
           </w:p>
         </w:tc>
@@ -10536,7 +9105,7 @@
           </w:tcPr>
           <w:p>
             <w:r>
-              <w:t>11—17</w:t>
+              <w:t>11—15</w:t>
             </w:r>
           </w:p>
         </w:tc>
@@ -10568,7 +9137,7 @@
           </w:tcPr>
           <w:p>
             <w:r>
-              <w:t>18—23</w:t>
+              <w:t>16—21</w:t>
             </w:r>
           </w:p>
         </w:tc>

</xml_diff>

<commit_message>
Separate post topic analysis from comment analysis
</commit_message>
<xml_diff>
--- a/分析报告_可编辑.docx
+++ b/分析报告_可编辑.docx
@@ -618,6 +618,81 @@
       </w:fldSimple>
     </w:p>
     <w:p>
+      <w:pPr>
+        <w:tabs>
+          <w:tab w:pos="9638" w:val="right" w:leader="dot"/>
+        </w:tabs>
+        <w:spacing w:after="0" w:before="0" w:lineRule="exact" w:line="400"/>
+        <w:ind w:left="283"/>
+      </w:pPr>
+      <w:hyperlink w:anchor="section_4_11">
+        <w:r>
+          <w:rPr>
+            <w:color w:val="243746"/>
+          </w:rPr>
+          <w:t>4.11  帖子主题分析的目的与方法</w:t>
+        </w:r>
+      </w:hyperlink>
+      <w:r>
+        <w:tab/>
+      </w:r>
+      <w:fldSimple w:instr="PAGEREF section_4_11 \h" w:dirty="true">
+        <w:r>
+          <w:t>21</w:t>
+        </w:r>
+      </w:fldSimple>
+    </w:p>
+    <w:p>
+      <w:pPr>
+        <w:tabs>
+          <w:tab w:pos="9638" w:val="right" w:leader="dot"/>
+        </w:tabs>
+        <w:spacing w:after="0" w:before="0" w:lineRule="exact" w:line="400"/>
+        <w:ind w:left="283"/>
+      </w:pPr>
+      <w:hyperlink w:anchor="section_4_12">
+        <w:r>
+          <w:rPr>
+            <w:color w:val="243746"/>
+          </w:rPr>
+          <w:t>4.12  帖子主题分布及作者集中度</w:t>
+        </w:r>
+      </w:hyperlink>
+      <w:r>
+        <w:tab/>
+      </w:r>
+      <w:fldSimple w:instr="PAGEREF section_4_12 \h" w:dirty="true">
+        <w:r>
+          <w:t>22</w:t>
+        </w:r>
+      </w:fldSimple>
+    </w:p>
+    <w:p>
+      <w:pPr>
+        <w:tabs>
+          <w:tab w:pos="9638" w:val="right" w:leader="dot"/>
+        </w:tabs>
+        <w:spacing w:after="0" w:before="0" w:lineRule="exact" w:line="400"/>
+        <w:ind w:left="283"/>
+      </w:pPr>
+      <w:hyperlink w:anchor="section_4_13">
+        <w:r>
+          <w:rPr>
+            <w:color w:val="243746"/>
+          </w:rPr>
+          <w:t>4.13  主题权重与点赞的条件关联</w:t>
+        </w:r>
+      </w:hyperlink>
+      <w:r>
+        <w:tab/>
+      </w:r>
+      <w:fldSimple w:instr="PAGEREF section_4_13 \h" w:dirty="true">
+        <w:r>
+          <w:t>23</w:t>
+        </w:r>
+      </w:fldSimple>
+    </w:p>
+    <w:p>
       <w:r>
         <w:br w:type="page"/>
       </w:r>
@@ -651,7 +726,7 @@
             <w:color w:val="243746"/>
             <w:b/>
           </w:rPr>
-          <w:t>第五章 文本与网络分析</w:t>
+          <w:t>第五章 评论文本与互动网络分析</w:t>
         </w:r>
       </w:hyperlink>
       <w:r>
@@ -659,7 +734,7 @@
       </w:r>
       <w:fldSimple w:instr="PAGEREF chapter_5 \h" w:dirty="true">
         <w:r>
-          <w:t>21</w:t>
+          <w:t>24</w:t>
         </w:r>
       </w:fldSimple>
     </w:p>
@@ -676,7 +751,7 @@
           <w:rPr>
             <w:color w:val="243746"/>
           </w:rPr>
-          <w:t>5.1  文本主题分析的目的与方法</w:t>
+          <w:t>5.1  评论文本的范围与常见词语</w:t>
         </w:r>
       </w:hyperlink>
       <w:r>
@@ -684,7 +759,7 @@
       </w:r>
       <w:fldSimple w:instr="PAGEREF section_5_1 \h" w:dirty="true">
         <w:r>
-          <w:t>21</w:t>
+          <w:t>24</w:t>
         </w:r>
       </w:fldSimple>
     </w:p>
@@ -701,7 +776,7 @@
           <w:rPr>
             <w:color w:val="243746"/>
           </w:rPr>
-          <w:t>5.2  主题分布及其作者集中度</w:t>
+          <w:t>5.2  评论字面表达与发言角色</w:t>
         </w:r>
       </w:hyperlink>
       <w:r>
@@ -709,7 +784,7 @@
       </w:r>
       <w:fldSimple w:instr="PAGEREF section_5_2 \h" w:dirty="true">
         <w:r>
-          <w:t>22</w:t>
+          <w:t>25</w:t>
         </w:r>
       </w:fldSimple>
     </w:p>
@@ -726,7 +801,7 @@
           <w:rPr>
             <w:color w:val="243746"/>
           </w:rPr>
-          <w:t>5.3  主题权重与点赞的条件关联</w:t>
+          <w:t>5.3  评论关系识别与建图规则</w:t>
         </w:r>
       </w:hyperlink>
       <w:r>
@@ -734,7 +809,7 @@
       </w:r>
       <w:fldSimple w:instr="PAGEREF section_5_3 \h" w:dirty="true">
         <w:r>
-          <w:t>23</w:t>
+          <w:t>26</w:t>
         </w:r>
       </w:fldSimple>
     </w:p>
@@ -751,7 +826,7 @@
           <w:rPr>
             <w:color w:val="243746"/>
           </w:rPr>
-          <w:t>5.4  评论文本的范围与常见词语</w:t>
+          <w:t>5.4  网络连通性与互惠性</w:t>
         </w:r>
       </w:hyperlink>
       <w:r>
@@ -759,7 +834,7 @@
       </w:r>
       <w:fldSimple w:instr="PAGEREF section_5_4 \h" w:dirty="true">
         <w:r>
-          <w:t>24</w:t>
+          <w:t>27</w:t>
         </w:r>
       </w:fldSimple>
     </w:p>
@@ -776,7 +851,7 @@
           <w:rPr>
             <w:color w:val="243746"/>
           </w:rPr>
-          <w:t>5.5  评论字面表达与发言角色</w:t>
+          <w:t>5.5  互动接收的集中度</w:t>
         </w:r>
       </w:hyperlink>
       <w:r>
@@ -784,7 +859,7 @@
       </w:r>
       <w:fldSimple w:instr="PAGEREF section_5_5 \h" w:dirty="true">
         <w:r>
-          <w:t>25</w:t>
+          <w:t>28</w:t>
         </w:r>
       </w:fldSimple>
     </w:p>
@@ -801,7 +876,7 @@
           <w:rPr>
             <w:color w:val="243746"/>
           </w:rPr>
-          <w:t>5.6  评论关系识别与建图规则</w:t>
+          <w:t>5.6  评论时序与回应角色</w:t>
         </w:r>
       </w:hyperlink>
       <w:r>
@@ -809,7 +884,7 @@
       </w:r>
       <w:fldSimple w:instr="PAGEREF section_5_6 \h" w:dirty="true">
         <w:r>
-          <w:t>26</w:t>
+          <w:t>29</w:t>
         </w:r>
       </w:fldSimple>
     </w:p>
@@ -826,88 +901,13 @@
           <w:rPr>
             <w:color w:val="243746"/>
           </w:rPr>
-          <w:t>5.7  网络连通性与互惠性</w:t>
+          <w:t>5.7  评论观察窗口的敏感性</w:t>
         </w:r>
       </w:hyperlink>
       <w:r>
         <w:tab/>
       </w:r>
       <w:fldSimple w:instr="PAGEREF section_5_7 \h" w:dirty="true">
-        <w:r>
-          <w:t>27</w:t>
-        </w:r>
-      </w:fldSimple>
-    </w:p>
-    <w:p>
-      <w:pPr>
-        <w:tabs>
-          <w:tab w:pos="9638" w:val="right" w:leader="dot"/>
-        </w:tabs>
-        <w:spacing w:after="0" w:before="0" w:lineRule="exact" w:line="400"/>
-        <w:ind w:left="283"/>
-      </w:pPr>
-      <w:hyperlink w:anchor="section_5_8">
-        <w:r>
-          <w:rPr>
-            <w:color w:val="243746"/>
-          </w:rPr>
-          <w:t>5.8  互动接收的集中度</w:t>
-        </w:r>
-      </w:hyperlink>
-      <w:r>
-        <w:tab/>
-      </w:r>
-      <w:fldSimple w:instr="PAGEREF section_5_8 \h" w:dirty="true">
-        <w:r>
-          <w:t>28</w:t>
-        </w:r>
-      </w:fldSimple>
-    </w:p>
-    <w:p>
-      <w:pPr>
-        <w:tabs>
-          <w:tab w:pos="9638" w:val="right" w:leader="dot"/>
-        </w:tabs>
-        <w:spacing w:after="0" w:before="0" w:lineRule="exact" w:line="400"/>
-        <w:ind w:left="283"/>
-      </w:pPr>
-      <w:hyperlink w:anchor="section_5_9">
-        <w:r>
-          <w:rPr>
-            <w:color w:val="243746"/>
-          </w:rPr>
-          <w:t>5.9  评论时序与回应角色</w:t>
-        </w:r>
-      </w:hyperlink>
-      <w:r>
-        <w:tab/>
-      </w:r>
-      <w:fldSimple w:instr="PAGEREF section_5_9 \h" w:dirty="true">
-        <w:r>
-          <w:t>29</w:t>
-        </w:r>
-      </w:fldSimple>
-    </w:p>
-    <w:p>
-      <w:pPr>
-        <w:tabs>
-          <w:tab w:pos="9638" w:val="right" w:leader="dot"/>
-        </w:tabs>
-        <w:spacing w:after="0" w:before="0" w:lineRule="exact" w:line="400"/>
-        <w:ind w:left="283"/>
-      </w:pPr>
-      <w:hyperlink w:anchor="section_5_10">
-        <w:r>
-          <w:rPr>
-            <w:color w:val="243746"/>
-          </w:rPr>
-          <w:t>5.10  评论观察窗口的敏感性</w:t>
-        </w:r>
-      </w:hyperlink>
-      <w:r>
-        <w:tab/>
-      </w:r>
-      <w:fldSimple w:instr="PAGEREF section_5_10 \h" w:dirty="true">
         <w:r>
           <w:t>30</w:t>
         </w:r>
@@ -1435,7 +1435,7 @@
           </w:tcPr>
           <w:p>
             <w:r>
-              <w:t>第4章词典主回归与敏感性检验；第5.1—5.3节主题分析及回归。</w:t>
+              <w:t>第4章：词典主回归、敏感性检验、帖子主题分析及主题回归。</w:t>
             </w:r>
           </w:p>
         </w:tc>
@@ -1467,7 +1467,7 @@
           </w:tcPr>
           <w:p>
             <w:r>
-              <w:t>第5.4—5.5节评论文本；第5.6—5.10节评论网络。</w:t>
+              <w:t>第5.1—5.2节评论文本；第5.3—5.7节评论网络。</w:t>
             </w:r>
           </w:p>
         </w:tc>
@@ -2887,6 +2887,11 @@
         <w:t>4.1　正文预处理与变量构建</w:t>
       </w:r>
       <w:bookmarkEnd w:id="12"/>
+    </w:p>
+    <w:p>
+      <w:r>
+        <w:t>本章以帖子正文为分析对象，围绕RQ2依次构建词典特征、估计主回归，并在第4.11—4.13节开展帖子主题分析及主题回归。各部分共同考察文本与点赞的条件关联。</w:t>
+      </w:r>
     </w:p>
     <w:p>
       <w:r>
@@ -6184,7 +6189,7 @@
     </w:p>
     <w:p>
       <w:r>
-        <w:t>本章完成了字面表达的测量、作者内比较与敏感性检验。下一章先从内容主题补充回答RQ2，随后转向评论文本和用户关系，回答RQ3。</w:t>
+        <w:t>以上完成了字面表达的测量、作者内比较与敏感性检验。以下从帖子内容主题补充回答RQ2，依次说明主题建模、主题分布与主题权重回归。</w:t>
       </w:r>
     </w:p>
     <w:p>
@@ -6194,27 +6199,25 @@
     </w:p>
     <w:p>
       <w:pPr>
-        <w:pStyle w:val="Heading1"/>
+        <w:pStyle w:val="Subtitle"/>
       </w:pPr>
-      <w:bookmarkStart w:id="22" w:name="chapter_5"/>
       <w:r>
-        <w:t>第五章 文本与网络分析</w:t>
+        <w:t>第四章 非结构化数据的结构化与回归分析</w:t>
       </w:r>
-      <w:bookmarkEnd w:id="22"/>
     </w:p>
     <w:p>
       <w:pPr>
         <w:pStyle w:val="Heading2"/>
       </w:pPr>
-      <w:bookmarkStart w:id="23" w:name="section_5_1"/>
+      <w:bookmarkStart w:id="22" w:name="section_4_11"/>
       <w:r>
-        <w:t>5.1　文本主题分析的目的与方法</w:t>
+        <w:t>4.11　帖子主题分析的目的与方法</w:t>
       </w:r>
-      <w:bookmarkEnd w:id="23"/>
+      <w:bookmarkEnd w:id="22"/>
     </w:p>
     <w:p>
       <w:r>
-        <w:t>本章继续回答RQ2，并在第5.4节转向RQ3。词典特征检验预先界定的字面表达，主题分析概括正文主要谈论的内容。通过这一补充，可以考察内容模式与点赞的条件关联，同时保留两类文本表示各自的测量范围。</w:t>
+        <w:t>本节从内容主题补充回答RQ2。前面的词典回归检验预先界定的字面表达，主题分析概括正文主要谈论的内容。通过这一补充，可以考察内容模式与点赞的条件关联，同时保留两类文本表示各自的测量范围。</w:t>
       </w:r>
     </w:p>
     <w:p>
@@ -6655,18 +6658,18 @@
         <w:pStyle w:val="Subtitle"/>
       </w:pPr>
       <w:r>
-        <w:t>第五章 文本与网络分析</w:t>
+        <w:t>第四章 非结构化数据的结构化与回归分析</w:t>
       </w:r>
     </w:p>
     <w:p>
       <w:pPr>
         <w:pStyle w:val="Heading2"/>
       </w:pPr>
-      <w:bookmarkStart w:id="24" w:name="section_5_2"/>
+      <w:bookmarkStart w:id="23" w:name="section_4_12"/>
       <w:r>
-        <w:t>5.2　主题分布及其作者集中度</w:t>
+        <w:t>4.12　帖子主题分布及作者集中度</w:t>
       </w:r>
-      <w:bookmarkEnd w:id="24"/>
+      <w:bookmarkEnd w:id="23"/>
     </w:p>
     <w:p>
       <w:r>
@@ -6745,18 +6748,18 @@
         <w:pStyle w:val="Subtitle"/>
       </w:pPr>
       <w:r>
-        <w:t>第五章 文本与网络分析</w:t>
+        <w:t>第四章 非结构化数据的结构化与回归分析</w:t>
       </w:r>
     </w:p>
     <w:p>
       <w:pPr>
         <w:pStyle w:val="Heading2"/>
       </w:pPr>
-      <w:bookmarkStart w:id="25" w:name="section_5_3"/>
+      <w:bookmarkStart w:id="24" w:name="section_4_13"/>
       <w:r>
-        <w:t>5.3　主题权重与点赞的条件关联</w:t>
+        <w:t>4.13　主题权重与点赞的条件关联</w:t>
       </w:r>
-      <w:bookmarkEnd w:id="25"/>
+      <w:bookmarkEnd w:id="24"/>
     </w:p>
     <w:p>
       <w:r>
@@ -7062,30 +7065,37 @@
     </w:p>
     <w:p>
       <w:r>
+        <w:t>至此，帖子文本的字面特征与内容主题均已完成结构化及回归检验。下一章转向评论文本与用户连接，独立回答RQ3。</w:t>
+      </w:r>
+    </w:p>
+    <w:p>
+      <w:r>
         <w:br w:type="page"/>
       </w:r>
     </w:p>
     <w:p>
       <w:pPr>
-        <w:pStyle w:val="Subtitle"/>
+        <w:pStyle w:val="Heading1"/>
       </w:pPr>
+      <w:bookmarkStart w:id="25" w:name="chapter_5"/>
       <w:r>
-        <w:t>第五章 文本与网络分析</w:t>
+        <w:t>第五章 评论文本与互动网络分析</w:t>
       </w:r>
+      <w:bookmarkEnd w:id="25"/>
     </w:p>
     <w:p>
       <w:pPr>
         <w:pStyle w:val="Heading2"/>
       </w:pPr>
-      <w:bookmarkStart w:id="26" w:name="section_5_4"/>
+      <w:bookmarkStart w:id="26" w:name="section_5_1"/>
       <w:r>
-        <w:t>5.4　评论文本的范围与常见词语</w:t>
+        <w:t>5.1　评论文本的范围与常见词语</w:t>
       </w:r>
       <w:bookmarkEnd w:id="26"/>
     </w:p>
     <w:p>
       <w:r>
-        <w:t>本节开始回答RQ3，先描述评论内容，再分析关系结构。文本统计使用全部11,595条去重评论，保留不同评论ID下的重复短句及84次自我互动；后续网络另行排除自我事件。</w:t>
+        <w:t>本章专门回答RQ3，先描述评论内容，再分析关系结构。分析对象由帖子正文转向已采集的评论。文本统计使用全部11,595条去重评论，保留不同评论ID下的重复短句及84次自我互动；后续网络另行排除自我事件。</w:t>
       </w:r>
     </w:p>
     <w:tbl>
@@ -7251,16 +7261,16 @@
         <w:pStyle w:val="Subtitle"/>
       </w:pPr>
       <w:r>
-        <w:t>第五章 文本与网络分析</w:t>
+        <w:t>第五章 评论文本与互动网络分析</w:t>
       </w:r>
     </w:p>
     <w:p>
       <w:pPr>
         <w:pStyle w:val="Heading2"/>
       </w:pPr>
-      <w:bookmarkStart w:id="27" w:name="section_5_5"/>
+      <w:bookmarkStart w:id="27" w:name="section_5_2"/>
       <w:r>
-        <w:t>5.5　评论字面表达与发言角色</w:t>
+        <w:t>5.2　评论字面表达与发言角色</w:t>
       </w:r>
       <w:bookmarkEnd w:id="27"/>
     </w:p>
@@ -7551,16 +7561,16 @@
         <w:pStyle w:val="Subtitle"/>
       </w:pPr>
       <w:r>
-        <w:t>第五章 文本与网络分析</w:t>
+        <w:t>第五章 评论文本与互动网络分析</w:t>
       </w:r>
     </w:p>
     <w:p>
       <w:pPr>
         <w:pStyle w:val="Heading2"/>
       </w:pPr>
-      <w:bookmarkStart w:id="28" w:name="section_5_6"/>
+      <w:bookmarkStart w:id="28" w:name="section_5_3"/>
       <w:r>
-        <w:t>5.6　评论关系识别与建图规则</w:t>
+        <w:t>5.3　评论关系识别与建图规则</w:t>
       </w:r>
       <w:bookmarkEnd w:id="28"/>
     </w:p>
@@ -7797,16 +7807,16 @@
         <w:pStyle w:val="Subtitle"/>
       </w:pPr>
       <w:r>
-        <w:t>第五章 文本与网络分析</w:t>
+        <w:t>第五章 评论文本与互动网络分析</w:t>
       </w:r>
     </w:p>
     <w:p>
       <w:pPr>
         <w:pStyle w:val="Heading2"/>
       </w:pPr>
-      <w:bookmarkStart w:id="29" w:name="section_5_7"/>
+      <w:bookmarkStart w:id="29" w:name="section_5_4"/>
       <w:r>
-        <w:t>5.7　网络连通性与互惠性</w:t>
+        <w:t>5.4　网络连通性与互惠性</w:t>
       </w:r>
       <w:bookmarkEnd w:id="29"/>
     </w:p>
@@ -8078,16 +8088,16 @@
         <w:pStyle w:val="Subtitle"/>
       </w:pPr>
       <w:r>
-        <w:t>第五章 文本与网络分析</w:t>
+        <w:t>第五章 评论文本与互动网络分析</w:t>
       </w:r>
     </w:p>
     <w:p>
       <w:pPr>
         <w:pStyle w:val="Heading2"/>
       </w:pPr>
-      <w:bookmarkStart w:id="30" w:name="section_5_8"/>
+      <w:bookmarkStart w:id="30" w:name="section_5_5"/>
       <w:r>
-        <w:t>5.8　互动接收的集中度</w:t>
+        <w:t>5.5　互动接收的集中度</w:t>
       </w:r>
       <w:bookmarkEnd w:id="30"/>
     </w:p>
@@ -8160,16 +8170,16 @@
         <w:pStyle w:val="Subtitle"/>
       </w:pPr>
       <w:r>
-        <w:t>第五章 文本与网络分析</w:t>
+        <w:t>第五章 评论文本与互动网络分析</w:t>
       </w:r>
     </w:p>
     <w:p>
       <w:pPr>
         <w:pStyle w:val="Heading2"/>
       </w:pPr>
-      <w:bookmarkStart w:id="31" w:name="section_5_9"/>
+      <w:bookmarkStart w:id="31" w:name="section_5_6"/>
       <w:r>
-        <w:t>5.9　评论时序与回应角色</w:t>
+        <w:t>5.6　评论时序与回应角色</w:t>
       </w:r>
       <w:bookmarkEnd w:id="31"/>
     </w:p>
@@ -8382,16 +8392,16 @@
         <w:pStyle w:val="Subtitle"/>
       </w:pPr>
       <w:r>
-        <w:t>第五章 文本与网络分析</w:t>
+        <w:t>第五章 评论文本与互动网络分析</w:t>
       </w:r>
     </w:p>
     <w:p>
       <w:pPr>
         <w:pStyle w:val="Heading2"/>
       </w:pPr>
-      <w:bookmarkStart w:id="32" w:name="section_5_10"/>
+      <w:bookmarkStart w:id="32" w:name="section_5_7"/>
       <w:r>
-        <w:t>5.10　评论观察窗口的敏感性</w:t>
+        <w:t>5.7　评论观察窗口的敏感性</w:t>
       </w:r>
       <w:bookmarkEnd w:id="32"/>
     </w:p>
@@ -9298,7 +9308,7 @@
           </w:tcPr>
           <w:p>
             <w:r>
-              <w:t>第4章与第5.1—5.3节；特征表及模型结果</w:t>
+              <w:t>第4章；词典及帖子主题的结构化与回归结果</w:t>
             </w:r>
           </w:p>
         </w:tc>
@@ -9320,7 +9330,7 @@
           </w:tcPr>
           <w:p>
             <w:r>
-              <w:t>第5章；帖子主题、评论文本与评论网络</w:t>
+              <w:t>第4.11—4.13节帖子主题；第5章评论文本与评论网络</w:t>
             </w:r>
           </w:p>
         </w:tc>

</xml_diff>